<commit_message>
fix(backend): remove header replacement as user provided updated template
</commit_message>
<xml_diff>
--- a/webapp/templates/TOTRINH/01_Mau_Bao_cao.docx
+++ b/webapp/templates/TOTRINH/01_Mau_Bao_cao.docx
@@ -1,63 +1,7 @@
 
 <file path=word/document.xml><?xml version="1.0" encoding="utf-8"?>
-<w:document xmlns:wpc="http://schemas.microsoft.com/office/word/2010/wordprocessingCanvas" xmlns:cx="http://schemas.microsoft.com/office/drawing/2014/chartex" xmlns:cx1="http://schemas.microsoft.com/office/drawing/2015/9/8/chartex" xmlns:cx2="http://schemas.microsoft.com/office/drawing/2015/10/21/chartex" xmlns:cx3="http://schemas.microsoft.com/office/drawing/2016/5/9/chartex" xmlns:cx4="http://schemas.microsoft.com/office/drawing/2016/5/10/chartex" xmlns:cx5="http://schemas.microsoft.com/office/drawing/2016/5/11/chartex" xmlns:cx6="http://schemas.microsoft.com/office/drawing/2016/5/12/chartex" xmlns:cx7="http://schemas.microsoft.com/office/drawing/2016/5/13/chartex" xmlns:cx8="http://schemas.microsoft.com/office/drawing/2016/5/14/chartex" xmlns:mc="http://schemas.openxmlformats.org/markup-compatibility/2006" xmlns:aink="http://schemas.microsoft.com/office/drawing/2016/ink" xmlns:am3d="http://schemas.microsoft.com/office/drawing/2017/model3d" xmlns:o="urn:schemas-microsoft-com:office:office" xmlns:oel="http://schemas.microsoft.com/office/2019/extlst" xmlns:r="http://schemas.openxmlformats.org/officeDocument/2006/relationships" xmlns:m="http://schemas.openxmlformats.org/officeDocument/2006/math" xmlns:v="urn:schemas-microsoft-com:vml" xmlns:wp14="http://schemas.microsoft.com/office/word/2010/wordprocessingDrawing" xmlns:wp="http://schemas.openxmlformats.org/drawingml/2006/wordprocessingDrawing" xmlns:w10="urn:schemas-microsoft-com:office:word" xmlns:w="http://schemas.openxmlformats.org/wordprocessingml/2006/main" xmlns:w14="http://schemas.microsoft.com/office/word/2010/wordml" xmlns:w15="http://schemas.microsoft.com/office/word/2012/wordml" xmlns:w16cex="http://schemas.microsoft.com/office/word/2018/wordml/cex" xmlns:w16cid="http://schemas.microsoft.com/office/word/2016/wordml/cid" xmlns:w16="http://schemas.microsoft.com/office/word/2018/wordml" xmlns:w16du="http://schemas.microsoft.com/office/word/2023/wordml/word16du" xmlns:w16sdtdh="http://schemas.microsoft.com/office/word/2020/wordml/sdtdatahash" xmlns:w16sdtfl="http://schemas.microsoft.com/office/word/2024/wordml/sdtformatlock" xmlns:w16se="http://schemas.microsoft.com/office/word/2015/wordml/symex" xmlns:wpg="http://schemas.microsoft.com/office/word/2010/wordprocessingGroup" xmlns:wpi="http://schemas.microsoft.com/office/word/2010/wordprocessingInk" xmlns:wne="http://schemas.microsoft.com/office/word/2006/wordml" xmlns:wps="http://schemas.microsoft.com/office/word/2010/wordprocessingShape" mc:Ignorable="w14 w15 w16se w16cid w16 w16cex w16sdtdh w16sdtfl w16du wp14">
+<w:document xmlns:wpc="http://schemas.microsoft.com/office/word/2010/wordprocessingCanvas" xmlns:cx="http://schemas.microsoft.com/office/drawing/2014/chartex" xmlns:cx1="http://schemas.microsoft.com/office/drawing/2015/9/8/chartex" xmlns:cx2="http://schemas.microsoft.com/office/drawing/2015/10/21/chartex" xmlns:cx3="http://schemas.microsoft.com/office/drawing/2016/5/9/chartex" xmlns:cx4="http://schemas.microsoft.com/office/drawing/2016/5/10/chartex" xmlns:cx5="http://schemas.microsoft.com/office/drawing/2016/5/11/chartex" xmlns:cx6="http://schemas.microsoft.com/office/drawing/2016/5/12/chartex" xmlns:cx7="http://schemas.microsoft.com/office/drawing/2016/5/13/chartex" xmlns:cx8="http://schemas.microsoft.com/office/drawing/2016/5/14/chartex" xmlns:mc="http://schemas.openxmlformats.org/markup-compatibility/2006" xmlns:aink="http://schemas.microsoft.com/office/drawing/2016/ink" xmlns:am3d="http://schemas.microsoft.com/office/drawing/2017/model3d" xmlns:o="urn:schemas-microsoft-com:office:office" xmlns:oel="http://schemas.microsoft.com/office/2019/extlst" xmlns:r="http://schemas.openxmlformats.org/officeDocument/2006/relationships" xmlns:m="http://schemas.openxmlformats.org/officeDocument/2006/math" xmlns:v="urn:schemas-microsoft-com:vml" xmlns:wp14="http://schemas.microsoft.com/office/word/2010/wordprocessingDrawing" xmlns:wp="http://schemas.openxmlformats.org/drawingml/2006/wordprocessingDrawing" xmlns:w10="urn:schemas-microsoft-com:office:word" xmlns:w="http://schemas.openxmlformats.org/wordprocessingml/2006/main" xmlns:w14="http://schemas.microsoft.com/office/word/2010/wordml" xmlns:w15="http://schemas.microsoft.com/office/word/2012/wordml" xmlns:w16cei="http://schemas.microsoft.com/office/word/2026/wordml/cei" xmlns:w16cex="http://schemas.microsoft.com/office/word/2018/wordml/cex" xmlns:w16cid="http://schemas.microsoft.com/office/word/2016/wordml/cid" xmlns:w16="http://schemas.microsoft.com/office/word/2018/wordml" xmlns:w16du="http://schemas.microsoft.com/office/word/2023/wordml/word16du" xmlns:w16sdtdh="http://schemas.microsoft.com/office/word/2020/wordml/sdtdatahash" xmlns:w16sdtfl="http://schemas.microsoft.com/office/word/2024/wordml/sdtformatlock" xmlns:w16se="http://schemas.microsoft.com/office/word/2015/wordml/symex" xmlns:wpg="http://schemas.microsoft.com/office/word/2010/wordprocessingGroup" xmlns:wpi="http://schemas.microsoft.com/office/word/2010/wordprocessingInk" xmlns:wne="http://schemas.microsoft.com/office/word/2006/wordml" xmlns:wps="http://schemas.microsoft.com/office/word/2010/wordprocessingShape" mc:Ignorable="w14 w15 w16se w16cid w16 w16cex w16sdtdh w16sdtfl w16du wp14">
   <w:body>
-    <w:tbl>
-      <w:tblPr>
-        <w:tblW w:w="9435" w:type="dxa"/>
-        <w:tblInd w:w="-113" w:type="dxa"/>
-        <w:tblBorders>
-          <w:bottom w:val="single" w:sz="8" w:space="0" w:color="auto"/>
-        </w:tblBorders>
-        <w:tblLayout w:type="fixed"/>
-        <w:tblLook w:val="0000" w:firstRow="0" w:lastRow="0" w:firstColumn="0" w:lastColumn="0" w:noHBand="0" w:noVBand="0"/>
-      </w:tblPr>
-      <w:tblGrid>
-        <w:gridCol w:w="9435"/>
-      </w:tblGrid>
-      <w:tr>
-        <w:trPr>
-          <w:cantSplit/>
-        </w:trPr>
-        <w:tc>
-          <w:tcPr>
-            <w:tcW w:w="9435" w:type="dxa"/>
-          </w:tcPr>
-          <w:p>
-            <w:pPr>
-              <w:pStyle w:val="BodyTextIndent"/>
-              <w:spacing w:after="0"/>
-              <w:ind w:firstLine="0"/>
-              <w:rPr>
-                <w:rFonts w:ascii="Times New Roman" w:hAnsi="Times New Roman"/>
-                <w:b/>
-              </w:rPr>
-            </w:pPr>
-            <w:r>
-              <w:rPr>
-                <w:rFonts w:ascii="Times New Roman" w:hAnsi="Times New Roman"/>
-                <w:b/>
-              </w:rPr>
-              <w:t xml:space="preserve">Mẫu </w:t>
-            </w:r>
-            <w:r>
-              <w:rPr>
-                <w:rFonts w:ascii="Times New Roman" w:hAnsi="Times New Roman"/>
-                <w:b/>
-              </w:rPr>
-              <w:t xml:space="preserve">1. </w:t>
-            </w:r>
-            <w:r>
-              <w:rPr>
-                <w:rFonts w:ascii="Times New Roman" w:hAnsi="Times New Roman"/>
-                <w:b/>
-              </w:rPr>
-              <w:t>Báo cáo</w:t>
-            </w:r>
-          </w:p>
-        </w:tc>
-      </w:tr>
-    </w:tbl>
     <w:p>
       <w:pPr>
         <w:pStyle w:val="BodyTextIndent"/>
@@ -91,39 +35,38 @@
         <w:tc>
           <w:tcPr>
             <w:tcW w:w="3742" w:type="dxa"/>
+            <w:vAlign w:val="center"/>
           </w:tcPr>
           <w:p>
             <w:pPr>
               <w:jc w:val="center"/>
               <w:rPr>
                 <w:rFonts w:ascii="Times New Roman" w:hAnsi="Times New Roman"/>
-                <w:sz w:val="26"/>
-                <w:szCs w:val="26"/>
+                <w:szCs w:val="28"/>
+                <w:lang w:val="vi-VN"/>
               </w:rPr>
             </w:pPr>
             <w:r>
               <w:rPr>
                 <w:rFonts w:ascii="Times New Roman" w:hAnsi="Times New Roman"/>
-                <w:sz w:val="26"/>
-                <w:szCs w:val="26"/>
-              </w:rPr>
-              <w:t xml:space="preserve">TẬP </w:t>
-            </w:r>
-            <w:r>
-              <w:rPr>
-                <w:rFonts w:ascii="Times New Roman" w:hAnsi="Times New Roman" w:hint="eastAsia"/>
-                <w:sz w:val="26"/>
-                <w:szCs w:val="26"/>
-              </w:rPr>
-              <w:t>Đ</w:t>
-            </w:r>
-            <w:r>
-              <w:rPr>
-                <w:rFonts w:ascii="Times New Roman" w:hAnsi="Times New Roman"/>
-                <w:sz w:val="26"/>
-                <w:szCs w:val="26"/>
-              </w:rPr>
-              <w:t xml:space="preserve">OÀN </w:t>
+                <w:szCs w:val="28"/>
+              </w:rPr>
+              <w:t xml:space="preserve">VIỄN THÔNG </w:t>
+            </w:r>
+            <w:r>
+              <w:rPr>
+                <w:rFonts w:ascii="Times New Roman" w:hAnsi="Times New Roman"/>
+                <w:szCs w:val="28"/>
+              </w:rPr>
+              <w:t>TÂY NIN</w:t>
+            </w:r>
+            <w:r>
+              <w:rPr>
+                <w:rFonts w:ascii="Times New Roman" w:hAnsi="Times New Roman"/>
+                <w:szCs w:val="28"/>
+                <w:lang w:val="vi-VN"/>
+              </w:rPr>
+              <w:t>H</w:t>
             </w:r>
           </w:p>
           <w:p>
@@ -131,99 +74,21 @@
               <w:jc w:val="center"/>
               <w:rPr>
                 <w:rFonts w:ascii="Times New Roman" w:hAnsi="Times New Roman"/>
-                <w:sz w:val="26"/>
-                <w:szCs w:val="26"/>
+                <w:b/>
+                <w:bCs/>
+                <w:szCs w:val="28"/>
+                <w:lang w:val="vi-VN"/>
               </w:rPr>
             </w:pPr>
             <w:r>
               <w:rPr>
                 <w:rFonts w:ascii="Times New Roman" w:hAnsi="Times New Roman"/>
-                <w:sz w:val="26"/>
-                <w:szCs w:val="26"/>
-              </w:rPr>
-              <w:t>B</w:t>
-            </w:r>
-            <w:r>
-              <w:rPr>
-                <w:rFonts w:ascii="Times New Roman" w:hAnsi="Times New Roman" w:hint="eastAsia"/>
-                <w:sz w:val="26"/>
-                <w:szCs w:val="26"/>
-              </w:rPr>
-              <w:t>Ư</w:t>
-            </w:r>
-            <w:r>
-              <w:rPr>
-                <w:rFonts w:ascii="Times New Roman" w:hAnsi="Times New Roman"/>
-                <w:sz w:val="26"/>
-                <w:szCs w:val="26"/>
-              </w:rPr>
-              <w:t xml:space="preserve">U CHÍNH VIỄN THÔNG </w:t>
-            </w:r>
-            <w:r>
-              <w:rPr>
-                <w:rFonts w:ascii="Times New Roman" w:hAnsi="Times New Roman"/>
-                <w:sz w:val="26"/>
-                <w:szCs w:val="26"/>
-              </w:rPr>
-              <w:t xml:space="preserve">    </w:t>
-            </w:r>
-            <w:r>
-              <w:rPr>
-                <w:rFonts w:ascii="Times New Roman" w:hAnsi="Times New Roman"/>
-                <w:sz w:val="26"/>
-                <w:szCs w:val="26"/>
-              </w:rPr>
-              <w:t xml:space="preserve">VIỆT </w:t>
-            </w:r>
-            <w:smartTag w:uri="urn:schemas-microsoft-com:office:smarttags" w:element="place">
-              <w:smartTag w:uri="urn:schemas-microsoft-com:office:smarttags" w:element="country-region">
-                <w:r>
-                  <w:rPr>
-                    <w:rFonts w:ascii="Times New Roman" w:hAnsi="Times New Roman"/>
-                    <w:sz w:val="26"/>
-                    <w:szCs w:val="26"/>
-                  </w:rPr>
-                  <w:t>NAM</w:t>
-                </w:r>
-              </w:smartTag>
-            </w:smartTag>
-          </w:p>
-          <w:p>
-            <w:pPr>
-              <w:jc w:val="center"/>
-              <w:rPr>
-                <w:rFonts w:ascii="Times New Roman" w:hAnsi="Times New Roman"/>
-                <w:b/>
-                <w:sz w:val="24"/>
-                <w:szCs w:val="24"/>
-              </w:rPr>
-            </w:pPr>
-            <w:r>
-              <w:rPr>
-                <w:rFonts w:ascii="Times New Roman" w:hAnsi="Times New Roman"/>
                 <w:b/>
                 <w:bCs/>
                 <w:szCs w:val="28"/>
-              </w:rPr>
-              <w:t xml:space="preserve">VIỄN THÔNG </w:t>
-            </w:r>
-            <w:r>
-              <w:rPr>
-                <w:rFonts w:ascii="Times New Roman" w:hAnsi="Times New Roman"/>
-                <w:b/>
-                <w:bCs/>
-                <w:szCs w:val="28"/>
-              </w:rPr>
-              <w:t>TÂY NINH</w:t>
-            </w:r>
-            <w:r>
-              <w:rPr>
-                <w:rFonts w:ascii="Times New Roman" w:hAnsi="Times New Roman"/>
-                <w:b/>
-                <w:bCs/>
-                <w:szCs w:val="28"/>
-              </w:rPr>
-              <w:t xml:space="preserve"> </w:t>
+                <w:lang w:val="vi-VN"/>
+              </w:rPr>
+              <w:t>TRUNG TÂM HẠ TẦNG</w:t>
             </w:r>
           </w:p>
           <w:p>
@@ -336,20 +201,8 @@
                 <w:b/>
                 <w:sz w:val="26"/>
               </w:rPr>
-              <w:t xml:space="preserve">CỘNG HOÀ XÃ HỘI CHỦ NGHĨA VIỆT </w:t>
-            </w:r>
-            <w:smartTag w:uri="urn:schemas-microsoft-com:office:smarttags" w:element="place">
-              <w:smartTag w:uri="urn:schemas-microsoft-com:office:smarttags" w:element="country-region">
-                <w:r>
-                  <w:rPr>
-                    <w:rFonts w:ascii="Times New Roman" w:hAnsi="Times New Roman"/>
-                    <w:b/>
-                    <w:sz w:val="26"/>
-                  </w:rPr>
-                  <w:t>NAM</w:t>
-                </w:r>
-              </w:smartTag>
-            </w:smartTag>
+              <w:t>CỘNG HOÀ XÃ HỘI CHỦ NGHĨA VIỆT NAM</w:t>
+            </w:r>
           </w:p>
           <w:p>
             <w:pPr>
@@ -360,6 +213,7 @@
                 <w:szCs w:val="28"/>
               </w:rPr>
             </w:pPr>
+            <w:proofErr w:type="spellStart"/>
             <w:r>
               <w:rPr>
                 <w:rFonts w:ascii="Times New Roman" w:hAnsi="Times New Roman" w:hint="eastAsia"/>
@@ -374,8 +228,81 @@
                 <w:b/>
                 <w:szCs w:val="28"/>
               </w:rPr>
-              <w:t>ộc lập - Tự do - Hạnh phúc</w:t>
-            </w:r>
+              <w:t>ộc</w:t>
+            </w:r>
+            <w:proofErr w:type="spellEnd"/>
+            <w:r>
+              <w:rPr>
+                <w:rFonts w:ascii="Times New Roman" w:hAnsi="Times New Roman"/>
+                <w:b/>
+                <w:szCs w:val="28"/>
+              </w:rPr>
+              <w:t xml:space="preserve"> </w:t>
+            </w:r>
+            <w:proofErr w:type="spellStart"/>
+            <w:r>
+              <w:rPr>
+                <w:rFonts w:ascii="Times New Roman" w:hAnsi="Times New Roman"/>
+                <w:b/>
+                <w:szCs w:val="28"/>
+              </w:rPr>
+              <w:t>lập</w:t>
+            </w:r>
+            <w:proofErr w:type="spellEnd"/>
+            <w:r>
+              <w:rPr>
+                <w:rFonts w:ascii="Times New Roman" w:hAnsi="Times New Roman"/>
+                <w:b/>
+                <w:szCs w:val="28"/>
+              </w:rPr>
+              <w:t xml:space="preserve"> - </w:t>
+            </w:r>
+            <w:proofErr w:type="spellStart"/>
+            <w:r>
+              <w:rPr>
+                <w:rFonts w:ascii="Times New Roman" w:hAnsi="Times New Roman"/>
+                <w:b/>
+                <w:szCs w:val="28"/>
+              </w:rPr>
+              <w:t>Tự</w:t>
+            </w:r>
+            <w:proofErr w:type="spellEnd"/>
+            <w:r>
+              <w:rPr>
+                <w:rFonts w:ascii="Times New Roman" w:hAnsi="Times New Roman"/>
+                <w:b/>
+                <w:szCs w:val="28"/>
+              </w:rPr>
+              <w:t xml:space="preserve"> do - </w:t>
+            </w:r>
+            <w:proofErr w:type="spellStart"/>
+            <w:r>
+              <w:rPr>
+                <w:rFonts w:ascii="Times New Roman" w:hAnsi="Times New Roman"/>
+                <w:b/>
+                <w:szCs w:val="28"/>
+              </w:rPr>
+              <w:t>Hạnh</w:t>
+            </w:r>
+            <w:proofErr w:type="spellEnd"/>
+            <w:r>
+              <w:rPr>
+                <w:rFonts w:ascii="Times New Roman" w:hAnsi="Times New Roman"/>
+                <w:b/>
+                <w:szCs w:val="28"/>
+              </w:rPr>
+              <w:t xml:space="preserve"> </w:t>
+            </w:r>
+            <w:proofErr w:type="spellStart"/>
+            <w:r>
+              <w:rPr>
+                <w:rFonts w:ascii="Times New Roman" w:hAnsi="Times New Roman"/>
+                <w:b/>
+                <w:szCs w:val="28"/>
+              </w:rPr>
+              <w:t>phúc</w:t>
+            </w:r>
+            <w:proofErr w:type="spellEnd"/>
           </w:p>
           <w:p>
             <w:pPr>
@@ -491,12 +418,21 @@
               </w:rPr>
               <w:t xml:space="preserve">    </w:t>
             </w:r>
+            <w:proofErr w:type="spellStart"/>
             <w:r>
               <w:rPr>
                 <w:rFonts w:ascii="Times New Roman" w:hAnsi="Times New Roman"/>
                 <w:szCs w:val="28"/>
               </w:rPr>
-              <w:t xml:space="preserve">Số:           </w:t>
+              <w:t>Số</w:t>
+            </w:r>
+            <w:proofErr w:type="spellEnd"/>
+            <w:r>
+              <w:rPr>
+                <w:rFonts w:ascii="Times New Roman" w:hAnsi="Times New Roman"/>
+                <w:szCs w:val="28"/>
+              </w:rPr>
+              <w:t xml:space="preserve">:           </w:t>
             </w:r>
           </w:p>
         </w:tc>
@@ -539,14 +475,50 @@
                 <w:i/>
                 <w:szCs w:val="28"/>
               </w:rPr>
-              <w:t xml:space="preserve"> ngày        tháng   </w:t>
-            </w:r>
+              <w:t xml:space="preserve"> </w:t>
+            </w:r>
+            <w:proofErr w:type="spellStart"/>
             <w:r>
               <w:rPr>
                 <w:rFonts w:ascii="Times New Roman" w:hAnsi="Times New Roman"/>
                 <w:i/>
                 <w:szCs w:val="28"/>
               </w:rPr>
+              <w:t>ngày</w:t>
+            </w:r>
+            <w:proofErr w:type="spellEnd"/>
+            <w:r>
+              <w:rPr>
+                <w:rFonts w:ascii="Times New Roman" w:hAnsi="Times New Roman"/>
+                <w:i/>
+                <w:szCs w:val="28"/>
+              </w:rPr>
+              <w:t xml:space="preserve">        </w:t>
+            </w:r>
+            <w:proofErr w:type="spellStart"/>
+            <w:r>
+              <w:rPr>
+                <w:rFonts w:ascii="Times New Roman" w:hAnsi="Times New Roman"/>
+                <w:i/>
+                <w:szCs w:val="28"/>
+              </w:rPr>
+              <w:t>tháng</w:t>
+            </w:r>
+            <w:proofErr w:type="spellEnd"/>
+            <w:r>
+              <w:rPr>
+                <w:rFonts w:ascii="Times New Roman" w:hAnsi="Times New Roman"/>
+                <w:i/>
+                <w:szCs w:val="28"/>
+              </w:rPr>
+              <w:t xml:space="preserve">   </w:t>
+            </w:r>
+            <w:r>
+              <w:rPr>
+                <w:rFonts w:ascii="Times New Roman" w:hAnsi="Times New Roman"/>
+                <w:i/>
+                <w:szCs w:val="28"/>
+              </w:rPr>
               <w:t xml:space="preserve">  </w:t>
             </w:r>
             <w:r>
@@ -555,7 +527,16 @@
                 <w:i/>
                 <w:szCs w:val="28"/>
               </w:rPr>
-              <w:t xml:space="preserve">   n</w:t>
+              <w:t xml:space="preserve">   </w:t>
+            </w:r>
+            <w:proofErr w:type="spellStart"/>
+            <w:r>
+              <w:rPr>
+                <w:rFonts w:ascii="Times New Roman" w:hAnsi="Times New Roman"/>
+                <w:i/>
+                <w:szCs w:val="28"/>
+              </w:rPr>
+              <w:t>n</w:t>
             </w:r>
             <w:r>
               <w:rPr>
@@ -571,7 +552,16 @@
                 <w:i/>
                 <w:szCs w:val="28"/>
               </w:rPr>
-              <w:t xml:space="preserve">m  </w:t>
+              <w:t>m</w:t>
+            </w:r>
+            <w:proofErr w:type="spellEnd"/>
+            <w:r>
+              <w:rPr>
+                <w:rFonts w:ascii="Times New Roman" w:hAnsi="Times New Roman"/>
+                <w:i/>
+                <w:szCs w:val="28"/>
+              </w:rPr>
+              <w:t xml:space="preserve">  </w:t>
             </w:r>
           </w:p>
         </w:tc>
@@ -626,6 +616,7 @@
           <w:rFonts w:ascii="Times New Roman" w:hAnsi="Times New Roman"/>
         </w:rPr>
       </w:pPr>
+      <w:proofErr w:type="spellStart"/>
       <w:r>
         <w:rPr>
           <w:rFonts w:ascii="Times New Roman" w:hAnsi="Times New Roman"/>
@@ -636,8 +627,23 @@
         <w:rPr>
           <w:rFonts w:ascii="Times New Roman" w:hAnsi="Times New Roman"/>
         </w:rPr>
-        <w:t>ề việc</w:t>
+        <w:t>ề</w:t>
       </w:r>
+      <w:proofErr w:type="spellEnd"/>
+      <w:r>
+        <w:rPr>
+          <w:rFonts w:ascii="Times New Roman" w:hAnsi="Times New Roman"/>
+        </w:rPr>
+        <w:t xml:space="preserve"> </w:t>
+      </w:r>
+      <w:proofErr w:type="spellStart"/>
+      <w:r>
+        <w:rPr>
+          <w:rFonts w:ascii="Times New Roman" w:hAnsi="Times New Roman"/>
+        </w:rPr>
+        <w:t>việc</w:t>
+      </w:r>
+      <w:proofErr w:type="spellEnd"/>
       <w:r>
         <w:rPr>
           <w:rFonts w:ascii="Times New Roman" w:hAnsi="Times New Roman"/>
@@ -918,6 +924,7 @@
                 <w:sz w:val="24"/>
               </w:rPr>
             </w:pPr>
+            <w:proofErr w:type="spellStart"/>
             <w:r>
               <w:rPr>
                 <w:rFonts w:ascii="Times New Roman" w:hAnsi="Times New Roman"/>
@@ -943,7 +950,17 @@
                 <w:i/>
                 <w:sz w:val="24"/>
               </w:rPr>
-              <w:t>i nhận:</w:t>
+              <w:t>i</w:t>
+            </w:r>
+            <w:proofErr w:type="spellEnd"/>
+            <w:r>
+              <w:rPr>
+                <w:rFonts w:ascii="Times New Roman" w:hAnsi="Times New Roman"/>
+                <w:b/>
+                <w:i/>
+                <w:sz w:val="24"/>
+              </w:rPr>
+              <w:t xml:space="preserve"> nhận:</w:t>
             </w:r>
           </w:p>
           <w:p>
@@ -1092,6 +1109,7 @@
                 <w:sz w:val="22"/>
               </w:rPr>
             </w:pPr>
+            <w:proofErr w:type="spellStart"/>
             <w:r>
               <w:rPr>
                 <w:rFonts w:ascii="Times New Roman" w:hAnsi="Times New Roman"/>
@@ -1099,7 +1117,37 @@
                 <w:bCs/>
                 <w:sz w:val="24"/>
               </w:rPr>
-              <w:t>Số eOffice: ..(</w:t>
+              <w:t>Số</w:t>
+            </w:r>
+            <w:proofErr w:type="spellEnd"/>
+            <w:r>
+              <w:rPr>
+                <w:rFonts w:ascii="Times New Roman" w:hAnsi="Times New Roman"/>
+                <w:b/>
+                <w:bCs/>
+                <w:sz w:val="24"/>
+              </w:rPr>
+              <w:t xml:space="preserve"> </w:t>
+            </w:r>
+            <w:proofErr w:type="spellStart"/>
+            <w:r>
+              <w:rPr>
+                <w:rFonts w:ascii="Times New Roman" w:hAnsi="Times New Roman"/>
+                <w:b/>
+                <w:bCs/>
+                <w:sz w:val="24"/>
+              </w:rPr>
+              <w:t>eOffice</w:t>
+            </w:r>
+            <w:proofErr w:type="spellEnd"/>
+            <w:r>
+              <w:rPr>
+                <w:rFonts w:ascii="Times New Roman" w:hAnsi="Times New Roman"/>
+                <w:b/>
+                <w:bCs/>
+                <w:sz w:val="24"/>
+              </w:rPr>
+              <w:t>: ..(</w:t>
             </w:r>
             <w:r>
               <w:rPr>
@@ -1164,6 +1212,7 @@
               <w:rPr>
                 <w:rFonts w:ascii="Times New Roman" w:hAnsi="Times New Roman"/>
                 <w:bCs/>
+                <w:lang w:val="vi-VN"/>
               </w:rPr>
             </w:pPr>
             <w:r>
@@ -1183,36 +1232,6 @@
                 <w:spacing w:val="-6"/>
               </w:rPr>
               <w:t xml:space="preserve"> </w:t>
-            </w:r>
-            <w:r>
-              <w:rPr>
-                <w:rFonts w:ascii="Times New Roman" w:hAnsi="Times New Roman"/>
-                <w:bCs/>
-                <w:spacing w:val="-6"/>
-                <w:sz w:val="24"/>
-                <w:szCs w:val="24"/>
-              </w:rPr>
-              <w:t>(</w:t>
-            </w:r>
-            <w:r>
-              <w:rPr>
-                <w:rFonts w:ascii="Times New Roman" w:hAnsi="Times New Roman"/>
-                <w:bCs/>
-                <w:spacing w:val="-6"/>
-                <w:sz w:val="24"/>
-                <w:szCs w:val="24"/>
-              </w:rPr>
-              <w:t>5</w:t>
-            </w:r>
-            <w:r>
-              <w:rPr>
-                <w:rFonts w:ascii="Times New Roman" w:hAnsi="Times New Roman"/>
-                <w:bCs/>
-                <w:spacing w:val="-6"/>
-                <w:sz w:val="24"/>
-                <w:szCs w:val="24"/>
-              </w:rPr>
-              <w:t>)</w:t>
             </w:r>
           </w:p>
           <w:p>
@@ -1251,14 +1270,25 @@
               </w:rPr>
               <w:t>(</w:t>
             </w:r>
-            <w:r>
-              <w:rPr>
-                <w:rFonts w:ascii="Times New Roman" w:hAnsi="Times New Roman"/>
-                <w:bCs/>
-                <w:i/>
-              </w:rPr>
-              <w:t xml:space="preserve">chữ </w:t>
-            </w:r>
+            <w:proofErr w:type="spellStart"/>
+            <w:r>
+              <w:rPr>
+                <w:rFonts w:ascii="Times New Roman" w:hAnsi="Times New Roman"/>
+                <w:bCs/>
+                <w:i/>
+              </w:rPr>
+              <w:t>chữ</w:t>
+            </w:r>
+            <w:proofErr w:type="spellEnd"/>
+            <w:r>
+              <w:rPr>
+                <w:rFonts w:ascii="Times New Roman" w:hAnsi="Times New Roman"/>
+                <w:bCs/>
+                <w:i/>
+              </w:rPr>
+              <w:t xml:space="preserve"> </w:t>
+            </w:r>
+            <w:proofErr w:type="spellStart"/>
             <w:r>
               <w:rPr>
                 <w:rFonts w:ascii="Times New Roman" w:hAnsi="Times New Roman"/>
@@ -1267,6 +1297,7 @@
               </w:rPr>
               <w:t>ký</w:t>
             </w:r>
+            <w:proofErr w:type="spellEnd"/>
             <w:r>
               <w:rPr>
                 <w:rFonts w:ascii="Times New Roman" w:hAnsi="Times New Roman"/>
@@ -1275,6 +1306,7 @@
               </w:rPr>
               <w:t xml:space="preserve">, </w:t>
             </w:r>
+            <w:proofErr w:type="spellStart"/>
             <w:r>
               <w:rPr>
                 <w:rFonts w:ascii="Times New Roman" w:hAnsi="Times New Roman"/>
@@ -1283,6 +1315,7 @@
               </w:rPr>
               <w:t>dấu</w:t>
             </w:r>
+            <w:proofErr w:type="spellEnd"/>
             <w:r>
               <w:rPr>
                 <w:rFonts w:ascii="Times New Roman" w:hAnsi="Times New Roman"/>
@@ -1331,12 +1364,42 @@
                 <w:rFonts w:ascii="Times New Roman" w:hAnsi="Times New Roman"/>
               </w:rPr>
             </w:pPr>
-            <w:r>
-              <w:rPr>
-                <w:rFonts w:ascii="Times New Roman" w:hAnsi="Times New Roman"/>
-              </w:rPr>
-              <w:t>Họ và tên</w:t>
-            </w:r>
+            <w:proofErr w:type="spellStart"/>
+            <w:r>
+              <w:rPr>
+                <w:rFonts w:ascii="Times New Roman" w:hAnsi="Times New Roman"/>
+              </w:rPr>
+              <w:t>Họ</w:t>
+            </w:r>
+            <w:proofErr w:type="spellEnd"/>
+            <w:r>
+              <w:rPr>
+                <w:rFonts w:ascii="Times New Roman" w:hAnsi="Times New Roman"/>
+              </w:rPr>
+              <w:t xml:space="preserve"> </w:t>
+            </w:r>
+            <w:proofErr w:type="spellStart"/>
+            <w:r>
+              <w:rPr>
+                <w:rFonts w:ascii="Times New Roman" w:hAnsi="Times New Roman"/>
+              </w:rPr>
+              <w:t>và</w:t>
+            </w:r>
+            <w:proofErr w:type="spellEnd"/>
+            <w:r>
+              <w:rPr>
+                <w:rFonts w:ascii="Times New Roman" w:hAnsi="Times New Roman"/>
+              </w:rPr>
+              <w:t xml:space="preserve"> </w:t>
+            </w:r>
+            <w:proofErr w:type="spellStart"/>
+            <w:r>
+              <w:rPr>
+                <w:rFonts w:ascii="Times New Roman" w:hAnsi="Times New Roman"/>
+              </w:rPr>
+              <w:t>tên</w:t>
+            </w:r>
+            <w:proofErr w:type="spellEnd"/>
             <w:r>
               <w:rPr>
                 <w:rFonts w:ascii="Times New Roman" w:hAnsi="Times New Roman"/>
@@ -1384,14 +1447,45 @@
                 <w:szCs w:val="22"/>
               </w:rPr>
             </w:pPr>
-            <w:r>
-              <w:rPr>
-                <w:b/>
-                <w:i/>
-                <w:sz w:val="22"/>
-                <w:szCs w:val="22"/>
-              </w:rPr>
-              <w:t>Ghi chú:</w:t>
+            <w:proofErr w:type="spellStart"/>
+            <w:r>
+              <w:rPr>
+                <w:b/>
+                <w:i/>
+                <w:sz w:val="22"/>
+                <w:szCs w:val="22"/>
+              </w:rPr>
+              <w:t>Ghi</w:t>
+            </w:r>
+            <w:proofErr w:type="spellEnd"/>
+            <w:r>
+              <w:rPr>
+                <w:b/>
+                <w:i/>
+                <w:sz w:val="22"/>
+                <w:szCs w:val="22"/>
+              </w:rPr>
+              <w:t xml:space="preserve"> </w:t>
+            </w:r>
+            <w:proofErr w:type="spellStart"/>
+            <w:r>
+              <w:rPr>
+                <w:b/>
+                <w:i/>
+                <w:sz w:val="22"/>
+                <w:szCs w:val="22"/>
+              </w:rPr>
+              <w:t>chú</w:t>
+            </w:r>
+            <w:proofErr w:type="spellEnd"/>
+            <w:r>
+              <w:rPr>
+                <w:b/>
+                <w:i/>
+                <w:sz w:val="22"/>
+                <w:szCs w:val="22"/>
+              </w:rPr>
+              <w:t>:</w:t>
             </w:r>
             <w:r>
               <w:rPr>
@@ -1412,8 +1506,9 @@
                 <w:szCs w:val="22"/>
                 <w:lang w:eastAsia="zh-CN"/>
               </w:rPr>
-              <w:t xml:space="preserve"> Các phần ghi: số: ký hiệu, ngày, tháng, năm của văn bản (để trống</w:t>
-            </w:r>
+              <w:t xml:space="preserve"> Các </w:t>
+            </w:r>
+            <w:proofErr w:type="spellStart"/>
             <w:r>
               <w:rPr>
                 <w:b/>
@@ -1424,8 +1519,477 @@
                 <w:szCs w:val="22"/>
                 <w:lang w:eastAsia="zh-CN"/>
               </w:rPr>
-              <w:t xml:space="preserve"> để hệ thống tự cập nhật</w:t>
-            </w:r>
+              <w:t>phần</w:t>
+            </w:r>
+            <w:proofErr w:type="spellEnd"/>
+            <w:r>
+              <w:rPr>
+                <w:b/>
+                <w:bCs/>
+                <w:i/>
+                <w:iCs/>
+                <w:sz w:val="22"/>
+                <w:szCs w:val="22"/>
+                <w:lang w:eastAsia="zh-CN"/>
+              </w:rPr>
+              <w:t xml:space="preserve"> </w:t>
+            </w:r>
+            <w:proofErr w:type="spellStart"/>
+            <w:r>
+              <w:rPr>
+                <w:b/>
+                <w:bCs/>
+                <w:i/>
+                <w:iCs/>
+                <w:sz w:val="22"/>
+                <w:szCs w:val="22"/>
+                <w:lang w:eastAsia="zh-CN"/>
+              </w:rPr>
+              <w:t>ghi</w:t>
+            </w:r>
+            <w:proofErr w:type="spellEnd"/>
+            <w:r>
+              <w:rPr>
+                <w:b/>
+                <w:bCs/>
+                <w:i/>
+                <w:iCs/>
+                <w:sz w:val="22"/>
+                <w:szCs w:val="22"/>
+                <w:lang w:eastAsia="zh-CN"/>
+              </w:rPr>
+              <w:t xml:space="preserve">: </w:t>
+            </w:r>
+            <w:proofErr w:type="spellStart"/>
+            <w:r>
+              <w:rPr>
+                <w:b/>
+                <w:bCs/>
+                <w:i/>
+                <w:iCs/>
+                <w:sz w:val="22"/>
+                <w:szCs w:val="22"/>
+                <w:lang w:eastAsia="zh-CN"/>
+              </w:rPr>
+              <w:t>số</w:t>
+            </w:r>
+            <w:proofErr w:type="spellEnd"/>
+            <w:r>
+              <w:rPr>
+                <w:b/>
+                <w:bCs/>
+                <w:i/>
+                <w:iCs/>
+                <w:sz w:val="22"/>
+                <w:szCs w:val="22"/>
+                <w:lang w:eastAsia="zh-CN"/>
+              </w:rPr>
+              <w:t xml:space="preserve">: </w:t>
+            </w:r>
+            <w:proofErr w:type="spellStart"/>
+            <w:r>
+              <w:rPr>
+                <w:b/>
+                <w:bCs/>
+                <w:i/>
+                <w:iCs/>
+                <w:sz w:val="22"/>
+                <w:szCs w:val="22"/>
+                <w:lang w:eastAsia="zh-CN"/>
+              </w:rPr>
+              <w:t>ký</w:t>
+            </w:r>
+            <w:proofErr w:type="spellEnd"/>
+            <w:r>
+              <w:rPr>
+                <w:b/>
+                <w:bCs/>
+                <w:i/>
+                <w:iCs/>
+                <w:sz w:val="22"/>
+                <w:szCs w:val="22"/>
+                <w:lang w:eastAsia="zh-CN"/>
+              </w:rPr>
+              <w:t xml:space="preserve"> </w:t>
+            </w:r>
+            <w:proofErr w:type="spellStart"/>
+            <w:r>
+              <w:rPr>
+                <w:b/>
+                <w:bCs/>
+                <w:i/>
+                <w:iCs/>
+                <w:sz w:val="22"/>
+                <w:szCs w:val="22"/>
+                <w:lang w:eastAsia="zh-CN"/>
+              </w:rPr>
+              <w:t>hiệu</w:t>
+            </w:r>
+            <w:proofErr w:type="spellEnd"/>
+            <w:r>
+              <w:rPr>
+                <w:b/>
+                <w:bCs/>
+                <w:i/>
+                <w:iCs/>
+                <w:sz w:val="22"/>
+                <w:szCs w:val="22"/>
+                <w:lang w:eastAsia="zh-CN"/>
+              </w:rPr>
+              <w:t xml:space="preserve">, </w:t>
+            </w:r>
+            <w:proofErr w:type="spellStart"/>
+            <w:r>
+              <w:rPr>
+                <w:b/>
+                <w:bCs/>
+                <w:i/>
+                <w:iCs/>
+                <w:sz w:val="22"/>
+                <w:szCs w:val="22"/>
+                <w:lang w:eastAsia="zh-CN"/>
+              </w:rPr>
+              <w:t>ngày</w:t>
+            </w:r>
+            <w:proofErr w:type="spellEnd"/>
+            <w:r>
+              <w:rPr>
+                <w:b/>
+                <w:bCs/>
+                <w:i/>
+                <w:iCs/>
+                <w:sz w:val="22"/>
+                <w:szCs w:val="22"/>
+                <w:lang w:eastAsia="zh-CN"/>
+              </w:rPr>
+              <w:t xml:space="preserve">, </w:t>
+            </w:r>
+            <w:proofErr w:type="spellStart"/>
+            <w:r>
+              <w:rPr>
+                <w:b/>
+                <w:bCs/>
+                <w:i/>
+                <w:iCs/>
+                <w:sz w:val="22"/>
+                <w:szCs w:val="22"/>
+                <w:lang w:eastAsia="zh-CN"/>
+              </w:rPr>
+              <w:t>tháng</w:t>
+            </w:r>
+            <w:proofErr w:type="spellEnd"/>
+            <w:r>
+              <w:rPr>
+                <w:b/>
+                <w:bCs/>
+                <w:i/>
+                <w:iCs/>
+                <w:sz w:val="22"/>
+                <w:szCs w:val="22"/>
+                <w:lang w:eastAsia="zh-CN"/>
+              </w:rPr>
+              <w:t xml:space="preserve">, </w:t>
+            </w:r>
+            <w:proofErr w:type="spellStart"/>
+            <w:r>
+              <w:rPr>
+                <w:b/>
+                <w:bCs/>
+                <w:i/>
+                <w:iCs/>
+                <w:sz w:val="22"/>
+                <w:szCs w:val="22"/>
+                <w:lang w:eastAsia="zh-CN"/>
+              </w:rPr>
+              <w:t>năm</w:t>
+            </w:r>
+            <w:proofErr w:type="spellEnd"/>
+            <w:r>
+              <w:rPr>
+                <w:b/>
+                <w:bCs/>
+                <w:i/>
+                <w:iCs/>
+                <w:sz w:val="22"/>
+                <w:szCs w:val="22"/>
+                <w:lang w:eastAsia="zh-CN"/>
+              </w:rPr>
+              <w:t xml:space="preserve"> </w:t>
+            </w:r>
+            <w:proofErr w:type="spellStart"/>
+            <w:r>
+              <w:rPr>
+                <w:b/>
+                <w:bCs/>
+                <w:i/>
+                <w:iCs/>
+                <w:sz w:val="22"/>
+                <w:szCs w:val="22"/>
+                <w:lang w:eastAsia="zh-CN"/>
+              </w:rPr>
+              <w:t>của</w:t>
+            </w:r>
+            <w:proofErr w:type="spellEnd"/>
+            <w:r>
+              <w:rPr>
+                <w:b/>
+                <w:bCs/>
+                <w:i/>
+                <w:iCs/>
+                <w:sz w:val="22"/>
+                <w:szCs w:val="22"/>
+                <w:lang w:eastAsia="zh-CN"/>
+              </w:rPr>
+              <w:t xml:space="preserve"> </w:t>
+            </w:r>
+            <w:proofErr w:type="spellStart"/>
+            <w:r>
+              <w:rPr>
+                <w:b/>
+                <w:bCs/>
+                <w:i/>
+                <w:iCs/>
+                <w:sz w:val="22"/>
+                <w:szCs w:val="22"/>
+                <w:lang w:eastAsia="zh-CN"/>
+              </w:rPr>
+              <w:t>văn</w:t>
+            </w:r>
+            <w:proofErr w:type="spellEnd"/>
+            <w:r>
+              <w:rPr>
+                <w:b/>
+                <w:bCs/>
+                <w:i/>
+                <w:iCs/>
+                <w:sz w:val="22"/>
+                <w:szCs w:val="22"/>
+                <w:lang w:eastAsia="zh-CN"/>
+              </w:rPr>
+              <w:t xml:space="preserve"> </w:t>
+            </w:r>
+            <w:proofErr w:type="spellStart"/>
+            <w:r>
+              <w:rPr>
+                <w:b/>
+                <w:bCs/>
+                <w:i/>
+                <w:iCs/>
+                <w:sz w:val="22"/>
+                <w:szCs w:val="22"/>
+                <w:lang w:eastAsia="zh-CN"/>
+              </w:rPr>
+              <w:t>bản</w:t>
+            </w:r>
+            <w:proofErr w:type="spellEnd"/>
+            <w:r>
+              <w:rPr>
+                <w:b/>
+                <w:bCs/>
+                <w:i/>
+                <w:iCs/>
+                <w:sz w:val="22"/>
+                <w:szCs w:val="22"/>
+                <w:lang w:eastAsia="zh-CN"/>
+              </w:rPr>
+              <w:t xml:space="preserve"> (</w:t>
+            </w:r>
+            <w:proofErr w:type="spellStart"/>
+            <w:r>
+              <w:rPr>
+                <w:b/>
+                <w:bCs/>
+                <w:i/>
+                <w:iCs/>
+                <w:sz w:val="22"/>
+                <w:szCs w:val="22"/>
+                <w:lang w:eastAsia="zh-CN"/>
+              </w:rPr>
+              <w:t>để</w:t>
+            </w:r>
+            <w:proofErr w:type="spellEnd"/>
+            <w:r>
+              <w:rPr>
+                <w:b/>
+                <w:bCs/>
+                <w:i/>
+                <w:iCs/>
+                <w:sz w:val="22"/>
+                <w:szCs w:val="22"/>
+                <w:lang w:eastAsia="zh-CN"/>
+              </w:rPr>
+              <w:t xml:space="preserve"> </w:t>
+            </w:r>
+            <w:proofErr w:type="spellStart"/>
+            <w:r>
+              <w:rPr>
+                <w:b/>
+                <w:bCs/>
+                <w:i/>
+                <w:iCs/>
+                <w:sz w:val="22"/>
+                <w:szCs w:val="22"/>
+                <w:lang w:eastAsia="zh-CN"/>
+              </w:rPr>
+              <w:t>trống</w:t>
+            </w:r>
+            <w:proofErr w:type="spellEnd"/>
+            <w:r>
+              <w:rPr>
+                <w:b/>
+                <w:bCs/>
+                <w:i/>
+                <w:iCs/>
+                <w:sz w:val="22"/>
+                <w:szCs w:val="22"/>
+                <w:lang w:eastAsia="zh-CN"/>
+              </w:rPr>
+              <w:t xml:space="preserve"> </w:t>
+            </w:r>
+            <w:proofErr w:type="spellStart"/>
+            <w:r>
+              <w:rPr>
+                <w:b/>
+                <w:bCs/>
+                <w:i/>
+                <w:iCs/>
+                <w:sz w:val="22"/>
+                <w:szCs w:val="22"/>
+                <w:lang w:eastAsia="zh-CN"/>
+              </w:rPr>
+              <w:t>để</w:t>
+            </w:r>
+            <w:proofErr w:type="spellEnd"/>
+            <w:r>
+              <w:rPr>
+                <w:b/>
+                <w:bCs/>
+                <w:i/>
+                <w:iCs/>
+                <w:sz w:val="22"/>
+                <w:szCs w:val="22"/>
+                <w:lang w:eastAsia="zh-CN"/>
+              </w:rPr>
+              <w:t xml:space="preserve"> </w:t>
+            </w:r>
+            <w:proofErr w:type="spellStart"/>
+            <w:r>
+              <w:rPr>
+                <w:b/>
+                <w:bCs/>
+                <w:i/>
+                <w:iCs/>
+                <w:sz w:val="22"/>
+                <w:szCs w:val="22"/>
+                <w:lang w:eastAsia="zh-CN"/>
+              </w:rPr>
+              <w:t>hệ</w:t>
+            </w:r>
+            <w:proofErr w:type="spellEnd"/>
+            <w:r>
+              <w:rPr>
+                <w:b/>
+                <w:bCs/>
+                <w:i/>
+                <w:iCs/>
+                <w:sz w:val="22"/>
+                <w:szCs w:val="22"/>
+                <w:lang w:eastAsia="zh-CN"/>
+              </w:rPr>
+              <w:t xml:space="preserve"> </w:t>
+            </w:r>
+            <w:proofErr w:type="spellStart"/>
+            <w:r>
+              <w:rPr>
+                <w:b/>
+                <w:bCs/>
+                <w:i/>
+                <w:iCs/>
+                <w:sz w:val="22"/>
+                <w:szCs w:val="22"/>
+                <w:lang w:eastAsia="zh-CN"/>
+              </w:rPr>
+              <w:t>thống</w:t>
+            </w:r>
+            <w:proofErr w:type="spellEnd"/>
+            <w:r>
+              <w:rPr>
+                <w:b/>
+                <w:bCs/>
+                <w:i/>
+                <w:iCs/>
+                <w:sz w:val="22"/>
+                <w:szCs w:val="22"/>
+                <w:lang w:eastAsia="zh-CN"/>
+              </w:rPr>
+              <w:t xml:space="preserve"> </w:t>
+            </w:r>
+            <w:proofErr w:type="spellStart"/>
+            <w:r>
+              <w:rPr>
+                <w:b/>
+                <w:bCs/>
+                <w:i/>
+                <w:iCs/>
+                <w:sz w:val="22"/>
+                <w:szCs w:val="22"/>
+                <w:lang w:eastAsia="zh-CN"/>
+              </w:rPr>
+              <w:t>tự</w:t>
+            </w:r>
+            <w:proofErr w:type="spellEnd"/>
+            <w:r>
+              <w:rPr>
+                <w:b/>
+                <w:bCs/>
+                <w:i/>
+                <w:iCs/>
+                <w:sz w:val="22"/>
+                <w:szCs w:val="22"/>
+                <w:lang w:eastAsia="zh-CN"/>
+              </w:rPr>
+              <w:t xml:space="preserve"> </w:t>
+            </w:r>
+            <w:proofErr w:type="spellStart"/>
+            <w:r>
+              <w:rPr>
+                <w:b/>
+                <w:bCs/>
+                <w:i/>
+                <w:iCs/>
+                <w:sz w:val="22"/>
+                <w:szCs w:val="22"/>
+                <w:lang w:eastAsia="zh-CN"/>
+              </w:rPr>
+              <w:t>cập</w:t>
+            </w:r>
+            <w:proofErr w:type="spellEnd"/>
+            <w:r>
+              <w:rPr>
+                <w:b/>
+                <w:bCs/>
+                <w:i/>
+                <w:iCs/>
+                <w:sz w:val="22"/>
+                <w:szCs w:val="22"/>
+                <w:lang w:eastAsia="zh-CN"/>
+              </w:rPr>
+              <w:t xml:space="preserve"> </w:t>
+            </w:r>
+            <w:proofErr w:type="spellStart"/>
+            <w:r>
+              <w:rPr>
+                <w:b/>
+                <w:bCs/>
+                <w:i/>
+                <w:iCs/>
+                <w:sz w:val="22"/>
+                <w:szCs w:val="22"/>
+                <w:lang w:eastAsia="zh-CN"/>
+              </w:rPr>
+              <w:t>nhật</w:t>
+            </w:r>
+            <w:proofErr w:type="spellEnd"/>
             <w:r>
               <w:rPr>
                 <w:b/>
@@ -1463,8 +2027,233 @@
                 <w:szCs w:val="22"/>
                 <w:lang w:val="en-GB" w:eastAsia="zh-CN"/>
               </w:rPr>
-              <w:t xml:space="preserve">* Phần đề ký: để khoảng cách (thông thủy) </w:t>
-            </w:r>
+              <w:t xml:space="preserve">* </w:t>
+            </w:r>
+            <w:proofErr w:type="spellStart"/>
+            <w:r>
+              <w:rPr>
+                <w:rFonts w:ascii="Times New Roman" w:hAnsi="Times New Roman"/>
+                <w:b/>
+                <w:bCs/>
+                <w:i/>
+                <w:iCs/>
+                <w:sz w:val="22"/>
+                <w:szCs w:val="22"/>
+                <w:lang w:val="en-GB" w:eastAsia="zh-CN"/>
+              </w:rPr>
+              <w:t>Phần</w:t>
+            </w:r>
+            <w:proofErr w:type="spellEnd"/>
+            <w:r>
+              <w:rPr>
+                <w:rFonts w:ascii="Times New Roman" w:hAnsi="Times New Roman"/>
+                <w:b/>
+                <w:bCs/>
+                <w:i/>
+                <w:iCs/>
+                <w:sz w:val="22"/>
+                <w:szCs w:val="22"/>
+                <w:lang w:val="en-GB" w:eastAsia="zh-CN"/>
+              </w:rPr>
+              <w:t xml:space="preserve"> </w:t>
+            </w:r>
+            <w:proofErr w:type="spellStart"/>
+            <w:r>
+              <w:rPr>
+                <w:rFonts w:ascii="Times New Roman" w:hAnsi="Times New Roman"/>
+                <w:b/>
+                <w:bCs/>
+                <w:i/>
+                <w:iCs/>
+                <w:sz w:val="22"/>
+                <w:szCs w:val="22"/>
+                <w:lang w:val="en-GB" w:eastAsia="zh-CN"/>
+              </w:rPr>
+              <w:t>đề</w:t>
+            </w:r>
+            <w:proofErr w:type="spellEnd"/>
+            <w:r>
+              <w:rPr>
+                <w:rFonts w:ascii="Times New Roman" w:hAnsi="Times New Roman"/>
+                <w:b/>
+                <w:bCs/>
+                <w:i/>
+                <w:iCs/>
+                <w:sz w:val="22"/>
+                <w:szCs w:val="22"/>
+                <w:lang w:val="en-GB" w:eastAsia="zh-CN"/>
+              </w:rPr>
+              <w:t xml:space="preserve"> </w:t>
+            </w:r>
+            <w:proofErr w:type="spellStart"/>
+            <w:r>
+              <w:rPr>
+                <w:rFonts w:ascii="Times New Roman" w:hAnsi="Times New Roman"/>
+                <w:b/>
+                <w:bCs/>
+                <w:i/>
+                <w:iCs/>
+                <w:sz w:val="22"/>
+                <w:szCs w:val="22"/>
+                <w:lang w:val="en-GB" w:eastAsia="zh-CN"/>
+              </w:rPr>
+              <w:t>ký</w:t>
+            </w:r>
+            <w:proofErr w:type="spellEnd"/>
+            <w:r>
+              <w:rPr>
+                <w:rFonts w:ascii="Times New Roman" w:hAnsi="Times New Roman"/>
+                <w:b/>
+                <w:bCs/>
+                <w:i/>
+                <w:iCs/>
+                <w:sz w:val="22"/>
+                <w:szCs w:val="22"/>
+                <w:lang w:val="en-GB" w:eastAsia="zh-CN"/>
+              </w:rPr>
+              <w:t xml:space="preserve">: </w:t>
+            </w:r>
+            <w:proofErr w:type="spellStart"/>
+            <w:r>
+              <w:rPr>
+                <w:rFonts w:ascii="Times New Roman" w:hAnsi="Times New Roman"/>
+                <w:b/>
+                <w:bCs/>
+                <w:i/>
+                <w:iCs/>
+                <w:sz w:val="22"/>
+                <w:szCs w:val="22"/>
+                <w:lang w:val="en-GB" w:eastAsia="zh-CN"/>
+              </w:rPr>
+              <w:t>để</w:t>
+            </w:r>
+            <w:proofErr w:type="spellEnd"/>
+            <w:r>
+              <w:rPr>
+                <w:rFonts w:ascii="Times New Roman" w:hAnsi="Times New Roman"/>
+                <w:b/>
+                <w:bCs/>
+                <w:i/>
+                <w:iCs/>
+                <w:sz w:val="22"/>
+                <w:szCs w:val="22"/>
+                <w:lang w:val="en-GB" w:eastAsia="zh-CN"/>
+              </w:rPr>
+              <w:t xml:space="preserve"> </w:t>
+            </w:r>
+            <w:proofErr w:type="spellStart"/>
+            <w:r>
+              <w:rPr>
+                <w:rFonts w:ascii="Times New Roman" w:hAnsi="Times New Roman"/>
+                <w:b/>
+                <w:bCs/>
+                <w:i/>
+                <w:iCs/>
+                <w:sz w:val="22"/>
+                <w:szCs w:val="22"/>
+                <w:lang w:val="en-GB" w:eastAsia="zh-CN"/>
+              </w:rPr>
+              <w:t>khoảng</w:t>
+            </w:r>
+            <w:proofErr w:type="spellEnd"/>
+            <w:r>
+              <w:rPr>
+                <w:rFonts w:ascii="Times New Roman" w:hAnsi="Times New Roman"/>
+                <w:b/>
+                <w:bCs/>
+                <w:i/>
+                <w:iCs/>
+                <w:sz w:val="22"/>
+                <w:szCs w:val="22"/>
+                <w:lang w:val="en-GB" w:eastAsia="zh-CN"/>
+              </w:rPr>
+              <w:t xml:space="preserve"> </w:t>
+            </w:r>
+            <w:proofErr w:type="spellStart"/>
+            <w:r>
+              <w:rPr>
+                <w:rFonts w:ascii="Times New Roman" w:hAnsi="Times New Roman"/>
+                <w:b/>
+                <w:bCs/>
+                <w:i/>
+                <w:iCs/>
+                <w:sz w:val="22"/>
+                <w:szCs w:val="22"/>
+                <w:lang w:val="en-GB" w:eastAsia="zh-CN"/>
+              </w:rPr>
+              <w:t>cách</w:t>
+            </w:r>
+            <w:proofErr w:type="spellEnd"/>
+            <w:r>
+              <w:rPr>
+                <w:rFonts w:ascii="Times New Roman" w:hAnsi="Times New Roman"/>
+                <w:b/>
+                <w:bCs/>
+                <w:i/>
+                <w:iCs/>
+                <w:sz w:val="22"/>
+                <w:szCs w:val="22"/>
+                <w:lang w:val="en-GB" w:eastAsia="zh-CN"/>
+              </w:rPr>
+              <w:t xml:space="preserve"> (</w:t>
+            </w:r>
+            <w:proofErr w:type="spellStart"/>
+            <w:r>
+              <w:rPr>
+                <w:rFonts w:ascii="Times New Roman" w:hAnsi="Times New Roman"/>
+                <w:b/>
+                <w:bCs/>
+                <w:i/>
+                <w:iCs/>
+                <w:sz w:val="22"/>
+                <w:szCs w:val="22"/>
+                <w:lang w:val="en-GB" w:eastAsia="zh-CN"/>
+              </w:rPr>
+              <w:t>thông</w:t>
+            </w:r>
+            <w:proofErr w:type="spellEnd"/>
+            <w:r>
+              <w:rPr>
+                <w:rFonts w:ascii="Times New Roman" w:hAnsi="Times New Roman"/>
+                <w:b/>
+                <w:bCs/>
+                <w:i/>
+                <w:iCs/>
+                <w:sz w:val="22"/>
+                <w:szCs w:val="22"/>
+                <w:lang w:val="en-GB" w:eastAsia="zh-CN"/>
+              </w:rPr>
+              <w:t xml:space="preserve"> </w:t>
+            </w:r>
+            <w:proofErr w:type="spellStart"/>
+            <w:r>
+              <w:rPr>
+                <w:rFonts w:ascii="Times New Roman" w:hAnsi="Times New Roman"/>
+                <w:b/>
+                <w:bCs/>
+                <w:i/>
+                <w:iCs/>
+                <w:sz w:val="22"/>
+                <w:szCs w:val="22"/>
+                <w:lang w:val="en-GB" w:eastAsia="zh-CN"/>
+              </w:rPr>
+              <w:t>thủy</w:t>
+            </w:r>
+            <w:proofErr w:type="spellEnd"/>
+            <w:r>
+              <w:rPr>
+                <w:rFonts w:ascii="Times New Roman" w:hAnsi="Times New Roman"/>
+                <w:b/>
+                <w:bCs/>
+                <w:i/>
+                <w:iCs/>
+                <w:sz w:val="22"/>
+                <w:szCs w:val="22"/>
+                <w:lang w:val="en-GB" w:eastAsia="zh-CN"/>
+              </w:rPr>
+              <w:t xml:space="preserve">) </w:t>
+            </w:r>
+            <w:proofErr w:type="spellStart"/>
             <w:r>
               <w:rPr>
                 <w:rFonts w:ascii="Times New Roman" w:hAnsi="Times New Roman"/>
@@ -1475,7 +2264,592 @@
                 <w:sz w:val="22"/>
                 <w:lang w:val="en-GB"/>
               </w:rPr>
-              <w:t>từ chân dòng ghi chức vụ bên trên đến dòng ghi họ và tên của người ký văn bản bên dưới từ 4,5cm đến 5 cm)</w:t>
+              <w:t>từ</w:t>
+            </w:r>
+            <w:proofErr w:type="spellEnd"/>
+            <w:r>
+              <w:rPr>
+                <w:rFonts w:ascii="Times New Roman" w:hAnsi="Times New Roman"/>
+                <w:b/>
+                <w:bCs/>
+                <w:i/>
+                <w:iCs/>
+                <w:sz w:val="22"/>
+                <w:lang w:val="en-GB"/>
+              </w:rPr>
+              <w:t xml:space="preserve"> </w:t>
+            </w:r>
+            <w:proofErr w:type="spellStart"/>
+            <w:r>
+              <w:rPr>
+                <w:rFonts w:ascii="Times New Roman" w:hAnsi="Times New Roman"/>
+                <w:b/>
+                <w:bCs/>
+                <w:i/>
+                <w:iCs/>
+                <w:sz w:val="22"/>
+                <w:lang w:val="en-GB"/>
+              </w:rPr>
+              <w:t>chân</w:t>
+            </w:r>
+            <w:proofErr w:type="spellEnd"/>
+            <w:r>
+              <w:rPr>
+                <w:rFonts w:ascii="Times New Roman" w:hAnsi="Times New Roman"/>
+                <w:b/>
+                <w:bCs/>
+                <w:i/>
+                <w:iCs/>
+                <w:sz w:val="22"/>
+                <w:lang w:val="en-GB"/>
+              </w:rPr>
+              <w:t xml:space="preserve"> </w:t>
+            </w:r>
+            <w:proofErr w:type="spellStart"/>
+            <w:r>
+              <w:rPr>
+                <w:rFonts w:ascii="Times New Roman" w:hAnsi="Times New Roman"/>
+                <w:b/>
+                <w:bCs/>
+                <w:i/>
+                <w:iCs/>
+                <w:sz w:val="22"/>
+                <w:lang w:val="en-GB"/>
+              </w:rPr>
+              <w:t>dòng</w:t>
+            </w:r>
+            <w:proofErr w:type="spellEnd"/>
+            <w:r>
+              <w:rPr>
+                <w:rFonts w:ascii="Times New Roman" w:hAnsi="Times New Roman"/>
+                <w:b/>
+                <w:bCs/>
+                <w:i/>
+                <w:iCs/>
+                <w:sz w:val="22"/>
+                <w:lang w:val="en-GB"/>
+              </w:rPr>
+              <w:t xml:space="preserve"> </w:t>
+            </w:r>
+            <w:proofErr w:type="spellStart"/>
+            <w:r>
+              <w:rPr>
+                <w:rFonts w:ascii="Times New Roman" w:hAnsi="Times New Roman"/>
+                <w:b/>
+                <w:bCs/>
+                <w:i/>
+                <w:iCs/>
+                <w:sz w:val="22"/>
+                <w:lang w:val="en-GB"/>
+              </w:rPr>
+              <w:t>ghi</w:t>
+            </w:r>
+            <w:proofErr w:type="spellEnd"/>
+            <w:r>
+              <w:rPr>
+                <w:rFonts w:ascii="Times New Roman" w:hAnsi="Times New Roman"/>
+                <w:b/>
+                <w:bCs/>
+                <w:i/>
+                <w:iCs/>
+                <w:sz w:val="22"/>
+                <w:lang w:val="en-GB"/>
+              </w:rPr>
+              <w:t xml:space="preserve"> </w:t>
+            </w:r>
+            <w:proofErr w:type="spellStart"/>
+            <w:r>
+              <w:rPr>
+                <w:rFonts w:ascii="Times New Roman" w:hAnsi="Times New Roman"/>
+                <w:b/>
+                <w:bCs/>
+                <w:i/>
+                <w:iCs/>
+                <w:sz w:val="22"/>
+                <w:lang w:val="en-GB"/>
+              </w:rPr>
+              <w:t>chức</w:t>
+            </w:r>
+            <w:proofErr w:type="spellEnd"/>
+            <w:r>
+              <w:rPr>
+                <w:rFonts w:ascii="Times New Roman" w:hAnsi="Times New Roman"/>
+                <w:b/>
+                <w:bCs/>
+                <w:i/>
+                <w:iCs/>
+                <w:sz w:val="22"/>
+                <w:lang w:val="en-GB"/>
+              </w:rPr>
+              <w:t xml:space="preserve"> </w:t>
+            </w:r>
+            <w:proofErr w:type="spellStart"/>
+            <w:r>
+              <w:rPr>
+                <w:rFonts w:ascii="Times New Roman" w:hAnsi="Times New Roman"/>
+                <w:b/>
+                <w:bCs/>
+                <w:i/>
+                <w:iCs/>
+                <w:sz w:val="22"/>
+                <w:lang w:val="en-GB"/>
+              </w:rPr>
+              <w:t>vụ</w:t>
+            </w:r>
+            <w:proofErr w:type="spellEnd"/>
+            <w:r>
+              <w:rPr>
+                <w:rFonts w:ascii="Times New Roman" w:hAnsi="Times New Roman"/>
+                <w:b/>
+                <w:bCs/>
+                <w:i/>
+                <w:iCs/>
+                <w:sz w:val="22"/>
+                <w:lang w:val="en-GB"/>
+              </w:rPr>
+              <w:t xml:space="preserve"> </w:t>
+            </w:r>
+            <w:proofErr w:type="spellStart"/>
+            <w:r>
+              <w:rPr>
+                <w:rFonts w:ascii="Times New Roman" w:hAnsi="Times New Roman"/>
+                <w:b/>
+                <w:bCs/>
+                <w:i/>
+                <w:iCs/>
+                <w:sz w:val="22"/>
+                <w:lang w:val="en-GB"/>
+              </w:rPr>
+              <w:t>bên</w:t>
+            </w:r>
+            <w:proofErr w:type="spellEnd"/>
+            <w:r>
+              <w:rPr>
+                <w:rFonts w:ascii="Times New Roman" w:hAnsi="Times New Roman"/>
+                <w:b/>
+                <w:bCs/>
+                <w:i/>
+                <w:iCs/>
+                <w:sz w:val="22"/>
+                <w:lang w:val="en-GB"/>
+              </w:rPr>
+              <w:t xml:space="preserve"> </w:t>
+            </w:r>
+            <w:proofErr w:type="spellStart"/>
+            <w:r>
+              <w:rPr>
+                <w:rFonts w:ascii="Times New Roman" w:hAnsi="Times New Roman"/>
+                <w:b/>
+                <w:bCs/>
+                <w:i/>
+                <w:iCs/>
+                <w:sz w:val="22"/>
+                <w:lang w:val="en-GB"/>
+              </w:rPr>
+              <w:t>trên</w:t>
+            </w:r>
+            <w:proofErr w:type="spellEnd"/>
+            <w:r>
+              <w:rPr>
+                <w:rFonts w:ascii="Times New Roman" w:hAnsi="Times New Roman"/>
+                <w:b/>
+                <w:bCs/>
+                <w:i/>
+                <w:iCs/>
+                <w:sz w:val="22"/>
+                <w:lang w:val="en-GB"/>
+              </w:rPr>
+              <w:t xml:space="preserve"> </w:t>
+            </w:r>
+            <w:proofErr w:type="spellStart"/>
+            <w:r>
+              <w:rPr>
+                <w:rFonts w:ascii="Times New Roman" w:hAnsi="Times New Roman"/>
+                <w:b/>
+                <w:bCs/>
+                <w:i/>
+                <w:iCs/>
+                <w:sz w:val="22"/>
+                <w:lang w:val="en-GB"/>
+              </w:rPr>
+              <w:t>đến</w:t>
+            </w:r>
+            <w:proofErr w:type="spellEnd"/>
+            <w:r>
+              <w:rPr>
+                <w:rFonts w:ascii="Times New Roman" w:hAnsi="Times New Roman"/>
+                <w:b/>
+                <w:bCs/>
+                <w:i/>
+                <w:iCs/>
+                <w:sz w:val="22"/>
+                <w:lang w:val="en-GB"/>
+              </w:rPr>
+              <w:t xml:space="preserve"> </w:t>
+            </w:r>
+            <w:proofErr w:type="spellStart"/>
+            <w:r>
+              <w:rPr>
+                <w:rFonts w:ascii="Times New Roman" w:hAnsi="Times New Roman"/>
+                <w:b/>
+                <w:bCs/>
+                <w:i/>
+                <w:iCs/>
+                <w:sz w:val="22"/>
+                <w:lang w:val="en-GB"/>
+              </w:rPr>
+              <w:t>dòng</w:t>
+            </w:r>
+            <w:proofErr w:type="spellEnd"/>
+            <w:r>
+              <w:rPr>
+                <w:rFonts w:ascii="Times New Roman" w:hAnsi="Times New Roman"/>
+                <w:b/>
+                <w:bCs/>
+                <w:i/>
+                <w:iCs/>
+                <w:sz w:val="22"/>
+                <w:lang w:val="en-GB"/>
+              </w:rPr>
+              <w:t xml:space="preserve"> </w:t>
+            </w:r>
+            <w:proofErr w:type="spellStart"/>
+            <w:r>
+              <w:rPr>
+                <w:rFonts w:ascii="Times New Roman" w:hAnsi="Times New Roman"/>
+                <w:b/>
+                <w:bCs/>
+                <w:i/>
+                <w:iCs/>
+                <w:sz w:val="22"/>
+                <w:lang w:val="en-GB"/>
+              </w:rPr>
+              <w:t>ghi</w:t>
+            </w:r>
+            <w:proofErr w:type="spellEnd"/>
+            <w:r>
+              <w:rPr>
+                <w:rFonts w:ascii="Times New Roman" w:hAnsi="Times New Roman"/>
+                <w:b/>
+                <w:bCs/>
+                <w:i/>
+                <w:iCs/>
+                <w:sz w:val="22"/>
+                <w:lang w:val="en-GB"/>
+              </w:rPr>
+              <w:t xml:space="preserve"> </w:t>
+            </w:r>
+            <w:proofErr w:type="spellStart"/>
+            <w:r>
+              <w:rPr>
+                <w:rFonts w:ascii="Times New Roman" w:hAnsi="Times New Roman"/>
+                <w:b/>
+                <w:bCs/>
+                <w:i/>
+                <w:iCs/>
+                <w:sz w:val="22"/>
+                <w:lang w:val="en-GB"/>
+              </w:rPr>
+              <w:t>họ</w:t>
+            </w:r>
+            <w:proofErr w:type="spellEnd"/>
+            <w:r>
+              <w:rPr>
+                <w:rFonts w:ascii="Times New Roman" w:hAnsi="Times New Roman"/>
+                <w:b/>
+                <w:bCs/>
+                <w:i/>
+                <w:iCs/>
+                <w:sz w:val="22"/>
+                <w:lang w:val="en-GB"/>
+              </w:rPr>
+              <w:t xml:space="preserve"> </w:t>
+            </w:r>
+            <w:proofErr w:type="spellStart"/>
+            <w:r>
+              <w:rPr>
+                <w:rFonts w:ascii="Times New Roman" w:hAnsi="Times New Roman"/>
+                <w:b/>
+                <w:bCs/>
+                <w:i/>
+                <w:iCs/>
+                <w:sz w:val="22"/>
+                <w:lang w:val="en-GB"/>
+              </w:rPr>
+              <w:t>và</w:t>
+            </w:r>
+            <w:proofErr w:type="spellEnd"/>
+            <w:r>
+              <w:rPr>
+                <w:rFonts w:ascii="Times New Roman" w:hAnsi="Times New Roman"/>
+                <w:b/>
+                <w:bCs/>
+                <w:i/>
+                <w:iCs/>
+                <w:sz w:val="22"/>
+                <w:lang w:val="en-GB"/>
+              </w:rPr>
+              <w:t xml:space="preserve"> </w:t>
+            </w:r>
+            <w:proofErr w:type="spellStart"/>
+            <w:r>
+              <w:rPr>
+                <w:rFonts w:ascii="Times New Roman" w:hAnsi="Times New Roman"/>
+                <w:b/>
+                <w:bCs/>
+                <w:i/>
+                <w:iCs/>
+                <w:sz w:val="22"/>
+                <w:lang w:val="en-GB"/>
+              </w:rPr>
+              <w:t>tên</w:t>
+            </w:r>
+            <w:proofErr w:type="spellEnd"/>
+            <w:r>
+              <w:rPr>
+                <w:rFonts w:ascii="Times New Roman" w:hAnsi="Times New Roman"/>
+                <w:b/>
+                <w:bCs/>
+                <w:i/>
+                <w:iCs/>
+                <w:sz w:val="22"/>
+                <w:lang w:val="en-GB"/>
+              </w:rPr>
+              <w:t xml:space="preserve"> </w:t>
+            </w:r>
+            <w:proofErr w:type="spellStart"/>
+            <w:r>
+              <w:rPr>
+                <w:rFonts w:ascii="Times New Roman" w:hAnsi="Times New Roman"/>
+                <w:b/>
+                <w:bCs/>
+                <w:i/>
+                <w:iCs/>
+                <w:sz w:val="22"/>
+                <w:lang w:val="en-GB"/>
+              </w:rPr>
+              <w:t>của</w:t>
+            </w:r>
+            <w:proofErr w:type="spellEnd"/>
+            <w:r>
+              <w:rPr>
+                <w:rFonts w:ascii="Times New Roman" w:hAnsi="Times New Roman"/>
+                <w:b/>
+                <w:bCs/>
+                <w:i/>
+                <w:iCs/>
+                <w:sz w:val="22"/>
+                <w:lang w:val="en-GB"/>
+              </w:rPr>
+              <w:t xml:space="preserve"> </w:t>
+            </w:r>
+            <w:proofErr w:type="spellStart"/>
+            <w:r>
+              <w:rPr>
+                <w:rFonts w:ascii="Times New Roman" w:hAnsi="Times New Roman"/>
+                <w:b/>
+                <w:bCs/>
+                <w:i/>
+                <w:iCs/>
+                <w:sz w:val="22"/>
+                <w:lang w:val="en-GB"/>
+              </w:rPr>
+              <w:t>người</w:t>
+            </w:r>
+            <w:proofErr w:type="spellEnd"/>
+            <w:r>
+              <w:rPr>
+                <w:rFonts w:ascii="Times New Roman" w:hAnsi="Times New Roman"/>
+                <w:b/>
+                <w:bCs/>
+                <w:i/>
+                <w:iCs/>
+                <w:sz w:val="22"/>
+                <w:lang w:val="en-GB"/>
+              </w:rPr>
+              <w:t xml:space="preserve"> </w:t>
+            </w:r>
+            <w:proofErr w:type="spellStart"/>
+            <w:r>
+              <w:rPr>
+                <w:rFonts w:ascii="Times New Roman" w:hAnsi="Times New Roman"/>
+                <w:b/>
+                <w:bCs/>
+                <w:i/>
+                <w:iCs/>
+                <w:sz w:val="22"/>
+                <w:lang w:val="en-GB"/>
+              </w:rPr>
+              <w:t>ký</w:t>
+            </w:r>
+            <w:proofErr w:type="spellEnd"/>
+            <w:r>
+              <w:rPr>
+                <w:rFonts w:ascii="Times New Roman" w:hAnsi="Times New Roman"/>
+                <w:b/>
+                <w:bCs/>
+                <w:i/>
+                <w:iCs/>
+                <w:sz w:val="22"/>
+                <w:lang w:val="en-GB"/>
+              </w:rPr>
+              <w:t xml:space="preserve"> </w:t>
+            </w:r>
+            <w:proofErr w:type="spellStart"/>
+            <w:r>
+              <w:rPr>
+                <w:rFonts w:ascii="Times New Roman" w:hAnsi="Times New Roman"/>
+                <w:b/>
+                <w:bCs/>
+                <w:i/>
+                <w:iCs/>
+                <w:sz w:val="22"/>
+                <w:lang w:val="en-GB"/>
+              </w:rPr>
+              <w:t>văn</w:t>
+            </w:r>
+            <w:proofErr w:type="spellEnd"/>
+            <w:r>
+              <w:rPr>
+                <w:rFonts w:ascii="Times New Roman" w:hAnsi="Times New Roman"/>
+                <w:b/>
+                <w:bCs/>
+                <w:i/>
+                <w:iCs/>
+                <w:sz w:val="22"/>
+                <w:lang w:val="en-GB"/>
+              </w:rPr>
+              <w:t xml:space="preserve"> </w:t>
+            </w:r>
+            <w:proofErr w:type="spellStart"/>
+            <w:r>
+              <w:rPr>
+                <w:rFonts w:ascii="Times New Roman" w:hAnsi="Times New Roman"/>
+                <w:b/>
+                <w:bCs/>
+                <w:i/>
+                <w:iCs/>
+                <w:sz w:val="22"/>
+                <w:lang w:val="en-GB"/>
+              </w:rPr>
+              <w:t>bản</w:t>
+            </w:r>
+            <w:proofErr w:type="spellEnd"/>
+            <w:r>
+              <w:rPr>
+                <w:rFonts w:ascii="Times New Roman" w:hAnsi="Times New Roman"/>
+                <w:b/>
+                <w:bCs/>
+                <w:i/>
+                <w:iCs/>
+                <w:sz w:val="22"/>
+                <w:lang w:val="en-GB"/>
+              </w:rPr>
+              <w:t xml:space="preserve"> </w:t>
+            </w:r>
+            <w:proofErr w:type="spellStart"/>
+            <w:r>
+              <w:rPr>
+                <w:rFonts w:ascii="Times New Roman" w:hAnsi="Times New Roman"/>
+                <w:b/>
+                <w:bCs/>
+                <w:i/>
+                <w:iCs/>
+                <w:sz w:val="22"/>
+                <w:lang w:val="en-GB"/>
+              </w:rPr>
+              <w:t>bên</w:t>
+            </w:r>
+            <w:proofErr w:type="spellEnd"/>
+            <w:r>
+              <w:rPr>
+                <w:rFonts w:ascii="Times New Roman" w:hAnsi="Times New Roman"/>
+                <w:b/>
+                <w:bCs/>
+                <w:i/>
+                <w:iCs/>
+                <w:sz w:val="22"/>
+                <w:lang w:val="en-GB"/>
+              </w:rPr>
+              <w:t xml:space="preserve"> </w:t>
+            </w:r>
+            <w:proofErr w:type="spellStart"/>
+            <w:r>
+              <w:rPr>
+                <w:rFonts w:ascii="Times New Roman" w:hAnsi="Times New Roman"/>
+                <w:b/>
+                <w:bCs/>
+                <w:i/>
+                <w:iCs/>
+                <w:sz w:val="22"/>
+                <w:lang w:val="en-GB"/>
+              </w:rPr>
+              <w:t>dưới</w:t>
+            </w:r>
+            <w:proofErr w:type="spellEnd"/>
+            <w:r>
+              <w:rPr>
+                <w:rFonts w:ascii="Times New Roman" w:hAnsi="Times New Roman"/>
+                <w:b/>
+                <w:bCs/>
+                <w:i/>
+                <w:iCs/>
+                <w:sz w:val="22"/>
+                <w:lang w:val="en-GB"/>
+              </w:rPr>
+              <w:t xml:space="preserve"> </w:t>
+            </w:r>
+            <w:proofErr w:type="spellStart"/>
+            <w:r>
+              <w:rPr>
+                <w:rFonts w:ascii="Times New Roman" w:hAnsi="Times New Roman"/>
+                <w:b/>
+                <w:bCs/>
+                <w:i/>
+                <w:iCs/>
+                <w:sz w:val="22"/>
+                <w:lang w:val="en-GB"/>
+              </w:rPr>
+              <w:t>từ</w:t>
+            </w:r>
+            <w:proofErr w:type="spellEnd"/>
+            <w:r>
+              <w:rPr>
+                <w:rFonts w:ascii="Times New Roman" w:hAnsi="Times New Roman"/>
+                <w:b/>
+                <w:bCs/>
+                <w:i/>
+                <w:iCs/>
+                <w:sz w:val="22"/>
+                <w:lang w:val="en-GB"/>
+              </w:rPr>
+              <w:t xml:space="preserve"> 4,5cm </w:t>
+            </w:r>
+            <w:proofErr w:type="spellStart"/>
+            <w:r>
+              <w:rPr>
+                <w:rFonts w:ascii="Times New Roman" w:hAnsi="Times New Roman"/>
+                <w:b/>
+                <w:bCs/>
+                <w:i/>
+                <w:iCs/>
+                <w:sz w:val="22"/>
+                <w:lang w:val="en-GB"/>
+              </w:rPr>
+              <w:t>đến</w:t>
+            </w:r>
+            <w:proofErr w:type="spellEnd"/>
+            <w:r>
+              <w:rPr>
+                <w:rFonts w:ascii="Times New Roman" w:hAnsi="Times New Roman"/>
+                <w:b/>
+                <w:bCs/>
+                <w:i/>
+                <w:iCs/>
+                <w:sz w:val="22"/>
+                <w:lang w:val="en-GB"/>
+              </w:rPr>
+              <w:t xml:space="preserve"> 5 cm)</w:t>
             </w:r>
           </w:p>
           <w:p>
@@ -1506,29 +2880,104 @@
                 <w:sz w:val="22"/>
                 <w:szCs w:val="22"/>
               </w:rPr>
-              <w:t xml:space="preserve">) Tên </w:t>
-            </w:r>
-            <w:r>
-              <w:rPr>
-                <w:sz w:val="22"/>
-                <w:szCs w:val="22"/>
-              </w:rPr>
-              <w:t>đơn vị</w:t>
-            </w:r>
-            <w:r>
-              <w:rPr>
-                <w:sz w:val="22"/>
-                <w:szCs w:val="22"/>
-              </w:rPr>
-              <w:t xml:space="preserve"> </w:t>
-            </w:r>
-            <w:r>
-              <w:rPr>
-                <w:sz w:val="22"/>
-                <w:szCs w:val="22"/>
-              </w:rPr>
-              <w:t>ban hành văn bản</w:t>
-            </w:r>
+              <w:t xml:space="preserve">) </w:t>
+            </w:r>
+            <w:proofErr w:type="spellStart"/>
+            <w:r>
+              <w:rPr>
+                <w:sz w:val="22"/>
+                <w:szCs w:val="22"/>
+              </w:rPr>
+              <w:t>Tên</w:t>
+            </w:r>
+            <w:proofErr w:type="spellEnd"/>
+            <w:r>
+              <w:rPr>
+                <w:sz w:val="22"/>
+                <w:szCs w:val="22"/>
+              </w:rPr>
+              <w:t xml:space="preserve"> </w:t>
+            </w:r>
+            <w:proofErr w:type="spellStart"/>
+            <w:r>
+              <w:rPr>
+                <w:sz w:val="22"/>
+                <w:szCs w:val="22"/>
+              </w:rPr>
+              <w:t>đơn</w:t>
+            </w:r>
+            <w:proofErr w:type="spellEnd"/>
+            <w:r>
+              <w:rPr>
+                <w:sz w:val="22"/>
+                <w:szCs w:val="22"/>
+              </w:rPr>
+              <w:t xml:space="preserve"> </w:t>
+            </w:r>
+            <w:proofErr w:type="spellStart"/>
+            <w:r>
+              <w:rPr>
+                <w:sz w:val="22"/>
+                <w:szCs w:val="22"/>
+              </w:rPr>
+              <w:t>vị</w:t>
+            </w:r>
+            <w:proofErr w:type="spellEnd"/>
+            <w:r>
+              <w:rPr>
+                <w:sz w:val="22"/>
+                <w:szCs w:val="22"/>
+              </w:rPr>
+              <w:t xml:space="preserve"> </w:t>
+            </w:r>
+            <w:r>
+              <w:rPr>
+                <w:sz w:val="22"/>
+                <w:szCs w:val="22"/>
+              </w:rPr>
+              <w:t xml:space="preserve">ban </w:t>
+            </w:r>
+            <w:proofErr w:type="spellStart"/>
+            <w:r>
+              <w:rPr>
+                <w:sz w:val="22"/>
+                <w:szCs w:val="22"/>
+              </w:rPr>
+              <w:t>hành</w:t>
+            </w:r>
+            <w:proofErr w:type="spellEnd"/>
+            <w:r>
+              <w:rPr>
+                <w:sz w:val="22"/>
+                <w:szCs w:val="22"/>
+              </w:rPr>
+              <w:t xml:space="preserve"> </w:t>
+            </w:r>
+            <w:proofErr w:type="spellStart"/>
+            <w:r>
+              <w:rPr>
+                <w:sz w:val="22"/>
+                <w:szCs w:val="22"/>
+              </w:rPr>
+              <w:t>văn</w:t>
+            </w:r>
+            <w:proofErr w:type="spellEnd"/>
+            <w:r>
+              <w:rPr>
+                <w:sz w:val="22"/>
+                <w:szCs w:val="22"/>
+              </w:rPr>
+              <w:t xml:space="preserve"> </w:t>
+            </w:r>
+            <w:proofErr w:type="spellStart"/>
+            <w:r>
+              <w:rPr>
+                <w:sz w:val="22"/>
+                <w:szCs w:val="22"/>
+              </w:rPr>
+              <w:t>bản</w:t>
+            </w:r>
+            <w:proofErr w:type="spellEnd"/>
             <w:r>
               <w:rPr>
                 <w:sz w:val="22"/>
@@ -1543,13 +2992,39 @@
               </w:rPr>
               <w:t>(</w:t>
             </w:r>
-            <w:r>
-              <w:rPr>
-                <w:sz w:val="22"/>
-                <w:szCs w:val="22"/>
-              </w:rPr>
-              <w:t xml:space="preserve">chữ in hoa, </w:t>
-            </w:r>
+            <w:proofErr w:type="spellStart"/>
+            <w:r>
+              <w:rPr>
+                <w:sz w:val="22"/>
+                <w:szCs w:val="22"/>
+              </w:rPr>
+              <w:t>chữ</w:t>
+            </w:r>
+            <w:proofErr w:type="spellEnd"/>
+            <w:r>
+              <w:rPr>
+                <w:sz w:val="22"/>
+                <w:szCs w:val="22"/>
+              </w:rPr>
+              <w:t xml:space="preserve"> in </w:t>
+            </w:r>
+            <w:proofErr w:type="spellStart"/>
+            <w:r>
+              <w:rPr>
+                <w:sz w:val="22"/>
+                <w:szCs w:val="22"/>
+              </w:rPr>
+              <w:t>hoa</w:t>
+            </w:r>
+            <w:proofErr w:type="spellEnd"/>
+            <w:r>
+              <w:rPr>
+                <w:sz w:val="22"/>
+                <w:szCs w:val="22"/>
+              </w:rPr>
+              <w:t xml:space="preserve">, </w:t>
+            </w:r>
+            <w:proofErr w:type="spellStart"/>
             <w:r>
               <w:rPr>
                 <w:rFonts w:hint="eastAsia"/>
@@ -1565,6 +3040,7 @@
               </w:rPr>
               <w:t>ứng</w:t>
             </w:r>
+            <w:proofErr w:type="spellEnd"/>
             <w:r>
               <w:rPr>
                 <w:sz w:val="22"/>
@@ -1579,6 +3055,7 @@
               </w:rPr>
               <w:t xml:space="preserve"> </w:t>
             </w:r>
+            <w:proofErr w:type="spellStart"/>
             <w:r>
               <w:rPr>
                 <w:rFonts w:hint="eastAsia"/>
@@ -1592,7 +3069,15 @@
                 <w:sz w:val="22"/>
                 <w:szCs w:val="22"/>
               </w:rPr>
-              <w:t>ậm)</w:t>
+              <w:t>ậm</w:t>
+            </w:r>
+            <w:proofErr w:type="spellEnd"/>
+            <w:r>
+              <w:rPr>
+                <w:sz w:val="22"/>
+                <w:szCs w:val="22"/>
+              </w:rPr>
+              <w:t>)</w:t>
             </w:r>
             <w:r>
               <w:rPr>
@@ -1632,19 +3117,60 @@
               </w:rPr>
               <w:t xml:space="preserve">) </w:t>
             </w:r>
-            <w:r>
-              <w:rPr>
-                <w:sz w:val="22"/>
-                <w:szCs w:val="22"/>
-              </w:rPr>
-              <w:t>Ghi đ</w:t>
-            </w:r>
-            <w:r>
-              <w:rPr>
-                <w:sz w:val="22"/>
-                <w:szCs w:val="22"/>
-              </w:rPr>
-              <w:t>ịa danh.</w:t>
+            <w:proofErr w:type="spellStart"/>
+            <w:r>
+              <w:rPr>
+                <w:sz w:val="22"/>
+                <w:szCs w:val="22"/>
+              </w:rPr>
+              <w:t>Ghi</w:t>
+            </w:r>
+            <w:proofErr w:type="spellEnd"/>
+            <w:r>
+              <w:rPr>
+                <w:sz w:val="22"/>
+                <w:szCs w:val="22"/>
+              </w:rPr>
+              <w:t xml:space="preserve"> </w:t>
+            </w:r>
+            <w:proofErr w:type="spellStart"/>
+            <w:r>
+              <w:rPr>
+                <w:sz w:val="22"/>
+                <w:szCs w:val="22"/>
+              </w:rPr>
+              <w:t>đ</w:t>
+            </w:r>
+            <w:r>
+              <w:rPr>
+                <w:sz w:val="22"/>
+                <w:szCs w:val="22"/>
+              </w:rPr>
+              <w:t>ịa</w:t>
+            </w:r>
+            <w:proofErr w:type="spellEnd"/>
+            <w:r>
+              <w:rPr>
+                <w:sz w:val="22"/>
+                <w:szCs w:val="22"/>
+              </w:rPr>
+              <w:t xml:space="preserve"> </w:t>
+            </w:r>
+            <w:proofErr w:type="spellStart"/>
+            <w:r>
+              <w:rPr>
+                <w:sz w:val="22"/>
+                <w:szCs w:val="22"/>
+              </w:rPr>
+              <w:t>danh</w:t>
+            </w:r>
+            <w:proofErr w:type="spellEnd"/>
+            <w:r>
+              <w:rPr>
+                <w:sz w:val="22"/>
+                <w:szCs w:val="22"/>
+              </w:rPr>
+              <w:t>.</w:t>
             </w:r>
           </w:p>
           <w:p>
@@ -1675,7 +3201,63 @@
                 <w:sz w:val="22"/>
                 <w:szCs w:val="22"/>
               </w:rPr>
-              <w:t>) Trích yếu nội dung v</w:t>
+              <w:t xml:space="preserve">) </w:t>
+            </w:r>
+            <w:proofErr w:type="spellStart"/>
+            <w:r>
+              <w:rPr>
+                <w:sz w:val="22"/>
+                <w:szCs w:val="22"/>
+              </w:rPr>
+              <w:t>Trích</w:t>
+            </w:r>
+            <w:proofErr w:type="spellEnd"/>
+            <w:r>
+              <w:rPr>
+                <w:sz w:val="22"/>
+                <w:szCs w:val="22"/>
+              </w:rPr>
+              <w:t xml:space="preserve"> </w:t>
+            </w:r>
+            <w:proofErr w:type="spellStart"/>
+            <w:r>
+              <w:rPr>
+                <w:sz w:val="22"/>
+                <w:szCs w:val="22"/>
+              </w:rPr>
+              <w:t>yếu</w:t>
+            </w:r>
+            <w:proofErr w:type="spellEnd"/>
+            <w:r>
+              <w:rPr>
+                <w:sz w:val="22"/>
+                <w:szCs w:val="22"/>
+              </w:rPr>
+              <w:t xml:space="preserve"> </w:t>
+            </w:r>
+            <w:proofErr w:type="spellStart"/>
+            <w:r>
+              <w:rPr>
+                <w:sz w:val="22"/>
+                <w:szCs w:val="22"/>
+              </w:rPr>
+              <w:t>nội</w:t>
+            </w:r>
+            <w:proofErr w:type="spellEnd"/>
+            <w:r>
+              <w:rPr>
+                <w:sz w:val="22"/>
+                <w:szCs w:val="22"/>
+              </w:rPr>
+              <w:t xml:space="preserve"> dung </w:t>
+            </w:r>
+            <w:proofErr w:type="spellStart"/>
+            <w:r>
+              <w:rPr>
+                <w:sz w:val="22"/>
+                <w:szCs w:val="22"/>
+              </w:rPr>
+              <w:t>v</w:t>
             </w:r>
             <w:r>
               <w:rPr>
@@ -1690,15 +3272,73 @@
                 <w:sz w:val="22"/>
                 <w:szCs w:val="22"/>
               </w:rPr>
-              <w:t>n bản</w:t>
-            </w:r>
-            <w:r>
-              <w:rPr>
-                <w:sz w:val="22"/>
-                <w:szCs w:val="22"/>
-              </w:rPr>
-              <w:t xml:space="preserve"> (chữ thường, đứng</w:t>
-            </w:r>
+              <w:t>n</w:t>
+            </w:r>
+            <w:proofErr w:type="spellEnd"/>
+            <w:r>
+              <w:rPr>
+                <w:sz w:val="22"/>
+                <w:szCs w:val="22"/>
+              </w:rPr>
+              <w:t xml:space="preserve"> </w:t>
+            </w:r>
+            <w:proofErr w:type="spellStart"/>
+            <w:r>
+              <w:rPr>
+                <w:sz w:val="22"/>
+                <w:szCs w:val="22"/>
+              </w:rPr>
+              <w:t>bản</w:t>
+            </w:r>
+            <w:proofErr w:type="spellEnd"/>
+            <w:r>
+              <w:rPr>
+                <w:sz w:val="22"/>
+                <w:szCs w:val="22"/>
+              </w:rPr>
+              <w:t xml:space="preserve"> (</w:t>
+            </w:r>
+            <w:proofErr w:type="spellStart"/>
+            <w:r>
+              <w:rPr>
+                <w:sz w:val="22"/>
+                <w:szCs w:val="22"/>
+              </w:rPr>
+              <w:t>chữ</w:t>
+            </w:r>
+            <w:proofErr w:type="spellEnd"/>
+            <w:r>
+              <w:rPr>
+                <w:sz w:val="22"/>
+                <w:szCs w:val="22"/>
+              </w:rPr>
+              <w:t xml:space="preserve"> </w:t>
+            </w:r>
+            <w:proofErr w:type="spellStart"/>
+            <w:r>
+              <w:rPr>
+                <w:sz w:val="22"/>
+                <w:szCs w:val="22"/>
+              </w:rPr>
+              <w:t>thường</w:t>
+            </w:r>
+            <w:proofErr w:type="spellEnd"/>
+            <w:r>
+              <w:rPr>
+                <w:sz w:val="22"/>
+                <w:szCs w:val="22"/>
+              </w:rPr>
+              <w:t xml:space="preserve">, </w:t>
+            </w:r>
+            <w:proofErr w:type="spellStart"/>
+            <w:r>
+              <w:rPr>
+                <w:sz w:val="22"/>
+                <w:szCs w:val="22"/>
+              </w:rPr>
+              <w:t>đứng</w:t>
+            </w:r>
+            <w:proofErr w:type="spellEnd"/>
             <w:r>
               <w:rPr>
                 <w:sz w:val="22"/>
@@ -1711,7 +3351,23 @@
                 <w:sz w:val="22"/>
                 <w:szCs w:val="22"/>
               </w:rPr>
-              <w:t xml:space="preserve"> đậm)</w:t>
+              <w:t xml:space="preserve"> </w:t>
+            </w:r>
+            <w:proofErr w:type="spellStart"/>
+            <w:r>
+              <w:rPr>
+                <w:sz w:val="22"/>
+                <w:szCs w:val="22"/>
+              </w:rPr>
+              <w:t>đậm</w:t>
+            </w:r>
+            <w:proofErr w:type="spellEnd"/>
+            <w:r>
+              <w:rPr>
+                <w:sz w:val="22"/>
+                <w:szCs w:val="22"/>
+              </w:rPr>
+              <w:t>)</w:t>
             </w:r>
             <w:r>
               <w:rPr>
@@ -1749,7 +3405,31 @@
                 <w:sz w:val="22"/>
                 <w:szCs w:val="22"/>
               </w:rPr>
-              <w:t>) Nội dung v</w:t>
+              <w:t xml:space="preserve">) </w:t>
+            </w:r>
+            <w:proofErr w:type="spellStart"/>
+            <w:r>
+              <w:rPr>
+                <w:sz w:val="22"/>
+                <w:szCs w:val="22"/>
+              </w:rPr>
+              <w:t>Nội</w:t>
+            </w:r>
+            <w:proofErr w:type="spellEnd"/>
+            <w:r>
+              <w:rPr>
+                <w:sz w:val="22"/>
+                <w:szCs w:val="22"/>
+              </w:rPr>
+              <w:t xml:space="preserve"> dung </w:t>
+            </w:r>
+            <w:proofErr w:type="spellStart"/>
+            <w:r>
+              <w:rPr>
+                <w:sz w:val="22"/>
+                <w:szCs w:val="22"/>
+              </w:rPr>
+              <w:t>v</w:t>
             </w:r>
             <w:r>
               <w:rPr>
@@ -1764,7 +3444,31 @@
                 <w:sz w:val="22"/>
                 <w:szCs w:val="22"/>
               </w:rPr>
-              <w:t>n bản.</w:t>
+              <w:t>n</w:t>
+            </w:r>
+            <w:proofErr w:type="spellEnd"/>
+            <w:r>
+              <w:rPr>
+                <w:sz w:val="22"/>
+                <w:szCs w:val="22"/>
+              </w:rPr>
+              <w:t xml:space="preserve"> </w:t>
+            </w:r>
+            <w:proofErr w:type="spellStart"/>
+            <w:r>
+              <w:rPr>
+                <w:sz w:val="22"/>
+                <w:szCs w:val="22"/>
+              </w:rPr>
+              <w:t>bản</w:t>
+            </w:r>
+            <w:proofErr w:type="spellEnd"/>
+            <w:r>
+              <w:rPr>
+                <w:sz w:val="22"/>
+                <w:szCs w:val="22"/>
+              </w:rPr>
+              <w:t>.</w:t>
             </w:r>
           </w:p>
           <w:p>
@@ -1800,7 +3504,88 @@
                 <w:sz w:val="22"/>
                 <w:szCs w:val="22"/>
               </w:rPr>
-              <w:t>) Quyền hạn, chức vụ của ng</w:t>
+              <w:t xml:space="preserve">) Quyền </w:t>
+            </w:r>
+            <w:proofErr w:type="spellStart"/>
+            <w:r>
+              <w:rPr>
+                <w:rFonts w:ascii="Times New Roman" w:hAnsi="Times New Roman"/>
+                <w:sz w:val="22"/>
+                <w:szCs w:val="22"/>
+              </w:rPr>
+              <w:t>hạn</w:t>
+            </w:r>
+            <w:proofErr w:type="spellEnd"/>
+            <w:r>
+              <w:rPr>
+                <w:rFonts w:ascii="Times New Roman" w:hAnsi="Times New Roman"/>
+                <w:sz w:val="22"/>
+                <w:szCs w:val="22"/>
+              </w:rPr>
+              <w:t xml:space="preserve">, </w:t>
+            </w:r>
+            <w:proofErr w:type="spellStart"/>
+            <w:r>
+              <w:rPr>
+                <w:rFonts w:ascii="Times New Roman" w:hAnsi="Times New Roman"/>
+                <w:sz w:val="22"/>
+                <w:szCs w:val="22"/>
+              </w:rPr>
+              <w:t>chức</w:t>
+            </w:r>
+            <w:proofErr w:type="spellEnd"/>
+            <w:r>
+              <w:rPr>
+                <w:rFonts w:ascii="Times New Roman" w:hAnsi="Times New Roman"/>
+                <w:sz w:val="22"/>
+                <w:szCs w:val="22"/>
+              </w:rPr>
+              <w:t xml:space="preserve"> </w:t>
+            </w:r>
+            <w:proofErr w:type="spellStart"/>
+            <w:r>
+              <w:rPr>
+                <w:rFonts w:ascii="Times New Roman" w:hAnsi="Times New Roman"/>
+                <w:sz w:val="22"/>
+                <w:szCs w:val="22"/>
+              </w:rPr>
+              <w:t>vụ</w:t>
+            </w:r>
+            <w:proofErr w:type="spellEnd"/>
+            <w:r>
+              <w:rPr>
+                <w:rFonts w:ascii="Times New Roman" w:hAnsi="Times New Roman"/>
+                <w:sz w:val="22"/>
+                <w:szCs w:val="22"/>
+              </w:rPr>
+              <w:t xml:space="preserve"> </w:t>
+            </w:r>
+            <w:proofErr w:type="spellStart"/>
+            <w:r>
+              <w:rPr>
+                <w:rFonts w:ascii="Times New Roman" w:hAnsi="Times New Roman"/>
+                <w:sz w:val="22"/>
+                <w:szCs w:val="22"/>
+              </w:rPr>
+              <w:t>của</w:t>
+            </w:r>
+            <w:proofErr w:type="spellEnd"/>
+            <w:r>
+              <w:rPr>
+                <w:rFonts w:ascii="Times New Roman" w:hAnsi="Times New Roman"/>
+                <w:sz w:val="22"/>
+                <w:szCs w:val="22"/>
+              </w:rPr>
+              <w:t xml:space="preserve"> </w:t>
+            </w:r>
+            <w:proofErr w:type="spellStart"/>
+            <w:r>
+              <w:rPr>
+                <w:rFonts w:ascii="Times New Roman" w:hAnsi="Times New Roman"/>
+                <w:sz w:val="22"/>
+                <w:szCs w:val="22"/>
+              </w:rPr>
+              <w:t>ng</w:t>
             </w:r>
             <w:r>
               <w:rPr>
@@ -1816,8 +3601,27 @@
                 <w:sz w:val="22"/>
                 <w:szCs w:val="22"/>
               </w:rPr>
-              <w:t>ời ký</w:t>
-            </w:r>
+              <w:t>ời</w:t>
+            </w:r>
+            <w:proofErr w:type="spellEnd"/>
+            <w:r>
+              <w:rPr>
+                <w:rFonts w:ascii="Times New Roman" w:hAnsi="Times New Roman"/>
+                <w:sz w:val="22"/>
+                <w:szCs w:val="22"/>
+              </w:rPr>
+              <w:t xml:space="preserve"> </w:t>
+            </w:r>
+            <w:proofErr w:type="spellStart"/>
+            <w:r>
+              <w:rPr>
+                <w:rFonts w:ascii="Times New Roman" w:hAnsi="Times New Roman"/>
+                <w:sz w:val="22"/>
+                <w:szCs w:val="22"/>
+              </w:rPr>
+              <w:t>ký</w:t>
+            </w:r>
+            <w:proofErr w:type="spellEnd"/>
             <w:r>
               <w:rPr>
                 <w:rFonts w:ascii="Times New Roman" w:hAnsi="Times New Roman"/>
@@ -1826,22 +3630,42 @@
               </w:rPr>
               <w:t xml:space="preserve"> (</w:t>
             </w:r>
-            <w:r>
-              <w:rPr>
-                <w:rFonts w:ascii="Times New Roman" w:hAnsi="Times New Roman"/>
-                <w:sz w:val="22"/>
-                <w:szCs w:val="22"/>
-              </w:rPr>
-              <w:t xml:space="preserve">chữ </w:t>
-            </w:r>
-            <w:r>
-              <w:rPr>
-                <w:rFonts w:ascii="Times New Roman" w:hAnsi="Times New Roman"/>
-                <w:sz w:val="22"/>
-                <w:szCs w:val="22"/>
-              </w:rPr>
-              <w:t>in hoa</w:t>
-            </w:r>
+            <w:proofErr w:type="spellStart"/>
+            <w:r>
+              <w:rPr>
+                <w:rFonts w:ascii="Times New Roman" w:hAnsi="Times New Roman"/>
+                <w:sz w:val="22"/>
+                <w:szCs w:val="22"/>
+              </w:rPr>
+              <w:t>chữ</w:t>
+            </w:r>
+            <w:proofErr w:type="spellEnd"/>
+            <w:r>
+              <w:rPr>
+                <w:rFonts w:ascii="Times New Roman" w:hAnsi="Times New Roman"/>
+                <w:sz w:val="22"/>
+                <w:szCs w:val="22"/>
+              </w:rPr>
+              <w:t xml:space="preserve"> </w:t>
+            </w:r>
+            <w:r>
+              <w:rPr>
+                <w:rFonts w:ascii="Times New Roman" w:hAnsi="Times New Roman"/>
+                <w:sz w:val="22"/>
+                <w:szCs w:val="22"/>
+              </w:rPr>
+              <w:t xml:space="preserve">in </w:t>
+            </w:r>
+            <w:proofErr w:type="spellStart"/>
+            <w:r>
+              <w:rPr>
+                <w:rFonts w:ascii="Times New Roman" w:hAnsi="Times New Roman"/>
+                <w:sz w:val="22"/>
+                <w:szCs w:val="22"/>
+              </w:rPr>
+              <w:t>hoa</w:t>
+            </w:r>
+            <w:proofErr w:type="spellEnd"/>
             <w:r>
               <w:rPr>
                 <w:rFonts w:ascii="Times New Roman" w:hAnsi="Times New Roman"/>
@@ -1856,8 +3680,18 @@
                 <w:sz w:val="22"/>
                 <w:szCs w:val="22"/>
               </w:rPr>
-              <w:t xml:space="preserve"> đứng</w:t>
-            </w:r>
+              <w:t xml:space="preserve"> </w:t>
+            </w:r>
+            <w:proofErr w:type="spellStart"/>
+            <w:r>
+              <w:rPr>
+                <w:rFonts w:ascii="Times New Roman" w:hAnsi="Times New Roman"/>
+                <w:sz w:val="22"/>
+                <w:szCs w:val="22"/>
+              </w:rPr>
+              <w:t>đứng</w:t>
+            </w:r>
+            <w:proofErr w:type="spellEnd"/>
             <w:r>
               <w:rPr>
                 <w:rFonts w:ascii="Times New Roman" w:hAnsi="Times New Roman"/>
@@ -1872,7 +3706,25 @@
                 <w:sz w:val="22"/>
                 <w:szCs w:val="22"/>
               </w:rPr>
-              <w:t xml:space="preserve"> đậm)</w:t>
+              <w:t xml:space="preserve"> </w:t>
+            </w:r>
+            <w:proofErr w:type="spellStart"/>
+            <w:r>
+              <w:rPr>
+                <w:rFonts w:ascii="Times New Roman" w:hAnsi="Times New Roman"/>
+                <w:sz w:val="22"/>
+                <w:szCs w:val="22"/>
+              </w:rPr>
+              <w:t>đậm</w:t>
+            </w:r>
+            <w:proofErr w:type="spellEnd"/>
+            <w:r>
+              <w:rPr>
+                <w:rFonts w:ascii="Times New Roman" w:hAnsi="Times New Roman"/>
+                <w:sz w:val="22"/>
+                <w:szCs w:val="22"/>
+              </w:rPr>
+              <w:t>)</w:t>
             </w:r>
             <w:r>
               <w:rPr>
@@ -1901,32 +3753,117 @@
                 <w:sz w:val="22"/>
                 <w:szCs w:val="22"/>
               </w:rPr>
-              <w:t>Trường hợp</w:t>
-            </w:r>
-            <w:r>
-              <w:rPr>
-                <w:rFonts w:ascii="Times New Roman" w:hAnsi="Times New Roman"/>
-                <w:sz w:val="22"/>
-                <w:szCs w:val="22"/>
-              </w:rPr>
-              <w:t xml:space="preserve"> cấp </w:t>
-            </w:r>
-            <w:r>
-              <w:rPr>
-                <w:rFonts w:ascii="Times New Roman" w:hAnsi="Times New Roman"/>
-                <w:sz w:val="22"/>
-                <w:szCs w:val="22"/>
-              </w:rPr>
-              <w:t xml:space="preserve">Phó ký thay </w:t>
-            </w:r>
-            <w:r>
-              <w:rPr>
-                <w:rFonts w:ascii="Times New Roman" w:hAnsi="Times New Roman"/>
-                <w:sz w:val="22"/>
-                <w:szCs w:val="22"/>
-              </w:rPr>
-              <w:t xml:space="preserve">cấp </w:t>
-            </w:r>
+              <w:t xml:space="preserve">Trường </w:t>
+            </w:r>
+            <w:proofErr w:type="spellStart"/>
+            <w:r>
+              <w:rPr>
+                <w:rFonts w:ascii="Times New Roman" w:hAnsi="Times New Roman"/>
+                <w:sz w:val="22"/>
+                <w:szCs w:val="22"/>
+              </w:rPr>
+              <w:t>hợp</w:t>
+            </w:r>
+            <w:proofErr w:type="spellEnd"/>
+            <w:r>
+              <w:rPr>
+                <w:rFonts w:ascii="Times New Roman" w:hAnsi="Times New Roman"/>
+                <w:sz w:val="22"/>
+                <w:szCs w:val="22"/>
+              </w:rPr>
+              <w:t xml:space="preserve"> </w:t>
+            </w:r>
+            <w:proofErr w:type="spellStart"/>
+            <w:r>
+              <w:rPr>
+                <w:rFonts w:ascii="Times New Roman" w:hAnsi="Times New Roman"/>
+                <w:sz w:val="22"/>
+                <w:szCs w:val="22"/>
+              </w:rPr>
+              <w:t>cấp</w:t>
+            </w:r>
+            <w:proofErr w:type="spellEnd"/>
+            <w:r>
+              <w:rPr>
+                <w:rFonts w:ascii="Times New Roman" w:hAnsi="Times New Roman"/>
+                <w:sz w:val="22"/>
+                <w:szCs w:val="22"/>
+              </w:rPr>
+              <w:t xml:space="preserve"> </w:t>
+            </w:r>
+            <w:proofErr w:type="spellStart"/>
+            <w:r>
+              <w:rPr>
+                <w:rFonts w:ascii="Times New Roman" w:hAnsi="Times New Roman"/>
+                <w:sz w:val="22"/>
+                <w:szCs w:val="22"/>
+              </w:rPr>
+              <w:t>Phó</w:t>
+            </w:r>
+            <w:proofErr w:type="spellEnd"/>
+            <w:r>
+              <w:rPr>
+                <w:rFonts w:ascii="Times New Roman" w:hAnsi="Times New Roman"/>
+                <w:sz w:val="22"/>
+                <w:szCs w:val="22"/>
+              </w:rPr>
+              <w:t xml:space="preserve"> </w:t>
+            </w:r>
+            <w:proofErr w:type="spellStart"/>
+            <w:r>
+              <w:rPr>
+                <w:rFonts w:ascii="Times New Roman" w:hAnsi="Times New Roman"/>
+                <w:sz w:val="22"/>
+                <w:szCs w:val="22"/>
+              </w:rPr>
+              <w:t>ký</w:t>
+            </w:r>
+            <w:proofErr w:type="spellEnd"/>
+            <w:r>
+              <w:rPr>
+                <w:rFonts w:ascii="Times New Roman" w:hAnsi="Times New Roman"/>
+                <w:sz w:val="22"/>
+                <w:szCs w:val="22"/>
+              </w:rPr>
+              <w:t xml:space="preserve"> </w:t>
+            </w:r>
+            <w:proofErr w:type="spellStart"/>
+            <w:r>
+              <w:rPr>
+                <w:rFonts w:ascii="Times New Roman" w:hAnsi="Times New Roman"/>
+                <w:sz w:val="22"/>
+                <w:szCs w:val="22"/>
+              </w:rPr>
+              <w:t>thay</w:t>
+            </w:r>
+            <w:proofErr w:type="spellEnd"/>
+            <w:r>
+              <w:rPr>
+                <w:rFonts w:ascii="Times New Roman" w:hAnsi="Times New Roman"/>
+                <w:sz w:val="22"/>
+                <w:szCs w:val="22"/>
+              </w:rPr>
+              <w:t xml:space="preserve"> </w:t>
+            </w:r>
+            <w:proofErr w:type="spellStart"/>
+            <w:r>
+              <w:rPr>
+                <w:rFonts w:ascii="Times New Roman" w:hAnsi="Times New Roman"/>
+                <w:sz w:val="22"/>
+                <w:szCs w:val="22"/>
+              </w:rPr>
+              <w:t>cấp</w:t>
+            </w:r>
+            <w:proofErr w:type="spellEnd"/>
+            <w:r>
+              <w:rPr>
+                <w:rFonts w:ascii="Times New Roman" w:hAnsi="Times New Roman"/>
+                <w:sz w:val="22"/>
+                <w:szCs w:val="22"/>
+              </w:rPr>
+              <w:t xml:space="preserve"> </w:t>
+            </w:r>
+            <w:proofErr w:type="spellStart"/>
             <w:r>
               <w:rPr>
                 <w:rFonts w:ascii="Times New Roman" w:hAnsi="Times New Roman"/>
@@ -1943,13 +3880,50 @@
               </w:rPr>
               <w:t>rưởng</w:t>
             </w:r>
-            <w:r>
-              <w:rPr>
-                <w:rFonts w:ascii="Times New Roman" w:hAnsi="Times New Roman"/>
-                <w:sz w:val="22"/>
-                <w:szCs w:val="22"/>
-              </w:rPr>
-              <w:t xml:space="preserve"> thì ghi: </w:t>
+            <w:proofErr w:type="spellEnd"/>
+            <w:r>
+              <w:rPr>
+                <w:rFonts w:ascii="Times New Roman" w:hAnsi="Times New Roman"/>
+                <w:sz w:val="22"/>
+                <w:szCs w:val="22"/>
+              </w:rPr>
+              <w:t xml:space="preserve"> </w:t>
+            </w:r>
+            <w:proofErr w:type="spellStart"/>
+            <w:r>
+              <w:rPr>
+                <w:rFonts w:ascii="Times New Roman" w:hAnsi="Times New Roman"/>
+                <w:sz w:val="22"/>
+                <w:szCs w:val="22"/>
+              </w:rPr>
+              <w:t>thì</w:t>
+            </w:r>
+            <w:proofErr w:type="spellEnd"/>
+            <w:r>
+              <w:rPr>
+                <w:rFonts w:ascii="Times New Roman" w:hAnsi="Times New Roman"/>
+                <w:sz w:val="22"/>
+                <w:szCs w:val="22"/>
+              </w:rPr>
+              <w:t xml:space="preserve"> </w:t>
+            </w:r>
+            <w:proofErr w:type="spellStart"/>
+            <w:r>
+              <w:rPr>
+                <w:rFonts w:ascii="Times New Roman" w:hAnsi="Times New Roman"/>
+                <w:sz w:val="22"/>
+                <w:szCs w:val="22"/>
+              </w:rPr>
+              <w:t>ghi</w:t>
+            </w:r>
+            <w:proofErr w:type="spellEnd"/>
+            <w:r>
+              <w:rPr>
+                <w:rFonts w:ascii="Times New Roman" w:hAnsi="Times New Roman"/>
+                <w:sz w:val="22"/>
+                <w:szCs w:val="22"/>
+              </w:rPr>
+              <w:t xml:space="preserve">: </w:t>
             </w:r>
             <w:r>
               <w:rPr>
@@ -2033,6 +4007,7 @@
               </w:rPr>
               <w:t xml:space="preserve">) </w:t>
             </w:r>
+            <w:proofErr w:type="spellStart"/>
             <w:r>
               <w:rPr>
                 <w:spacing w:val="-2"/>
@@ -2040,8 +4015,79 @@
                 <w:szCs w:val="22"/>
                 <w:lang w:val="en-US"/>
               </w:rPr>
-              <w:t xml:space="preserve">Chữ viết tắt tên </w:t>
-            </w:r>
+              <w:t>Chữ</w:t>
+            </w:r>
+            <w:proofErr w:type="spellEnd"/>
+            <w:r>
+              <w:rPr>
+                <w:spacing w:val="-2"/>
+                <w:sz w:val="22"/>
+                <w:szCs w:val="22"/>
+                <w:lang w:val="en-US"/>
+              </w:rPr>
+              <w:t xml:space="preserve"> </w:t>
+            </w:r>
+            <w:proofErr w:type="spellStart"/>
+            <w:r>
+              <w:rPr>
+                <w:spacing w:val="-2"/>
+                <w:sz w:val="22"/>
+                <w:szCs w:val="22"/>
+                <w:lang w:val="en-US"/>
+              </w:rPr>
+              <w:t>viết</w:t>
+            </w:r>
+            <w:proofErr w:type="spellEnd"/>
+            <w:r>
+              <w:rPr>
+                <w:spacing w:val="-2"/>
+                <w:sz w:val="22"/>
+                <w:szCs w:val="22"/>
+                <w:lang w:val="en-US"/>
+              </w:rPr>
+              <w:t xml:space="preserve"> </w:t>
+            </w:r>
+            <w:proofErr w:type="spellStart"/>
+            <w:r>
+              <w:rPr>
+                <w:spacing w:val="-2"/>
+                <w:sz w:val="22"/>
+                <w:szCs w:val="22"/>
+                <w:lang w:val="en-US"/>
+              </w:rPr>
+              <w:t>tắt</w:t>
+            </w:r>
+            <w:proofErr w:type="spellEnd"/>
+            <w:r>
+              <w:rPr>
+                <w:spacing w:val="-2"/>
+                <w:sz w:val="22"/>
+                <w:szCs w:val="22"/>
+                <w:lang w:val="en-US"/>
+              </w:rPr>
+              <w:t xml:space="preserve"> </w:t>
+            </w:r>
+            <w:proofErr w:type="spellStart"/>
+            <w:r>
+              <w:rPr>
+                <w:spacing w:val="-2"/>
+                <w:sz w:val="22"/>
+                <w:szCs w:val="22"/>
+                <w:lang w:val="en-US"/>
+              </w:rPr>
+              <w:t>tên</w:t>
+            </w:r>
+            <w:proofErr w:type="spellEnd"/>
+            <w:r>
+              <w:rPr>
+                <w:spacing w:val="-2"/>
+                <w:sz w:val="22"/>
+                <w:szCs w:val="22"/>
+                <w:lang w:val="en-US"/>
+              </w:rPr>
+              <w:t xml:space="preserve"> </w:t>
+            </w:r>
+            <w:proofErr w:type="spellStart"/>
             <w:r>
               <w:rPr>
                 <w:rFonts w:hint="eastAsia"/>
@@ -2059,7 +4105,167 @@
                 <w:szCs w:val="22"/>
                 <w:lang w:val="en-US"/>
               </w:rPr>
-              <w:t>n vị chủ trì soạn thảo và số l</w:t>
+              <w:t>n</w:t>
+            </w:r>
+            <w:proofErr w:type="spellEnd"/>
+            <w:r>
+              <w:rPr>
+                <w:spacing w:val="-2"/>
+                <w:sz w:val="22"/>
+                <w:szCs w:val="22"/>
+                <w:lang w:val="en-US"/>
+              </w:rPr>
+              <w:t xml:space="preserve"> </w:t>
+            </w:r>
+            <w:proofErr w:type="spellStart"/>
+            <w:r>
+              <w:rPr>
+                <w:spacing w:val="-2"/>
+                <w:sz w:val="22"/>
+                <w:szCs w:val="22"/>
+                <w:lang w:val="en-US"/>
+              </w:rPr>
+              <w:t>vị</w:t>
+            </w:r>
+            <w:proofErr w:type="spellEnd"/>
+            <w:r>
+              <w:rPr>
+                <w:spacing w:val="-2"/>
+                <w:sz w:val="22"/>
+                <w:szCs w:val="22"/>
+                <w:lang w:val="en-US"/>
+              </w:rPr>
+              <w:t xml:space="preserve"> </w:t>
+            </w:r>
+            <w:proofErr w:type="spellStart"/>
+            <w:r>
+              <w:rPr>
+                <w:spacing w:val="-2"/>
+                <w:sz w:val="22"/>
+                <w:szCs w:val="22"/>
+                <w:lang w:val="en-US"/>
+              </w:rPr>
+              <w:t>chủ</w:t>
+            </w:r>
+            <w:proofErr w:type="spellEnd"/>
+            <w:r>
+              <w:rPr>
+                <w:spacing w:val="-2"/>
+                <w:sz w:val="22"/>
+                <w:szCs w:val="22"/>
+                <w:lang w:val="en-US"/>
+              </w:rPr>
+              <w:t xml:space="preserve"> </w:t>
+            </w:r>
+            <w:proofErr w:type="spellStart"/>
+            <w:r>
+              <w:rPr>
+                <w:spacing w:val="-2"/>
+                <w:sz w:val="22"/>
+                <w:szCs w:val="22"/>
+                <w:lang w:val="en-US"/>
+              </w:rPr>
+              <w:t>trì</w:t>
+            </w:r>
+            <w:proofErr w:type="spellEnd"/>
+            <w:r>
+              <w:rPr>
+                <w:spacing w:val="-2"/>
+                <w:sz w:val="22"/>
+                <w:szCs w:val="22"/>
+                <w:lang w:val="en-US"/>
+              </w:rPr>
+              <w:t xml:space="preserve"> </w:t>
+            </w:r>
+            <w:proofErr w:type="spellStart"/>
+            <w:r>
+              <w:rPr>
+                <w:spacing w:val="-2"/>
+                <w:sz w:val="22"/>
+                <w:szCs w:val="22"/>
+                <w:lang w:val="en-US"/>
+              </w:rPr>
+              <w:t>soạn</w:t>
+            </w:r>
+            <w:proofErr w:type="spellEnd"/>
+            <w:r>
+              <w:rPr>
+                <w:spacing w:val="-2"/>
+                <w:sz w:val="22"/>
+                <w:szCs w:val="22"/>
+                <w:lang w:val="en-US"/>
+              </w:rPr>
+              <w:t xml:space="preserve"> </w:t>
+            </w:r>
+            <w:proofErr w:type="spellStart"/>
+            <w:r>
+              <w:rPr>
+                <w:spacing w:val="-2"/>
+                <w:sz w:val="22"/>
+                <w:szCs w:val="22"/>
+                <w:lang w:val="en-US"/>
+              </w:rPr>
+              <w:t>thảo</w:t>
+            </w:r>
+            <w:proofErr w:type="spellEnd"/>
+            <w:r>
+              <w:rPr>
+                <w:spacing w:val="-2"/>
+                <w:sz w:val="22"/>
+                <w:szCs w:val="22"/>
+                <w:lang w:val="en-US"/>
+              </w:rPr>
+              <w:t xml:space="preserve"> </w:t>
+            </w:r>
+            <w:proofErr w:type="spellStart"/>
+            <w:r>
+              <w:rPr>
+                <w:spacing w:val="-2"/>
+                <w:sz w:val="22"/>
+                <w:szCs w:val="22"/>
+                <w:lang w:val="en-US"/>
+              </w:rPr>
+              <w:t>và</w:t>
+            </w:r>
+            <w:proofErr w:type="spellEnd"/>
+            <w:r>
+              <w:rPr>
+                <w:spacing w:val="-2"/>
+                <w:sz w:val="22"/>
+                <w:szCs w:val="22"/>
+                <w:lang w:val="en-US"/>
+              </w:rPr>
+              <w:t xml:space="preserve"> </w:t>
+            </w:r>
+            <w:proofErr w:type="spellStart"/>
+            <w:r>
+              <w:rPr>
+                <w:spacing w:val="-2"/>
+                <w:sz w:val="22"/>
+                <w:szCs w:val="22"/>
+                <w:lang w:val="en-US"/>
+              </w:rPr>
+              <w:t>số</w:t>
+            </w:r>
+            <w:proofErr w:type="spellEnd"/>
+            <w:r>
+              <w:rPr>
+                <w:spacing w:val="-2"/>
+                <w:sz w:val="22"/>
+                <w:szCs w:val="22"/>
+                <w:lang w:val="en-US"/>
+              </w:rPr>
+              <w:t xml:space="preserve"> </w:t>
+            </w:r>
+            <w:proofErr w:type="spellStart"/>
+            <w:r>
+              <w:rPr>
+                <w:spacing w:val="-2"/>
+                <w:sz w:val="22"/>
+                <w:szCs w:val="22"/>
+                <w:lang w:val="en-US"/>
+              </w:rPr>
+              <w:t>l</w:t>
             </w:r>
             <w:r>
               <w:rPr>
@@ -2078,7 +4284,47 @@
                 <w:szCs w:val="22"/>
                 <w:lang w:val="en-US"/>
               </w:rPr>
-              <w:t>ợng bản l</w:t>
+              <w:t>ợng</w:t>
+            </w:r>
+            <w:proofErr w:type="spellEnd"/>
+            <w:r>
+              <w:rPr>
+                <w:spacing w:val="-2"/>
+                <w:sz w:val="22"/>
+                <w:szCs w:val="22"/>
+                <w:lang w:val="en-US"/>
+              </w:rPr>
+              <w:t xml:space="preserve"> </w:t>
+            </w:r>
+            <w:proofErr w:type="spellStart"/>
+            <w:r>
+              <w:rPr>
+                <w:spacing w:val="-2"/>
+                <w:sz w:val="22"/>
+                <w:szCs w:val="22"/>
+                <w:lang w:val="en-US"/>
+              </w:rPr>
+              <w:t>bản</w:t>
+            </w:r>
+            <w:proofErr w:type="spellEnd"/>
+            <w:r>
+              <w:rPr>
+                <w:spacing w:val="-2"/>
+                <w:sz w:val="22"/>
+                <w:szCs w:val="22"/>
+                <w:lang w:val="en-US"/>
+              </w:rPr>
+              <w:t xml:space="preserve"> </w:t>
+            </w:r>
+            <w:proofErr w:type="spellStart"/>
+            <w:r>
+              <w:rPr>
+                <w:spacing w:val="-2"/>
+                <w:sz w:val="22"/>
+                <w:szCs w:val="22"/>
+                <w:lang w:val="en-US"/>
+              </w:rPr>
+              <w:t>l</w:t>
             </w:r>
             <w:r>
               <w:rPr>
@@ -2097,7 +4343,57 @@
                 <w:szCs w:val="22"/>
                 <w:lang w:val="en-US"/>
               </w:rPr>
-              <w:t>u (nếu cần).</w:t>
+              <w:t>u</w:t>
+            </w:r>
+            <w:proofErr w:type="spellEnd"/>
+            <w:r>
+              <w:rPr>
+                <w:spacing w:val="-2"/>
+                <w:sz w:val="22"/>
+                <w:szCs w:val="22"/>
+                <w:lang w:val="en-US"/>
+              </w:rPr>
+              <w:t xml:space="preserve"> (</w:t>
+            </w:r>
+            <w:proofErr w:type="spellStart"/>
+            <w:r>
+              <w:rPr>
+                <w:spacing w:val="-2"/>
+                <w:sz w:val="22"/>
+                <w:szCs w:val="22"/>
+                <w:lang w:val="en-US"/>
+              </w:rPr>
+              <w:t>nếu</w:t>
+            </w:r>
+            <w:proofErr w:type="spellEnd"/>
+            <w:r>
+              <w:rPr>
+                <w:spacing w:val="-2"/>
+                <w:sz w:val="22"/>
+                <w:szCs w:val="22"/>
+                <w:lang w:val="en-US"/>
+              </w:rPr>
+              <w:t xml:space="preserve"> </w:t>
+            </w:r>
+            <w:proofErr w:type="spellStart"/>
+            <w:r>
+              <w:rPr>
+                <w:spacing w:val="-2"/>
+                <w:sz w:val="22"/>
+                <w:szCs w:val="22"/>
+                <w:lang w:val="en-US"/>
+              </w:rPr>
+              <w:t>cần</w:t>
+            </w:r>
+            <w:proofErr w:type="spellEnd"/>
+            <w:r>
+              <w:rPr>
+                <w:spacing w:val="-2"/>
+                <w:sz w:val="22"/>
+                <w:szCs w:val="22"/>
+                <w:lang w:val="en-US"/>
+              </w:rPr>
+              <w:t>).</w:t>
             </w:r>
           </w:p>
           <w:p>
@@ -2132,16 +4428,63 @@
                 <w:szCs w:val="22"/>
                 <w:lang w:val="en-US"/>
               </w:rPr>
-              <w:t xml:space="preserve">) Ký hiệu </w:t>
-            </w:r>
-            <w:r>
-              <w:rPr>
-                <w:sz w:val="22"/>
-                <w:szCs w:val="22"/>
-                <w:lang w:val="en-US"/>
-              </w:rPr>
-              <w:t xml:space="preserve">của </w:t>
-            </w:r>
+              <w:t xml:space="preserve">) </w:t>
+            </w:r>
+            <w:proofErr w:type="spellStart"/>
+            <w:r>
+              <w:rPr>
+                <w:sz w:val="22"/>
+                <w:szCs w:val="22"/>
+                <w:lang w:val="en-US"/>
+              </w:rPr>
+              <w:t>Ký</w:t>
+            </w:r>
+            <w:proofErr w:type="spellEnd"/>
+            <w:r>
+              <w:rPr>
+                <w:sz w:val="22"/>
+                <w:szCs w:val="22"/>
+                <w:lang w:val="en-US"/>
+              </w:rPr>
+              <w:t xml:space="preserve"> </w:t>
+            </w:r>
+            <w:proofErr w:type="spellStart"/>
+            <w:r>
+              <w:rPr>
+                <w:sz w:val="22"/>
+                <w:szCs w:val="22"/>
+                <w:lang w:val="en-US"/>
+              </w:rPr>
+              <w:t>hiệu</w:t>
+            </w:r>
+            <w:proofErr w:type="spellEnd"/>
+            <w:r>
+              <w:rPr>
+                <w:sz w:val="22"/>
+                <w:szCs w:val="22"/>
+                <w:lang w:val="en-US"/>
+              </w:rPr>
+              <w:t xml:space="preserve"> </w:t>
+            </w:r>
+            <w:proofErr w:type="spellStart"/>
+            <w:r>
+              <w:rPr>
+                <w:sz w:val="22"/>
+                <w:szCs w:val="22"/>
+                <w:lang w:val="en-US"/>
+              </w:rPr>
+              <w:t>của</w:t>
+            </w:r>
+            <w:proofErr w:type="spellEnd"/>
+            <w:r>
+              <w:rPr>
+                <w:sz w:val="22"/>
+                <w:szCs w:val="22"/>
+                <w:lang w:val="en-US"/>
+              </w:rPr>
+              <w:t xml:space="preserve"> </w:t>
+            </w:r>
+            <w:proofErr w:type="spellStart"/>
             <w:r>
               <w:rPr>
                 <w:sz w:val="22"/>
@@ -2165,23 +4508,97 @@
                 <w:szCs w:val="22"/>
                 <w:lang w:val="en-US"/>
               </w:rPr>
-              <w:t xml:space="preserve">ời </w:t>
-            </w:r>
-            <w:r>
-              <w:rPr>
-                <w:sz w:val="22"/>
-                <w:szCs w:val="22"/>
-                <w:lang w:val="en-US"/>
-              </w:rPr>
-              <w:t>soạn thảo</w:t>
-            </w:r>
-            <w:r>
-              <w:rPr>
-                <w:sz w:val="22"/>
-                <w:szCs w:val="22"/>
-                <w:lang w:val="en-US"/>
-              </w:rPr>
-              <w:t xml:space="preserve"> và số l</w:t>
+              <w:t>ời</w:t>
+            </w:r>
+            <w:proofErr w:type="spellEnd"/>
+            <w:r>
+              <w:rPr>
+                <w:sz w:val="22"/>
+                <w:szCs w:val="22"/>
+                <w:lang w:val="en-US"/>
+              </w:rPr>
+              <w:t xml:space="preserve"> </w:t>
+            </w:r>
+            <w:proofErr w:type="spellStart"/>
+            <w:r>
+              <w:rPr>
+                <w:sz w:val="22"/>
+                <w:szCs w:val="22"/>
+                <w:lang w:val="en-US"/>
+              </w:rPr>
+              <w:t>soạn</w:t>
+            </w:r>
+            <w:proofErr w:type="spellEnd"/>
+            <w:r>
+              <w:rPr>
+                <w:sz w:val="22"/>
+                <w:szCs w:val="22"/>
+                <w:lang w:val="en-US"/>
+              </w:rPr>
+              <w:t xml:space="preserve"> </w:t>
+            </w:r>
+            <w:proofErr w:type="spellStart"/>
+            <w:r>
+              <w:rPr>
+                <w:sz w:val="22"/>
+                <w:szCs w:val="22"/>
+                <w:lang w:val="en-US"/>
+              </w:rPr>
+              <w:t>thảo</w:t>
+            </w:r>
+            <w:proofErr w:type="spellEnd"/>
+            <w:r>
+              <w:rPr>
+                <w:sz w:val="22"/>
+                <w:szCs w:val="22"/>
+                <w:lang w:val="en-US"/>
+              </w:rPr>
+              <w:t xml:space="preserve"> </w:t>
+            </w:r>
+            <w:proofErr w:type="spellStart"/>
+            <w:r>
+              <w:rPr>
+                <w:sz w:val="22"/>
+                <w:szCs w:val="22"/>
+                <w:lang w:val="en-US"/>
+              </w:rPr>
+              <w:t>và</w:t>
+            </w:r>
+            <w:proofErr w:type="spellEnd"/>
+            <w:r>
+              <w:rPr>
+                <w:sz w:val="22"/>
+                <w:szCs w:val="22"/>
+                <w:lang w:val="en-US"/>
+              </w:rPr>
+              <w:t xml:space="preserve"> </w:t>
+            </w:r>
+            <w:proofErr w:type="spellStart"/>
+            <w:r>
+              <w:rPr>
+                <w:sz w:val="22"/>
+                <w:szCs w:val="22"/>
+                <w:lang w:val="en-US"/>
+              </w:rPr>
+              <w:t>số</w:t>
+            </w:r>
+            <w:proofErr w:type="spellEnd"/>
+            <w:r>
+              <w:rPr>
+                <w:sz w:val="22"/>
+                <w:szCs w:val="22"/>
+                <w:lang w:val="en-US"/>
+              </w:rPr>
+              <w:t xml:space="preserve"> </w:t>
+            </w:r>
+            <w:proofErr w:type="spellStart"/>
+            <w:r>
+              <w:rPr>
+                <w:sz w:val="22"/>
+                <w:szCs w:val="22"/>
+                <w:lang w:val="en-US"/>
+              </w:rPr>
+              <w:t>l</w:t>
             </w:r>
             <w:r>
               <w:rPr>
@@ -2198,7 +4615,70 @@
                 <w:szCs w:val="22"/>
                 <w:lang w:val="en-US"/>
               </w:rPr>
-              <w:t>ợng bản phát hành.</w:t>
+              <w:t>ợng</w:t>
+            </w:r>
+            <w:proofErr w:type="spellEnd"/>
+            <w:r>
+              <w:rPr>
+                <w:sz w:val="22"/>
+                <w:szCs w:val="22"/>
+                <w:lang w:val="en-US"/>
+              </w:rPr>
+              <w:t xml:space="preserve"> </w:t>
+            </w:r>
+            <w:proofErr w:type="spellStart"/>
+            <w:r>
+              <w:rPr>
+                <w:sz w:val="22"/>
+                <w:szCs w:val="22"/>
+                <w:lang w:val="en-US"/>
+              </w:rPr>
+              <w:t>bản</w:t>
+            </w:r>
+            <w:proofErr w:type="spellEnd"/>
+            <w:r>
+              <w:rPr>
+                <w:sz w:val="22"/>
+                <w:szCs w:val="22"/>
+                <w:lang w:val="en-US"/>
+              </w:rPr>
+              <w:t xml:space="preserve"> </w:t>
+            </w:r>
+            <w:proofErr w:type="spellStart"/>
+            <w:r>
+              <w:rPr>
+                <w:sz w:val="22"/>
+                <w:szCs w:val="22"/>
+                <w:lang w:val="en-US"/>
+              </w:rPr>
+              <w:t>phát</w:t>
+            </w:r>
+            <w:proofErr w:type="spellEnd"/>
+            <w:r>
+              <w:rPr>
+                <w:sz w:val="22"/>
+                <w:szCs w:val="22"/>
+                <w:lang w:val="en-US"/>
+              </w:rPr>
+              <w:t xml:space="preserve"> </w:t>
+            </w:r>
+            <w:proofErr w:type="spellStart"/>
+            <w:r>
+              <w:rPr>
+                <w:sz w:val="22"/>
+                <w:szCs w:val="22"/>
+                <w:lang w:val="en-US"/>
+              </w:rPr>
+              <w:t>hành</w:t>
+            </w:r>
+            <w:proofErr w:type="spellEnd"/>
+            <w:r>
+              <w:rPr>
+                <w:sz w:val="22"/>
+                <w:szCs w:val="22"/>
+                <w:lang w:val="en-US"/>
+              </w:rPr>
+              <w:t>.</w:t>
             </w:r>
           </w:p>
           <w:p>
@@ -2229,8 +4709,41 @@
                 <w:sz w:val="22"/>
                 <w:szCs w:val="22"/>
               </w:rPr>
-              <w:t xml:space="preserve">) Ghi số </w:t>
-            </w:r>
+              <w:t xml:space="preserve">) </w:t>
+            </w:r>
+            <w:proofErr w:type="spellStart"/>
+            <w:r>
+              <w:rPr>
+                <w:sz w:val="22"/>
+                <w:szCs w:val="22"/>
+              </w:rPr>
+              <w:t>Ghi</w:t>
+            </w:r>
+            <w:proofErr w:type="spellEnd"/>
+            <w:r>
+              <w:rPr>
+                <w:sz w:val="22"/>
+                <w:szCs w:val="22"/>
+              </w:rPr>
+              <w:t xml:space="preserve"> </w:t>
+            </w:r>
+            <w:proofErr w:type="spellStart"/>
+            <w:r>
+              <w:rPr>
+                <w:sz w:val="22"/>
+                <w:szCs w:val="22"/>
+              </w:rPr>
+              <w:t>số</w:t>
+            </w:r>
+            <w:proofErr w:type="spellEnd"/>
+            <w:r>
+              <w:rPr>
+                <w:sz w:val="22"/>
+                <w:szCs w:val="22"/>
+              </w:rPr>
+              <w:t xml:space="preserve"> </w:t>
+            </w:r>
+            <w:proofErr w:type="spellStart"/>
             <w:r>
               <w:rPr>
                 <w:sz w:val="22"/>
@@ -2238,6 +4751,7 @@
               </w:rPr>
               <w:t>eOffice</w:t>
             </w:r>
+            <w:proofErr w:type="spellEnd"/>
             <w:r>
               <w:rPr>
                 <w:sz w:val="22"/>
@@ -2289,21 +4803,773 @@
                 <w:szCs w:val="22"/>
                 <w:lang w:val="en-US"/>
               </w:rPr>
-              <w:t xml:space="preserve">(Văn bản ký số): </w:t>
-            </w:r>
-            <w:r>
-              <w:rPr>
-                <w:rFonts w:eastAsiaTheme="minorHAnsi"/>
-                <w:sz w:val="22"/>
-                <w:szCs w:val="22"/>
-                <w:lang w:val="en-US"/>
-              </w:rPr>
-              <w:t xml:space="preserve">Là văn bản các Phòng chức năng được phân công soạn thảo trình Lãnh đạo ký số và phát hành trên eOffice gửi đến người nhận (không ký trên giấy và không gửi bản giấy). </w:t>
+              <w:t xml:space="preserve">(Văn </w:t>
+            </w:r>
+            <w:proofErr w:type="spellStart"/>
+            <w:r>
+              <w:rPr>
+                <w:rFonts w:eastAsiaTheme="minorHAnsi"/>
+                <w:sz w:val="22"/>
+                <w:szCs w:val="22"/>
+                <w:lang w:val="en-US"/>
+              </w:rPr>
+              <w:t>bản</w:t>
+            </w:r>
+            <w:proofErr w:type="spellEnd"/>
+            <w:r>
+              <w:rPr>
+                <w:rFonts w:eastAsiaTheme="minorHAnsi"/>
+                <w:sz w:val="22"/>
+                <w:szCs w:val="22"/>
+                <w:lang w:val="en-US"/>
+              </w:rPr>
+              <w:t xml:space="preserve"> </w:t>
+            </w:r>
+            <w:proofErr w:type="spellStart"/>
+            <w:r>
+              <w:rPr>
+                <w:rFonts w:eastAsiaTheme="minorHAnsi"/>
+                <w:sz w:val="22"/>
+                <w:szCs w:val="22"/>
+                <w:lang w:val="en-US"/>
+              </w:rPr>
+              <w:t>ký</w:t>
+            </w:r>
+            <w:proofErr w:type="spellEnd"/>
+            <w:r>
+              <w:rPr>
+                <w:rFonts w:eastAsiaTheme="minorHAnsi"/>
+                <w:sz w:val="22"/>
+                <w:szCs w:val="22"/>
+                <w:lang w:val="en-US"/>
+              </w:rPr>
+              <w:t xml:space="preserve"> </w:t>
+            </w:r>
+            <w:proofErr w:type="spellStart"/>
+            <w:r>
+              <w:rPr>
+                <w:rFonts w:eastAsiaTheme="minorHAnsi"/>
+                <w:sz w:val="22"/>
+                <w:szCs w:val="22"/>
+                <w:lang w:val="en-US"/>
+              </w:rPr>
+              <w:t>số</w:t>
+            </w:r>
+            <w:proofErr w:type="spellEnd"/>
+            <w:r>
+              <w:rPr>
+                <w:rFonts w:eastAsiaTheme="minorHAnsi"/>
+                <w:sz w:val="22"/>
+                <w:szCs w:val="22"/>
+                <w:lang w:val="en-US"/>
+              </w:rPr>
+              <w:t xml:space="preserve">): </w:t>
+            </w:r>
+            <w:proofErr w:type="spellStart"/>
+            <w:r>
+              <w:rPr>
+                <w:rFonts w:eastAsiaTheme="minorHAnsi"/>
+                <w:sz w:val="22"/>
+                <w:szCs w:val="22"/>
+                <w:lang w:val="en-US"/>
+              </w:rPr>
+              <w:t>Là</w:t>
+            </w:r>
+            <w:proofErr w:type="spellEnd"/>
+            <w:r>
+              <w:rPr>
+                <w:rFonts w:eastAsiaTheme="minorHAnsi"/>
+                <w:sz w:val="22"/>
+                <w:szCs w:val="22"/>
+                <w:lang w:val="en-US"/>
+              </w:rPr>
+              <w:t xml:space="preserve"> </w:t>
+            </w:r>
+            <w:proofErr w:type="spellStart"/>
+            <w:r>
+              <w:rPr>
+                <w:rFonts w:eastAsiaTheme="minorHAnsi"/>
+                <w:sz w:val="22"/>
+                <w:szCs w:val="22"/>
+                <w:lang w:val="en-US"/>
+              </w:rPr>
+              <w:t>văn</w:t>
+            </w:r>
+            <w:proofErr w:type="spellEnd"/>
+            <w:r>
+              <w:rPr>
+                <w:rFonts w:eastAsiaTheme="minorHAnsi"/>
+                <w:sz w:val="22"/>
+                <w:szCs w:val="22"/>
+                <w:lang w:val="en-US"/>
+              </w:rPr>
+              <w:t xml:space="preserve"> </w:t>
+            </w:r>
+            <w:proofErr w:type="spellStart"/>
+            <w:r>
+              <w:rPr>
+                <w:rFonts w:eastAsiaTheme="minorHAnsi"/>
+                <w:sz w:val="22"/>
+                <w:szCs w:val="22"/>
+                <w:lang w:val="en-US"/>
+              </w:rPr>
+              <w:t>bản</w:t>
+            </w:r>
+            <w:proofErr w:type="spellEnd"/>
+            <w:r>
+              <w:rPr>
+                <w:rFonts w:eastAsiaTheme="minorHAnsi"/>
+                <w:sz w:val="22"/>
+                <w:szCs w:val="22"/>
+                <w:lang w:val="en-US"/>
+              </w:rPr>
+              <w:t xml:space="preserve"> </w:t>
+            </w:r>
+            <w:proofErr w:type="spellStart"/>
+            <w:r>
+              <w:rPr>
+                <w:rFonts w:eastAsiaTheme="minorHAnsi"/>
+                <w:sz w:val="22"/>
+                <w:szCs w:val="22"/>
+                <w:lang w:val="en-US"/>
+              </w:rPr>
+              <w:t>các</w:t>
+            </w:r>
+            <w:proofErr w:type="spellEnd"/>
+            <w:r>
+              <w:rPr>
+                <w:rFonts w:eastAsiaTheme="minorHAnsi"/>
+                <w:sz w:val="22"/>
+                <w:szCs w:val="22"/>
+                <w:lang w:val="en-US"/>
+              </w:rPr>
+              <w:t xml:space="preserve"> </w:t>
+            </w:r>
+            <w:proofErr w:type="spellStart"/>
+            <w:r>
+              <w:rPr>
+                <w:rFonts w:eastAsiaTheme="minorHAnsi"/>
+                <w:sz w:val="22"/>
+                <w:szCs w:val="22"/>
+                <w:lang w:val="en-US"/>
+              </w:rPr>
+              <w:t>Phòng</w:t>
+            </w:r>
+            <w:proofErr w:type="spellEnd"/>
+            <w:r>
+              <w:rPr>
+                <w:rFonts w:eastAsiaTheme="minorHAnsi"/>
+                <w:sz w:val="22"/>
+                <w:szCs w:val="22"/>
+                <w:lang w:val="en-US"/>
+              </w:rPr>
+              <w:t xml:space="preserve"> </w:t>
+            </w:r>
+            <w:proofErr w:type="spellStart"/>
+            <w:r>
+              <w:rPr>
+                <w:rFonts w:eastAsiaTheme="minorHAnsi"/>
+                <w:sz w:val="22"/>
+                <w:szCs w:val="22"/>
+                <w:lang w:val="en-US"/>
+              </w:rPr>
+              <w:t>chức</w:t>
+            </w:r>
+            <w:proofErr w:type="spellEnd"/>
+            <w:r>
+              <w:rPr>
+                <w:rFonts w:eastAsiaTheme="minorHAnsi"/>
+                <w:sz w:val="22"/>
+                <w:szCs w:val="22"/>
+                <w:lang w:val="en-US"/>
+              </w:rPr>
+              <w:t xml:space="preserve"> </w:t>
+            </w:r>
+            <w:proofErr w:type="spellStart"/>
+            <w:r>
+              <w:rPr>
+                <w:rFonts w:eastAsiaTheme="minorHAnsi"/>
+                <w:sz w:val="22"/>
+                <w:szCs w:val="22"/>
+                <w:lang w:val="en-US"/>
+              </w:rPr>
+              <w:t>năng</w:t>
+            </w:r>
+            <w:proofErr w:type="spellEnd"/>
+            <w:r>
+              <w:rPr>
+                <w:rFonts w:eastAsiaTheme="minorHAnsi"/>
+                <w:sz w:val="22"/>
+                <w:szCs w:val="22"/>
+                <w:lang w:val="en-US"/>
+              </w:rPr>
+              <w:t xml:space="preserve"> </w:t>
+            </w:r>
+            <w:proofErr w:type="spellStart"/>
+            <w:r>
+              <w:rPr>
+                <w:rFonts w:eastAsiaTheme="minorHAnsi"/>
+                <w:sz w:val="22"/>
+                <w:szCs w:val="22"/>
+                <w:lang w:val="en-US"/>
+              </w:rPr>
+              <w:t>được</w:t>
+            </w:r>
+            <w:proofErr w:type="spellEnd"/>
+            <w:r>
+              <w:rPr>
+                <w:rFonts w:eastAsiaTheme="minorHAnsi"/>
+                <w:sz w:val="22"/>
+                <w:szCs w:val="22"/>
+                <w:lang w:val="en-US"/>
+              </w:rPr>
+              <w:t xml:space="preserve"> </w:t>
+            </w:r>
+            <w:proofErr w:type="spellStart"/>
+            <w:r>
+              <w:rPr>
+                <w:rFonts w:eastAsiaTheme="minorHAnsi"/>
+                <w:sz w:val="22"/>
+                <w:szCs w:val="22"/>
+                <w:lang w:val="en-US"/>
+              </w:rPr>
+              <w:t>phân</w:t>
+            </w:r>
+            <w:proofErr w:type="spellEnd"/>
+            <w:r>
+              <w:rPr>
+                <w:rFonts w:eastAsiaTheme="minorHAnsi"/>
+                <w:sz w:val="22"/>
+                <w:szCs w:val="22"/>
+                <w:lang w:val="en-US"/>
+              </w:rPr>
+              <w:t xml:space="preserve"> </w:t>
+            </w:r>
+            <w:proofErr w:type="spellStart"/>
+            <w:r>
+              <w:rPr>
+                <w:rFonts w:eastAsiaTheme="minorHAnsi"/>
+                <w:sz w:val="22"/>
+                <w:szCs w:val="22"/>
+                <w:lang w:val="en-US"/>
+              </w:rPr>
+              <w:t>công</w:t>
+            </w:r>
+            <w:proofErr w:type="spellEnd"/>
+            <w:r>
+              <w:rPr>
+                <w:rFonts w:eastAsiaTheme="minorHAnsi"/>
+                <w:sz w:val="22"/>
+                <w:szCs w:val="22"/>
+                <w:lang w:val="en-US"/>
+              </w:rPr>
+              <w:t xml:space="preserve"> </w:t>
+            </w:r>
+            <w:proofErr w:type="spellStart"/>
+            <w:r>
+              <w:rPr>
+                <w:rFonts w:eastAsiaTheme="minorHAnsi"/>
+                <w:sz w:val="22"/>
+                <w:szCs w:val="22"/>
+                <w:lang w:val="en-US"/>
+              </w:rPr>
+              <w:t>soạn</w:t>
+            </w:r>
+            <w:proofErr w:type="spellEnd"/>
+            <w:r>
+              <w:rPr>
+                <w:rFonts w:eastAsiaTheme="minorHAnsi"/>
+                <w:sz w:val="22"/>
+                <w:szCs w:val="22"/>
+                <w:lang w:val="en-US"/>
+              </w:rPr>
+              <w:t xml:space="preserve"> </w:t>
+            </w:r>
+            <w:proofErr w:type="spellStart"/>
+            <w:r>
+              <w:rPr>
+                <w:rFonts w:eastAsiaTheme="minorHAnsi"/>
+                <w:sz w:val="22"/>
+                <w:szCs w:val="22"/>
+                <w:lang w:val="en-US"/>
+              </w:rPr>
+              <w:t>thảo</w:t>
+            </w:r>
+            <w:proofErr w:type="spellEnd"/>
+            <w:r>
+              <w:rPr>
+                <w:rFonts w:eastAsiaTheme="minorHAnsi"/>
+                <w:sz w:val="22"/>
+                <w:szCs w:val="22"/>
+                <w:lang w:val="en-US"/>
+              </w:rPr>
+              <w:t xml:space="preserve"> </w:t>
+            </w:r>
+            <w:proofErr w:type="spellStart"/>
+            <w:r>
+              <w:rPr>
+                <w:rFonts w:eastAsiaTheme="minorHAnsi"/>
+                <w:sz w:val="22"/>
+                <w:szCs w:val="22"/>
+                <w:lang w:val="en-US"/>
+              </w:rPr>
+              <w:t>trình</w:t>
+            </w:r>
+            <w:proofErr w:type="spellEnd"/>
+            <w:r>
+              <w:rPr>
+                <w:rFonts w:eastAsiaTheme="minorHAnsi"/>
+                <w:sz w:val="22"/>
+                <w:szCs w:val="22"/>
+                <w:lang w:val="en-US"/>
+              </w:rPr>
+              <w:t xml:space="preserve"> </w:t>
+            </w:r>
+            <w:proofErr w:type="spellStart"/>
+            <w:r>
+              <w:rPr>
+                <w:rFonts w:eastAsiaTheme="minorHAnsi"/>
+                <w:sz w:val="22"/>
+                <w:szCs w:val="22"/>
+                <w:lang w:val="en-US"/>
+              </w:rPr>
+              <w:t>Lãnh</w:t>
+            </w:r>
+            <w:proofErr w:type="spellEnd"/>
+            <w:r>
+              <w:rPr>
+                <w:rFonts w:eastAsiaTheme="minorHAnsi"/>
+                <w:sz w:val="22"/>
+                <w:szCs w:val="22"/>
+                <w:lang w:val="en-US"/>
+              </w:rPr>
+              <w:t xml:space="preserve"> </w:t>
+            </w:r>
+            <w:proofErr w:type="spellStart"/>
+            <w:r>
+              <w:rPr>
+                <w:rFonts w:eastAsiaTheme="minorHAnsi"/>
+                <w:sz w:val="22"/>
+                <w:szCs w:val="22"/>
+                <w:lang w:val="en-US"/>
+              </w:rPr>
+              <w:t>đạo</w:t>
+            </w:r>
+            <w:proofErr w:type="spellEnd"/>
+            <w:r>
+              <w:rPr>
+                <w:rFonts w:eastAsiaTheme="minorHAnsi"/>
+                <w:sz w:val="22"/>
+                <w:szCs w:val="22"/>
+                <w:lang w:val="en-US"/>
+              </w:rPr>
+              <w:t xml:space="preserve"> </w:t>
+            </w:r>
+            <w:proofErr w:type="spellStart"/>
+            <w:r>
+              <w:rPr>
+                <w:rFonts w:eastAsiaTheme="minorHAnsi"/>
+                <w:sz w:val="22"/>
+                <w:szCs w:val="22"/>
+                <w:lang w:val="en-US"/>
+              </w:rPr>
+              <w:t>ký</w:t>
+            </w:r>
+            <w:proofErr w:type="spellEnd"/>
+            <w:r>
+              <w:rPr>
+                <w:rFonts w:eastAsiaTheme="minorHAnsi"/>
+                <w:sz w:val="22"/>
+                <w:szCs w:val="22"/>
+                <w:lang w:val="en-US"/>
+              </w:rPr>
+              <w:t xml:space="preserve"> </w:t>
+            </w:r>
+            <w:proofErr w:type="spellStart"/>
+            <w:r>
+              <w:rPr>
+                <w:rFonts w:eastAsiaTheme="minorHAnsi"/>
+                <w:sz w:val="22"/>
+                <w:szCs w:val="22"/>
+                <w:lang w:val="en-US"/>
+              </w:rPr>
+              <w:t>số</w:t>
+            </w:r>
+            <w:proofErr w:type="spellEnd"/>
+            <w:r>
+              <w:rPr>
+                <w:rFonts w:eastAsiaTheme="minorHAnsi"/>
+                <w:sz w:val="22"/>
+                <w:szCs w:val="22"/>
+                <w:lang w:val="en-US"/>
+              </w:rPr>
+              <w:t xml:space="preserve"> </w:t>
+            </w:r>
+            <w:proofErr w:type="spellStart"/>
+            <w:r>
+              <w:rPr>
+                <w:rFonts w:eastAsiaTheme="minorHAnsi"/>
+                <w:sz w:val="22"/>
+                <w:szCs w:val="22"/>
+                <w:lang w:val="en-US"/>
+              </w:rPr>
+              <w:t>và</w:t>
+            </w:r>
+            <w:proofErr w:type="spellEnd"/>
+            <w:r>
+              <w:rPr>
+                <w:rFonts w:eastAsiaTheme="minorHAnsi"/>
+                <w:sz w:val="22"/>
+                <w:szCs w:val="22"/>
+                <w:lang w:val="en-US"/>
+              </w:rPr>
+              <w:t xml:space="preserve"> </w:t>
+            </w:r>
+            <w:proofErr w:type="spellStart"/>
+            <w:r>
+              <w:rPr>
+                <w:rFonts w:eastAsiaTheme="minorHAnsi"/>
+                <w:sz w:val="22"/>
+                <w:szCs w:val="22"/>
+                <w:lang w:val="en-US"/>
+              </w:rPr>
+              <w:t>phát</w:t>
+            </w:r>
+            <w:proofErr w:type="spellEnd"/>
+            <w:r>
+              <w:rPr>
+                <w:rFonts w:eastAsiaTheme="minorHAnsi"/>
+                <w:sz w:val="22"/>
+                <w:szCs w:val="22"/>
+                <w:lang w:val="en-US"/>
+              </w:rPr>
+              <w:t xml:space="preserve"> </w:t>
+            </w:r>
+            <w:proofErr w:type="spellStart"/>
+            <w:r>
+              <w:rPr>
+                <w:rFonts w:eastAsiaTheme="minorHAnsi"/>
+                <w:sz w:val="22"/>
+                <w:szCs w:val="22"/>
+                <w:lang w:val="en-US"/>
+              </w:rPr>
+              <w:t>hành</w:t>
+            </w:r>
+            <w:proofErr w:type="spellEnd"/>
+            <w:r>
+              <w:rPr>
+                <w:rFonts w:eastAsiaTheme="minorHAnsi"/>
+                <w:sz w:val="22"/>
+                <w:szCs w:val="22"/>
+                <w:lang w:val="en-US"/>
+              </w:rPr>
+              <w:t xml:space="preserve"> </w:t>
+            </w:r>
+            <w:proofErr w:type="spellStart"/>
+            <w:r>
+              <w:rPr>
+                <w:rFonts w:eastAsiaTheme="minorHAnsi"/>
+                <w:sz w:val="22"/>
+                <w:szCs w:val="22"/>
+                <w:lang w:val="en-US"/>
+              </w:rPr>
+              <w:t>trên</w:t>
+            </w:r>
+            <w:proofErr w:type="spellEnd"/>
+            <w:r>
+              <w:rPr>
+                <w:rFonts w:eastAsiaTheme="minorHAnsi"/>
+                <w:sz w:val="22"/>
+                <w:szCs w:val="22"/>
+                <w:lang w:val="en-US"/>
+              </w:rPr>
+              <w:t xml:space="preserve"> </w:t>
+            </w:r>
+            <w:proofErr w:type="spellStart"/>
+            <w:r>
+              <w:rPr>
+                <w:rFonts w:eastAsiaTheme="minorHAnsi"/>
+                <w:sz w:val="22"/>
+                <w:szCs w:val="22"/>
+                <w:lang w:val="en-US"/>
+              </w:rPr>
+              <w:t>eOffice</w:t>
+            </w:r>
+            <w:proofErr w:type="spellEnd"/>
+            <w:r>
+              <w:rPr>
+                <w:rFonts w:eastAsiaTheme="minorHAnsi"/>
+                <w:sz w:val="22"/>
+                <w:szCs w:val="22"/>
+                <w:lang w:val="en-US"/>
+              </w:rPr>
+              <w:t xml:space="preserve"> </w:t>
+            </w:r>
+            <w:proofErr w:type="spellStart"/>
+            <w:r>
+              <w:rPr>
+                <w:rFonts w:eastAsiaTheme="minorHAnsi"/>
+                <w:sz w:val="22"/>
+                <w:szCs w:val="22"/>
+                <w:lang w:val="en-US"/>
+              </w:rPr>
+              <w:t>gửi</w:t>
+            </w:r>
+            <w:proofErr w:type="spellEnd"/>
+            <w:r>
+              <w:rPr>
+                <w:rFonts w:eastAsiaTheme="minorHAnsi"/>
+                <w:sz w:val="22"/>
+                <w:szCs w:val="22"/>
+                <w:lang w:val="en-US"/>
+              </w:rPr>
+              <w:t xml:space="preserve"> </w:t>
+            </w:r>
+            <w:proofErr w:type="spellStart"/>
+            <w:r>
+              <w:rPr>
+                <w:rFonts w:eastAsiaTheme="minorHAnsi"/>
+                <w:sz w:val="22"/>
+                <w:szCs w:val="22"/>
+                <w:lang w:val="en-US"/>
+              </w:rPr>
+              <w:t>đến</w:t>
+            </w:r>
+            <w:proofErr w:type="spellEnd"/>
+            <w:r>
+              <w:rPr>
+                <w:rFonts w:eastAsiaTheme="minorHAnsi"/>
+                <w:sz w:val="22"/>
+                <w:szCs w:val="22"/>
+                <w:lang w:val="en-US"/>
+              </w:rPr>
+              <w:t xml:space="preserve"> </w:t>
+            </w:r>
+            <w:proofErr w:type="spellStart"/>
+            <w:r>
+              <w:rPr>
+                <w:rFonts w:eastAsiaTheme="minorHAnsi"/>
+                <w:sz w:val="22"/>
+                <w:szCs w:val="22"/>
+                <w:lang w:val="en-US"/>
+              </w:rPr>
+              <w:t>người</w:t>
+            </w:r>
+            <w:proofErr w:type="spellEnd"/>
+            <w:r>
+              <w:rPr>
+                <w:rFonts w:eastAsiaTheme="minorHAnsi"/>
+                <w:sz w:val="22"/>
+                <w:szCs w:val="22"/>
+                <w:lang w:val="en-US"/>
+              </w:rPr>
+              <w:t xml:space="preserve"> </w:t>
+            </w:r>
+            <w:proofErr w:type="spellStart"/>
+            <w:r>
+              <w:rPr>
+                <w:rFonts w:eastAsiaTheme="minorHAnsi"/>
+                <w:sz w:val="22"/>
+                <w:szCs w:val="22"/>
+                <w:lang w:val="en-US"/>
+              </w:rPr>
+              <w:t>nhận</w:t>
+            </w:r>
+            <w:proofErr w:type="spellEnd"/>
+            <w:r>
+              <w:rPr>
+                <w:rFonts w:eastAsiaTheme="minorHAnsi"/>
+                <w:sz w:val="22"/>
+                <w:szCs w:val="22"/>
+                <w:lang w:val="en-US"/>
+              </w:rPr>
+              <w:t xml:space="preserve"> (</w:t>
+            </w:r>
+            <w:proofErr w:type="spellStart"/>
+            <w:r>
+              <w:rPr>
+                <w:rFonts w:eastAsiaTheme="minorHAnsi"/>
+                <w:sz w:val="22"/>
+                <w:szCs w:val="22"/>
+                <w:lang w:val="en-US"/>
+              </w:rPr>
+              <w:t>không</w:t>
+            </w:r>
+            <w:proofErr w:type="spellEnd"/>
+            <w:r>
+              <w:rPr>
+                <w:rFonts w:eastAsiaTheme="minorHAnsi"/>
+                <w:sz w:val="22"/>
+                <w:szCs w:val="22"/>
+                <w:lang w:val="en-US"/>
+              </w:rPr>
+              <w:t xml:space="preserve"> </w:t>
+            </w:r>
+            <w:proofErr w:type="spellStart"/>
+            <w:r>
+              <w:rPr>
+                <w:rFonts w:eastAsiaTheme="minorHAnsi"/>
+                <w:sz w:val="22"/>
+                <w:szCs w:val="22"/>
+                <w:lang w:val="en-US"/>
+              </w:rPr>
+              <w:t>ký</w:t>
+            </w:r>
+            <w:proofErr w:type="spellEnd"/>
+            <w:r>
+              <w:rPr>
+                <w:rFonts w:eastAsiaTheme="minorHAnsi"/>
+                <w:sz w:val="22"/>
+                <w:szCs w:val="22"/>
+                <w:lang w:val="en-US"/>
+              </w:rPr>
+              <w:t xml:space="preserve"> </w:t>
+            </w:r>
+            <w:proofErr w:type="spellStart"/>
+            <w:r>
+              <w:rPr>
+                <w:rFonts w:eastAsiaTheme="minorHAnsi"/>
+                <w:sz w:val="22"/>
+                <w:szCs w:val="22"/>
+                <w:lang w:val="en-US"/>
+              </w:rPr>
+              <w:t>trên</w:t>
+            </w:r>
+            <w:proofErr w:type="spellEnd"/>
+            <w:r>
+              <w:rPr>
+                <w:rFonts w:eastAsiaTheme="minorHAnsi"/>
+                <w:sz w:val="22"/>
+                <w:szCs w:val="22"/>
+                <w:lang w:val="en-US"/>
+              </w:rPr>
+              <w:t xml:space="preserve"> </w:t>
+            </w:r>
+            <w:proofErr w:type="spellStart"/>
+            <w:r>
+              <w:rPr>
+                <w:rFonts w:eastAsiaTheme="minorHAnsi"/>
+                <w:sz w:val="22"/>
+                <w:szCs w:val="22"/>
+                <w:lang w:val="en-US"/>
+              </w:rPr>
+              <w:t>giấy</w:t>
+            </w:r>
+            <w:proofErr w:type="spellEnd"/>
+            <w:r>
+              <w:rPr>
+                <w:rFonts w:eastAsiaTheme="minorHAnsi"/>
+                <w:sz w:val="22"/>
+                <w:szCs w:val="22"/>
+                <w:lang w:val="en-US"/>
+              </w:rPr>
+              <w:t xml:space="preserve"> </w:t>
+            </w:r>
+            <w:proofErr w:type="spellStart"/>
+            <w:r>
+              <w:rPr>
+                <w:rFonts w:eastAsiaTheme="minorHAnsi"/>
+                <w:sz w:val="22"/>
+                <w:szCs w:val="22"/>
+                <w:lang w:val="en-US"/>
+              </w:rPr>
+              <w:t>và</w:t>
+            </w:r>
+            <w:proofErr w:type="spellEnd"/>
+            <w:r>
+              <w:rPr>
+                <w:rFonts w:eastAsiaTheme="minorHAnsi"/>
+                <w:sz w:val="22"/>
+                <w:szCs w:val="22"/>
+                <w:lang w:val="en-US"/>
+              </w:rPr>
+              <w:t xml:space="preserve"> </w:t>
+            </w:r>
+            <w:proofErr w:type="spellStart"/>
+            <w:r>
+              <w:rPr>
+                <w:rFonts w:eastAsiaTheme="minorHAnsi"/>
+                <w:sz w:val="22"/>
+                <w:szCs w:val="22"/>
+                <w:lang w:val="en-US"/>
+              </w:rPr>
+              <w:t>không</w:t>
+            </w:r>
+            <w:proofErr w:type="spellEnd"/>
+            <w:r>
+              <w:rPr>
+                <w:rFonts w:eastAsiaTheme="minorHAnsi"/>
+                <w:sz w:val="22"/>
+                <w:szCs w:val="22"/>
+                <w:lang w:val="en-US"/>
+              </w:rPr>
+              <w:t xml:space="preserve"> </w:t>
+            </w:r>
+            <w:proofErr w:type="spellStart"/>
+            <w:r>
+              <w:rPr>
+                <w:rFonts w:eastAsiaTheme="minorHAnsi"/>
+                <w:sz w:val="22"/>
+                <w:szCs w:val="22"/>
+                <w:lang w:val="en-US"/>
+              </w:rPr>
+              <w:t>gửi</w:t>
+            </w:r>
+            <w:proofErr w:type="spellEnd"/>
+            <w:r>
+              <w:rPr>
+                <w:rFonts w:eastAsiaTheme="minorHAnsi"/>
+                <w:sz w:val="22"/>
+                <w:szCs w:val="22"/>
+                <w:lang w:val="en-US"/>
+              </w:rPr>
+              <w:t xml:space="preserve"> </w:t>
+            </w:r>
+            <w:proofErr w:type="spellStart"/>
+            <w:r>
+              <w:rPr>
+                <w:rFonts w:eastAsiaTheme="minorHAnsi"/>
+                <w:sz w:val="22"/>
+                <w:szCs w:val="22"/>
+                <w:lang w:val="en-US"/>
+              </w:rPr>
+              <w:t>bản</w:t>
+            </w:r>
+            <w:proofErr w:type="spellEnd"/>
+            <w:r>
+              <w:rPr>
+                <w:rFonts w:eastAsiaTheme="minorHAnsi"/>
+                <w:sz w:val="22"/>
+                <w:szCs w:val="22"/>
+                <w:lang w:val="en-US"/>
+              </w:rPr>
+              <w:t xml:space="preserve"> </w:t>
+            </w:r>
+            <w:proofErr w:type="spellStart"/>
+            <w:r>
+              <w:rPr>
+                <w:rFonts w:eastAsiaTheme="minorHAnsi"/>
+                <w:sz w:val="22"/>
+                <w:szCs w:val="22"/>
+                <w:lang w:val="en-US"/>
+              </w:rPr>
+              <w:t>giấy</w:t>
+            </w:r>
+            <w:proofErr w:type="spellEnd"/>
+            <w:r>
+              <w:rPr>
+                <w:rFonts w:eastAsiaTheme="minorHAnsi"/>
+                <w:sz w:val="22"/>
+                <w:szCs w:val="22"/>
+                <w:lang w:val="en-US"/>
+              </w:rPr>
+              <w:t xml:space="preserve">). </w:t>
             </w:r>
           </w:p>
         </w:tc>
       </w:tr>
     </w:tbl>
+    <w:p/>
     <w:sectPr>
       <w:headerReference w:type="default" r:id="rId7"/>
       <w:footerReference w:type="even" r:id="rId8"/>
@@ -2319,7 +5585,7 @@
 </file>
 
 <file path=word/endnotes.xml><?xml version="1.0" encoding="utf-8"?>
-<w:endnotes xmlns:wpc="http://schemas.microsoft.com/office/word/2010/wordprocessingCanvas" xmlns:cx="http://schemas.microsoft.com/office/drawing/2014/chartex" xmlns:cx1="http://schemas.microsoft.com/office/drawing/2015/9/8/chartex" xmlns:cx2="http://schemas.microsoft.com/office/drawing/2015/10/21/chartex" xmlns:cx3="http://schemas.microsoft.com/office/drawing/2016/5/9/chartex" xmlns:cx4="http://schemas.microsoft.com/office/drawing/2016/5/10/chartex" xmlns:cx5="http://schemas.microsoft.com/office/drawing/2016/5/11/chartex" xmlns:cx6="http://schemas.microsoft.com/office/drawing/2016/5/12/chartex" xmlns:cx7="http://schemas.microsoft.com/office/drawing/2016/5/13/chartex" xmlns:cx8="http://schemas.microsoft.com/office/drawing/2016/5/14/chartex" xmlns:mc="http://schemas.openxmlformats.org/markup-compatibility/2006" xmlns:aink="http://schemas.microsoft.com/office/drawing/2016/ink" xmlns:am3d="http://schemas.microsoft.com/office/drawing/2017/model3d" xmlns:o="urn:schemas-microsoft-com:office:office" xmlns:oel="http://schemas.microsoft.com/office/2019/extlst" xmlns:r="http://schemas.openxmlformats.org/officeDocument/2006/relationships" xmlns:m="http://schemas.openxmlformats.org/officeDocument/2006/math" xmlns:v="urn:schemas-microsoft-com:vml" xmlns:wp14="http://schemas.microsoft.com/office/word/2010/wordprocessingDrawing" xmlns:wp="http://schemas.openxmlformats.org/drawingml/2006/wordprocessingDrawing" xmlns:w10="urn:schemas-microsoft-com:office:word" xmlns:w="http://schemas.openxmlformats.org/wordprocessingml/2006/main" xmlns:w14="http://schemas.microsoft.com/office/word/2010/wordml" xmlns:w15="http://schemas.microsoft.com/office/word/2012/wordml" xmlns:w16cex="http://schemas.microsoft.com/office/word/2018/wordml/cex" xmlns:w16cid="http://schemas.microsoft.com/office/word/2016/wordml/cid" xmlns:w16="http://schemas.microsoft.com/office/word/2018/wordml" xmlns:w16du="http://schemas.microsoft.com/office/word/2023/wordml/word16du" xmlns:w16sdtdh="http://schemas.microsoft.com/office/word/2020/wordml/sdtdatahash" xmlns:w16sdtfl="http://schemas.microsoft.com/office/word/2024/wordml/sdtformatlock" xmlns:w16se="http://schemas.microsoft.com/office/word/2015/wordml/symex" xmlns:wpg="http://schemas.microsoft.com/office/word/2010/wordprocessingGroup" xmlns:wpi="http://schemas.microsoft.com/office/word/2010/wordprocessingInk" xmlns:wne="http://schemas.microsoft.com/office/word/2006/wordml" xmlns:wps="http://schemas.microsoft.com/office/word/2010/wordprocessingShape" mc:Ignorable="w14 w15 w16se w16cid w16 w16cex w16sdtdh w16sdtfl w16du wp14">
+<w:endnotes xmlns:wpc="http://schemas.microsoft.com/office/word/2010/wordprocessingCanvas" xmlns:cx="http://schemas.microsoft.com/office/drawing/2014/chartex" xmlns:cx1="http://schemas.microsoft.com/office/drawing/2015/9/8/chartex" xmlns:cx2="http://schemas.microsoft.com/office/drawing/2015/10/21/chartex" xmlns:cx3="http://schemas.microsoft.com/office/drawing/2016/5/9/chartex" xmlns:cx4="http://schemas.microsoft.com/office/drawing/2016/5/10/chartex" xmlns:cx5="http://schemas.microsoft.com/office/drawing/2016/5/11/chartex" xmlns:cx6="http://schemas.microsoft.com/office/drawing/2016/5/12/chartex" xmlns:cx7="http://schemas.microsoft.com/office/drawing/2016/5/13/chartex" xmlns:cx8="http://schemas.microsoft.com/office/drawing/2016/5/14/chartex" xmlns:mc="http://schemas.openxmlformats.org/markup-compatibility/2006" xmlns:aink="http://schemas.microsoft.com/office/drawing/2016/ink" xmlns:am3d="http://schemas.microsoft.com/office/drawing/2017/model3d" xmlns:o="urn:schemas-microsoft-com:office:office" xmlns:oel="http://schemas.microsoft.com/office/2019/extlst" xmlns:r="http://schemas.openxmlformats.org/officeDocument/2006/relationships" xmlns:m="http://schemas.openxmlformats.org/officeDocument/2006/math" xmlns:v="urn:schemas-microsoft-com:vml" xmlns:wp14="http://schemas.microsoft.com/office/word/2010/wordprocessingDrawing" xmlns:wp="http://schemas.openxmlformats.org/drawingml/2006/wordprocessingDrawing" xmlns:w10="urn:schemas-microsoft-com:office:word" xmlns:w="http://schemas.openxmlformats.org/wordprocessingml/2006/main" xmlns:w14="http://schemas.microsoft.com/office/word/2010/wordml" xmlns:w15="http://schemas.microsoft.com/office/word/2012/wordml" xmlns:w16cei="http://schemas.microsoft.com/office/word/2026/wordml/cei" xmlns:w16cex="http://schemas.microsoft.com/office/word/2018/wordml/cex" xmlns:w16cid="http://schemas.microsoft.com/office/word/2016/wordml/cid" xmlns:w16="http://schemas.microsoft.com/office/word/2018/wordml" xmlns:w16du="http://schemas.microsoft.com/office/word/2023/wordml/word16du" xmlns:w16sdtdh="http://schemas.microsoft.com/office/word/2020/wordml/sdtdatahash" xmlns:w16sdtfl="http://schemas.microsoft.com/office/word/2024/wordml/sdtformatlock" xmlns:w16se="http://schemas.microsoft.com/office/word/2015/wordml/symex" xmlns:wpg="http://schemas.microsoft.com/office/word/2010/wordprocessingGroup" xmlns:wpi="http://schemas.microsoft.com/office/word/2010/wordprocessingInk" xmlns:wne="http://schemas.microsoft.com/office/word/2006/wordml" xmlns:wps="http://schemas.microsoft.com/office/word/2010/wordprocessingShape" mc:Ignorable="w14 w15 w16se w16cid w16 w16cex w16sdtdh w16sdtfl w16du wp14">
   <w:endnote w:type="separator" w:id="-1">
     <w:p>
       <w:r>
@@ -2338,7 +5604,7 @@
 </file>
 
 <file path=word/footer1.xml><?xml version="1.0" encoding="utf-8"?>
-<w:ftr xmlns:wpc="http://schemas.microsoft.com/office/word/2010/wordprocessingCanvas" xmlns:cx="http://schemas.microsoft.com/office/drawing/2014/chartex" xmlns:cx1="http://schemas.microsoft.com/office/drawing/2015/9/8/chartex" xmlns:cx2="http://schemas.microsoft.com/office/drawing/2015/10/21/chartex" xmlns:cx3="http://schemas.microsoft.com/office/drawing/2016/5/9/chartex" xmlns:cx4="http://schemas.microsoft.com/office/drawing/2016/5/10/chartex" xmlns:cx5="http://schemas.microsoft.com/office/drawing/2016/5/11/chartex" xmlns:cx6="http://schemas.microsoft.com/office/drawing/2016/5/12/chartex" xmlns:cx7="http://schemas.microsoft.com/office/drawing/2016/5/13/chartex" xmlns:cx8="http://schemas.microsoft.com/office/drawing/2016/5/14/chartex" xmlns:mc="http://schemas.openxmlformats.org/markup-compatibility/2006" xmlns:aink="http://schemas.microsoft.com/office/drawing/2016/ink" xmlns:am3d="http://schemas.microsoft.com/office/drawing/2017/model3d" xmlns:o="urn:schemas-microsoft-com:office:office" xmlns:oel="http://schemas.microsoft.com/office/2019/extlst" xmlns:r="http://schemas.openxmlformats.org/officeDocument/2006/relationships" xmlns:m="http://schemas.openxmlformats.org/officeDocument/2006/math" xmlns:v="urn:schemas-microsoft-com:vml" xmlns:wp14="http://schemas.microsoft.com/office/word/2010/wordprocessingDrawing" xmlns:wp="http://schemas.openxmlformats.org/drawingml/2006/wordprocessingDrawing" xmlns:w10="urn:schemas-microsoft-com:office:word" xmlns:w="http://schemas.openxmlformats.org/wordprocessingml/2006/main" xmlns:w14="http://schemas.microsoft.com/office/word/2010/wordml" xmlns:w15="http://schemas.microsoft.com/office/word/2012/wordml" xmlns:w16cex="http://schemas.microsoft.com/office/word/2018/wordml/cex" xmlns:w16cid="http://schemas.microsoft.com/office/word/2016/wordml/cid" xmlns:w16="http://schemas.microsoft.com/office/word/2018/wordml" xmlns:w16du="http://schemas.microsoft.com/office/word/2023/wordml/word16du" xmlns:w16sdtdh="http://schemas.microsoft.com/office/word/2020/wordml/sdtdatahash" xmlns:w16sdtfl="http://schemas.microsoft.com/office/word/2024/wordml/sdtformatlock" xmlns:w16se="http://schemas.microsoft.com/office/word/2015/wordml/symex" xmlns:wpg="http://schemas.microsoft.com/office/word/2010/wordprocessingGroup" xmlns:wpi="http://schemas.microsoft.com/office/word/2010/wordprocessingInk" xmlns:wne="http://schemas.microsoft.com/office/word/2006/wordml" xmlns:wps="http://schemas.microsoft.com/office/word/2010/wordprocessingShape" mc:Ignorable="w14 w15 w16se w16cid w16 w16cex w16sdtdh w16sdtfl w16du wp14">
+<w:ftr xmlns:wpc="http://schemas.microsoft.com/office/word/2010/wordprocessingCanvas" xmlns:cx="http://schemas.microsoft.com/office/drawing/2014/chartex" xmlns:cx1="http://schemas.microsoft.com/office/drawing/2015/9/8/chartex" xmlns:cx2="http://schemas.microsoft.com/office/drawing/2015/10/21/chartex" xmlns:cx3="http://schemas.microsoft.com/office/drawing/2016/5/9/chartex" xmlns:cx4="http://schemas.microsoft.com/office/drawing/2016/5/10/chartex" xmlns:cx5="http://schemas.microsoft.com/office/drawing/2016/5/11/chartex" xmlns:cx6="http://schemas.microsoft.com/office/drawing/2016/5/12/chartex" xmlns:cx7="http://schemas.microsoft.com/office/drawing/2016/5/13/chartex" xmlns:cx8="http://schemas.microsoft.com/office/drawing/2016/5/14/chartex" xmlns:mc="http://schemas.openxmlformats.org/markup-compatibility/2006" xmlns:aink="http://schemas.microsoft.com/office/drawing/2016/ink" xmlns:am3d="http://schemas.microsoft.com/office/drawing/2017/model3d" xmlns:o="urn:schemas-microsoft-com:office:office" xmlns:oel="http://schemas.microsoft.com/office/2019/extlst" xmlns:r="http://schemas.openxmlformats.org/officeDocument/2006/relationships" xmlns:m="http://schemas.openxmlformats.org/officeDocument/2006/math" xmlns:v="urn:schemas-microsoft-com:vml" xmlns:wp14="http://schemas.microsoft.com/office/word/2010/wordprocessingDrawing" xmlns:wp="http://schemas.openxmlformats.org/drawingml/2006/wordprocessingDrawing" xmlns:w10="urn:schemas-microsoft-com:office:word" xmlns:w="http://schemas.openxmlformats.org/wordprocessingml/2006/main" xmlns:w14="http://schemas.microsoft.com/office/word/2010/wordml" xmlns:w15="http://schemas.microsoft.com/office/word/2012/wordml" xmlns:w16cei="http://schemas.microsoft.com/office/word/2026/wordml/cei" xmlns:w16cex="http://schemas.microsoft.com/office/word/2018/wordml/cex" xmlns:w16cid="http://schemas.microsoft.com/office/word/2016/wordml/cid" xmlns:w16="http://schemas.microsoft.com/office/word/2018/wordml" xmlns:w16du="http://schemas.microsoft.com/office/word/2023/wordml/word16du" xmlns:w16sdtdh="http://schemas.microsoft.com/office/word/2020/wordml/sdtdatahash" xmlns:w16sdtfl="http://schemas.microsoft.com/office/word/2024/wordml/sdtformatlock" xmlns:w16se="http://schemas.microsoft.com/office/word/2015/wordml/symex" xmlns:wpg="http://schemas.microsoft.com/office/word/2010/wordprocessingGroup" xmlns:wpi="http://schemas.microsoft.com/office/word/2010/wordprocessingInk" xmlns:wne="http://schemas.microsoft.com/office/word/2006/wordml" xmlns:wps="http://schemas.microsoft.com/office/word/2010/wordprocessingShape" mc:Ignorable="w14 w15 w16se w16cid w16 w16cex w16sdtdh w16sdtfl w16du wp14">
   <w:p>
     <w:pPr>
       <w:pStyle w:val="Footer"/>
@@ -2383,7 +5649,7 @@
 </file>
 
 <file path=word/footer2.xml><?xml version="1.0" encoding="utf-8"?>
-<w:ftr xmlns:wpc="http://schemas.microsoft.com/office/word/2010/wordprocessingCanvas" xmlns:cx="http://schemas.microsoft.com/office/drawing/2014/chartex" xmlns:cx1="http://schemas.microsoft.com/office/drawing/2015/9/8/chartex" xmlns:cx2="http://schemas.microsoft.com/office/drawing/2015/10/21/chartex" xmlns:cx3="http://schemas.microsoft.com/office/drawing/2016/5/9/chartex" xmlns:cx4="http://schemas.microsoft.com/office/drawing/2016/5/10/chartex" xmlns:cx5="http://schemas.microsoft.com/office/drawing/2016/5/11/chartex" xmlns:cx6="http://schemas.microsoft.com/office/drawing/2016/5/12/chartex" xmlns:cx7="http://schemas.microsoft.com/office/drawing/2016/5/13/chartex" xmlns:cx8="http://schemas.microsoft.com/office/drawing/2016/5/14/chartex" xmlns:mc="http://schemas.openxmlformats.org/markup-compatibility/2006" xmlns:aink="http://schemas.microsoft.com/office/drawing/2016/ink" xmlns:am3d="http://schemas.microsoft.com/office/drawing/2017/model3d" xmlns:o="urn:schemas-microsoft-com:office:office" xmlns:oel="http://schemas.microsoft.com/office/2019/extlst" xmlns:r="http://schemas.openxmlformats.org/officeDocument/2006/relationships" xmlns:m="http://schemas.openxmlformats.org/officeDocument/2006/math" xmlns:v="urn:schemas-microsoft-com:vml" xmlns:wp14="http://schemas.microsoft.com/office/word/2010/wordprocessingDrawing" xmlns:wp="http://schemas.openxmlformats.org/drawingml/2006/wordprocessingDrawing" xmlns:w10="urn:schemas-microsoft-com:office:word" xmlns:w="http://schemas.openxmlformats.org/wordprocessingml/2006/main" xmlns:w14="http://schemas.microsoft.com/office/word/2010/wordml" xmlns:w15="http://schemas.microsoft.com/office/word/2012/wordml" xmlns:w16cex="http://schemas.microsoft.com/office/word/2018/wordml/cex" xmlns:w16cid="http://schemas.microsoft.com/office/word/2016/wordml/cid" xmlns:w16="http://schemas.microsoft.com/office/word/2018/wordml" xmlns:w16du="http://schemas.microsoft.com/office/word/2023/wordml/word16du" xmlns:w16sdtdh="http://schemas.microsoft.com/office/word/2020/wordml/sdtdatahash" xmlns:w16sdtfl="http://schemas.microsoft.com/office/word/2024/wordml/sdtformatlock" xmlns:w16se="http://schemas.microsoft.com/office/word/2015/wordml/symex" xmlns:wpg="http://schemas.microsoft.com/office/word/2010/wordprocessingGroup" xmlns:wpi="http://schemas.microsoft.com/office/word/2010/wordprocessingInk" xmlns:wne="http://schemas.microsoft.com/office/word/2006/wordml" xmlns:wps="http://schemas.microsoft.com/office/word/2010/wordprocessingShape" mc:Ignorable="w14 w15 w16se w16cid w16 w16cex w16sdtdh w16sdtfl w16du wp14">
+<w:ftr xmlns:wpc="http://schemas.microsoft.com/office/word/2010/wordprocessingCanvas" xmlns:cx="http://schemas.microsoft.com/office/drawing/2014/chartex" xmlns:cx1="http://schemas.microsoft.com/office/drawing/2015/9/8/chartex" xmlns:cx2="http://schemas.microsoft.com/office/drawing/2015/10/21/chartex" xmlns:cx3="http://schemas.microsoft.com/office/drawing/2016/5/9/chartex" xmlns:cx4="http://schemas.microsoft.com/office/drawing/2016/5/10/chartex" xmlns:cx5="http://schemas.microsoft.com/office/drawing/2016/5/11/chartex" xmlns:cx6="http://schemas.microsoft.com/office/drawing/2016/5/12/chartex" xmlns:cx7="http://schemas.microsoft.com/office/drawing/2016/5/13/chartex" xmlns:cx8="http://schemas.microsoft.com/office/drawing/2016/5/14/chartex" xmlns:mc="http://schemas.openxmlformats.org/markup-compatibility/2006" xmlns:aink="http://schemas.microsoft.com/office/drawing/2016/ink" xmlns:am3d="http://schemas.microsoft.com/office/drawing/2017/model3d" xmlns:o="urn:schemas-microsoft-com:office:office" xmlns:oel="http://schemas.microsoft.com/office/2019/extlst" xmlns:r="http://schemas.openxmlformats.org/officeDocument/2006/relationships" xmlns:m="http://schemas.openxmlformats.org/officeDocument/2006/math" xmlns:v="urn:schemas-microsoft-com:vml" xmlns:wp14="http://schemas.microsoft.com/office/word/2010/wordprocessingDrawing" xmlns:wp="http://schemas.openxmlformats.org/drawingml/2006/wordprocessingDrawing" xmlns:w10="urn:schemas-microsoft-com:office:word" xmlns:w="http://schemas.openxmlformats.org/wordprocessingml/2006/main" xmlns:w14="http://schemas.microsoft.com/office/word/2010/wordml" xmlns:w15="http://schemas.microsoft.com/office/word/2012/wordml" xmlns:w16cei="http://schemas.microsoft.com/office/word/2026/wordml/cei" xmlns:w16cex="http://schemas.microsoft.com/office/word/2018/wordml/cex" xmlns:w16cid="http://schemas.microsoft.com/office/word/2016/wordml/cid" xmlns:w16="http://schemas.microsoft.com/office/word/2018/wordml" xmlns:w16du="http://schemas.microsoft.com/office/word/2023/wordml/word16du" xmlns:w16sdtdh="http://schemas.microsoft.com/office/word/2020/wordml/sdtdatahash" xmlns:w16sdtfl="http://schemas.microsoft.com/office/word/2024/wordml/sdtformatlock" xmlns:w16se="http://schemas.microsoft.com/office/word/2015/wordml/symex" xmlns:wpg="http://schemas.microsoft.com/office/word/2010/wordprocessingGroup" xmlns:wpi="http://schemas.microsoft.com/office/word/2010/wordprocessingInk" xmlns:wne="http://schemas.microsoft.com/office/word/2006/wordml" xmlns:wps="http://schemas.microsoft.com/office/word/2010/wordprocessingShape" mc:Ignorable="w14 w15 w16se w16cid w16 w16cex w16sdtdh w16sdtfl w16du wp14">
   <w:p>
     <w:pPr>
       <w:pStyle w:val="Footer"/>
@@ -2394,7 +5660,7 @@
 </file>
 
 <file path=word/footnotes.xml><?xml version="1.0" encoding="utf-8"?>
-<w:footnotes xmlns:wpc="http://schemas.microsoft.com/office/word/2010/wordprocessingCanvas" xmlns:cx="http://schemas.microsoft.com/office/drawing/2014/chartex" xmlns:cx1="http://schemas.microsoft.com/office/drawing/2015/9/8/chartex" xmlns:cx2="http://schemas.microsoft.com/office/drawing/2015/10/21/chartex" xmlns:cx3="http://schemas.microsoft.com/office/drawing/2016/5/9/chartex" xmlns:cx4="http://schemas.microsoft.com/office/drawing/2016/5/10/chartex" xmlns:cx5="http://schemas.microsoft.com/office/drawing/2016/5/11/chartex" xmlns:cx6="http://schemas.microsoft.com/office/drawing/2016/5/12/chartex" xmlns:cx7="http://schemas.microsoft.com/office/drawing/2016/5/13/chartex" xmlns:cx8="http://schemas.microsoft.com/office/drawing/2016/5/14/chartex" xmlns:mc="http://schemas.openxmlformats.org/markup-compatibility/2006" xmlns:aink="http://schemas.microsoft.com/office/drawing/2016/ink" xmlns:am3d="http://schemas.microsoft.com/office/drawing/2017/model3d" xmlns:o="urn:schemas-microsoft-com:office:office" xmlns:oel="http://schemas.microsoft.com/office/2019/extlst" xmlns:r="http://schemas.openxmlformats.org/officeDocument/2006/relationships" xmlns:m="http://schemas.openxmlformats.org/officeDocument/2006/math" xmlns:v="urn:schemas-microsoft-com:vml" xmlns:wp14="http://schemas.microsoft.com/office/word/2010/wordprocessingDrawing" xmlns:wp="http://schemas.openxmlformats.org/drawingml/2006/wordprocessingDrawing" xmlns:w10="urn:schemas-microsoft-com:office:word" xmlns:w="http://schemas.openxmlformats.org/wordprocessingml/2006/main" xmlns:w14="http://schemas.microsoft.com/office/word/2010/wordml" xmlns:w15="http://schemas.microsoft.com/office/word/2012/wordml" xmlns:w16cex="http://schemas.microsoft.com/office/word/2018/wordml/cex" xmlns:w16cid="http://schemas.microsoft.com/office/word/2016/wordml/cid" xmlns:w16="http://schemas.microsoft.com/office/word/2018/wordml" xmlns:w16du="http://schemas.microsoft.com/office/word/2023/wordml/word16du" xmlns:w16sdtdh="http://schemas.microsoft.com/office/word/2020/wordml/sdtdatahash" xmlns:w16sdtfl="http://schemas.microsoft.com/office/word/2024/wordml/sdtformatlock" xmlns:w16se="http://schemas.microsoft.com/office/word/2015/wordml/symex" xmlns:wpg="http://schemas.microsoft.com/office/word/2010/wordprocessingGroup" xmlns:wpi="http://schemas.microsoft.com/office/word/2010/wordprocessingInk" xmlns:wne="http://schemas.microsoft.com/office/word/2006/wordml" xmlns:wps="http://schemas.microsoft.com/office/word/2010/wordprocessingShape" mc:Ignorable="w14 w15 w16se w16cid w16 w16cex w16sdtdh w16sdtfl w16du wp14">
+<w:footnotes xmlns:wpc="http://schemas.microsoft.com/office/word/2010/wordprocessingCanvas" xmlns:cx="http://schemas.microsoft.com/office/drawing/2014/chartex" xmlns:cx1="http://schemas.microsoft.com/office/drawing/2015/9/8/chartex" xmlns:cx2="http://schemas.microsoft.com/office/drawing/2015/10/21/chartex" xmlns:cx3="http://schemas.microsoft.com/office/drawing/2016/5/9/chartex" xmlns:cx4="http://schemas.microsoft.com/office/drawing/2016/5/10/chartex" xmlns:cx5="http://schemas.microsoft.com/office/drawing/2016/5/11/chartex" xmlns:cx6="http://schemas.microsoft.com/office/drawing/2016/5/12/chartex" xmlns:cx7="http://schemas.microsoft.com/office/drawing/2016/5/13/chartex" xmlns:cx8="http://schemas.microsoft.com/office/drawing/2016/5/14/chartex" xmlns:mc="http://schemas.openxmlformats.org/markup-compatibility/2006" xmlns:aink="http://schemas.microsoft.com/office/drawing/2016/ink" xmlns:am3d="http://schemas.microsoft.com/office/drawing/2017/model3d" xmlns:o="urn:schemas-microsoft-com:office:office" xmlns:oel="http://schemas.microsoft.com/office/2019/extlst" xmlns:r="http://schemas.openxmlformats.org/officeDocument/2006/relationships" xmlns:m="http://schemas.openxmlformats.org/officeDocument/2006/math" xmlns:v="urn:schemas-microsoft-com:vml" xmlns:wp14="http://schemas.microsoft.com/office/word/2010/wordprocessingDrawing" xmlns:wp="http://schemas.openxmlformats.org/drawingml/2006/wordprocessingDrawing" xmlns:w10="urn:schemas-microsoft-com:office:word" xmlns:w="http://schemas.openxmlformats.org/wordprocessingml/2006/main" xmlns:w14="http://schemas.microsoft.com/office/word/2010/wordml" xmlns:w15="http://schemas.microsoft.com/office/word/2012/wordml" xmlns:w16cei="http://schemas.microsoft.com/office/word/2026/wordml/cei" xmlns:w16cex="http://schemas.microsoft.com/office/word/2018/wordml/cex" xmlns:w16cid="http://schemas.microsoft.com/office/word/2016/wordml/cid" xmlns:w16="http://schemas.microsoft.com/office/word/2018/wordml" xmlns:w16du="http://schemas.microsoft.com/office/word/2023/wordml/word16du" xmlns:w16sdtdh="http://schemas.microsoft.com/office/word/2020/wordml/sdtdatahash" xmlns:w16sdtfl="http://schemas.microsoft.com/office/word/2024/wordml/sdtformatlock" xmlns:w16se="http://schemas.microsoft.com/office/word/2015/wordml/symex" xmlns:wpg="http://schemas.microsoft.com/office/word/2010/wordprocessingGroup" xmlns:wpi="http://schemas.microsoft.com/office/word/2010/wordprocessingInk" xmlns:wne="http://schemas.microsoft.com/office/word/2006/wordml" xmlns:wps="http://schemas.microsoft.com/office/word/2010/wordprocessingShape" mc:Ignorable="w14 w15 w16se w16cid w16 w16cex w16sdtdh w16sdtfl w16du wp14">
   <w:footnote w:type="separator" w:id="-1">
     <w:p>
       <w:r>
@@ -2413,7 +5679,7 @@
 </file>
 
 <file path=word/header1.xml><?xml version="1.0" encoding="utf-8"?>
-<w:hdr xmlns:wpc="http://schemas.microsoft.com/office/word/2010/wordprocessingCanvas" xmlns:cx="http://schemas.microsoft.com/office/drawing/2014/chartex" xmlns:cx1="http://schemas.microsoft.com/office/drawing/2015/9/8/chartex" xmlns:cx2="http://schemas.microsoft.com/office/drawing/2015/10/21/chartex" xmlns:cx3="http://schemas.microsoft.com/office/drawing/2016/5/9/chartex" xmlns:cx4="http://schemas.microsoft.com/office/drawing/2016/5/10/chartex" xmlns:cx5="http://schemas.microsoft.com/office/drawing/2016/5/11/chartex" xmlns:cx6="http://schemas.microsoft.com/office/drawing/2016/5/12/chartex" xmlns:cx7="http://schemas.microsoft.com/office/drawing/2016/5/13/chartex" xmlns:cx8="http://schemas.microsoft.com/office/drawing/2016/5/14/chartex" xmlns:mc="http://schemas.openxmlformats.org/markup-compatibility/2006" xmlns:aink="http://schemas.microsoft.com/office/drawing/2016/ink" xmlns:am3d="http://schemas.microsoft.com/office/drawing/2017/model3d" xmlns:o="urn:schemas-microsoft-com:office:office" xmlns:oel="http://schemas.microsoft.com/office/2019/extlst" xmlns:r="http://schemas.openxmlformats.org/officeDocument/2006/relationships" xmlns:m="http://schemas.openxmlformats.org/officeDocument/2006/math" xmlns:v="urn:schemas-microsoft-com:vml" xmlns:wp14="http://schemas.microsoft.com/office/word/2010/wordprocessingDrawing" xmlns:wp="http://schemas.openxmlformats.org/drawingml/2006/wordprocessingDrawing" xmlns:w10="urn:schemas-microsoft-com:office:word" xmlns:w="http://schemas.openxmlformats.org/wordprocessingml/2006/main" xmlns:w14="http://schemas.microsoft.com/office/word/2010/wordml" xmlns:w15="http://schemas.microsoft.com/office/word/2012/wordml" xmlns:w16cex="http://schemas.microsoft.com/office/word/2018/wordml/cex" xmlns:w16cid="http://schemas.microsoft.com/office/word/2016/wordml/cid" xmlns:w16="http://schemas.microsoft.com/office/word/2018/wordml" xmlns:w16du="http://schemas.microsoft.com/office/word/2023/wordml/word16du" xmlns:w16sdtdh="http://schemas.microsoft.com/office/word/2020/wordml/sdtdatahash" xmlns:w16sdtfl="http://schemas.microsoft.com/office/word/2024/wordml/sdtformatlock" xmlns:w16se="http://schemas.microsoft.com/office/word/2015/wordml/symex" xmlns:wpg="http://schemas.microsoft.com/office/word/2010/wordprocessingGroup" xmlns:wpi="http://schemas.microsoft.com/office/word/2010/wordprocessingInk" xmlns:wne="http://schemas.microsoft.com/office/word/2006/wordml" xmlns:wps="http://schemas.microsoft.com/office/word/2010/wordprocessingShape" mc:Ignorable="w14 w15 w16se w16cid w16 w16cex w16sdtdh w16sdtfl w16du wp14">
+<w:hdr xmlns:wpc="http://schemas.microsoft.com/office/word/2010/wordprocessingCanvas" xmlns:cx="http://schemas.microsoft.com/office/drawing/2014/chartex" xmlns:cx1="http://schemas.microsoft.com/office/drawing/2015/9/8/chartex" xmlns:cx2="http://schemas.microsoft.com/office/drawing/2015/10/21/chartex" xmlns:cx3="http://schemas.microsoft.com/office/drawing/2016/5/9/chartex" xmlns:cx4="http://schemas.microsoft.com/office/drawing/2016/5/10/chartex" xmlns:cx5="http://schemas.microsoft.com/office/drawing/2016/5/11/chartex" xmlns:cx6="http://schemas.microsoft.com/office/drawing/2016/5/12/chartex" xmlns:cx7="http://schemas.microsoft.com/office/drawing/2016/5/13/chartex" xmlns:cx8="http://schemas.microsoft.com/office/drawing/2016/5/14/chartex" xmlns:mc="http://schemas.openxmlformats.org/markup-compatibility/2006" xmlns:aink="http://schemas.microsoft.com/office/drawing/2016/ink" xmlns:am3d="http://schemas.microsoft.com/office/drawing/2017/model3d" xmlns:o="urn:schemas-microsoft-com:office:office" xmlns:oel="http://schemas.microsoft.com/office/2019/extlst" xmlns:r="http://schemas.openxmlformats.org/officeDocument/2006/relationships" xmlns:m="http://schemas.openxmlformats.org/officeDocument/2006/math" xmlns:v="urn:schemas-microsoft-com:vml" xmlns:wp14="http://schemas.microsoft.com/office/word/2010/wordprocessingDrawing" xmlns:wp="http://schemas.openxmlformats.org/drawingml/2006/wordprocessingDrawing" xmlns:w10="urn:schemas-microsoft-com:office:word" xmlns:w="http://schemas.openxmlformats.org/wordprocessingml/2006/main" xmlns:w14="http://schemas.microsoft.com/office/word/2010/wordml" xmlns:w15="http://schemas.microsoft.com/office/word/2012/wordml" xmlns:w16cei="http://schemas.microsoft.com/office/word/2026/wordml/cei" xmlns:w16cex="http://schemas.microsoft.com/office/word/2018/wordml/cex" xmlns:w16cid="http://schemas.microsoft.com/office/word/2016/wordml/cid" xmlns:w16="http://schemas.microsoft.com/office/word/2018/wordml" xmlns:w16du="http://schemas.microsoft.com/office/word/2023/wordml/word16du" xmlns:w16sdtdh="http://schemas.microsoft.com/office/word/2020/wordml/sdtdatahash" xmlns:w16sdtfl="http://schemas.microsoft.com/office/word/2024/wordml/sdtformatlock" xmlns:w16se="http://schemas.microsoft.com/office/word/2015/wordml/symex" xmlns:wpg="http://schemas.microsoft.com/office/word/2010/wordprocessingGroup" xmlns:wpi="http://schemas.microsoft.com/office/word/2010/wordprocessingInk" xmlns:wne="http://schemas.microsoft.com/office/word/2006/wordml" xmlns:wps="http://schemas.microsoft.com/office/word/2010/wordprocessingShape" mc:Ignorable="w14 w15 w16se w16cid w16 w16cex w16sdtdh w16sdtfl w16du wp14">
   <w:p>
     <w:pPr>
       <w:pStyle w:val="Header"/>
@@ -2445,7 +5711,7 @@
 </file>
 
 <file path=word/numbering.xml><?xml version="1.0" encoding="utf-8"?>
-<w:numbering xmlns:wpc="http://schemas.microsoft.com/office/word/2010/wordprocessingCanvas" xmlns:cx="http://schemas.microsoft.com/office/drawing/2014/chartex" xmlns:cx1="http://schemas.microsoft.com/office/drawing/2015/9/8/chartex" xmlns:cx2="http://schemas.microsoft.com/office/drawing/2015/10/21/chartex" xmlns:cx3="http://schemas.microsoft.com/office/drawing/2016/5/9/chartex" xmlns:cx4="http://schemas.microsoft.com/office/drawing/2016/5/10/chartex" xmlns:cx5="http://schemas.microsoft.com/office/drawing/2016/5/11/chartex" xmlns:cx6="http://schemas.microsoft.com/office/drawing/2016/5/12/chartex" xmlns:cx7="http://schemas.microsoft.com/office/drawing/2016/5/13/chartex" xmlns:cx8="http://schemas.microsoft.com/office/drawing/2016/5/14/chartex" xmlns:mc="http://schemas.openxmlformats.org/markup-compatibility/2006" xmlns:aink="http://schemas.microsoft.com/office/drawing/2016/ink" xmlns:am3d="http://schemas.microsoft.com/office/drawing/2017/model3d" xmlns:o="urn:schemas-microsoft-com:office:office" xmlns:oel="http://schemas.microsoft.com/office/2019/extlst" xmlns:r="http://schemas.openxmlformats.org/officeDocument/2006/relationships" xmlns:m="http://schemas.openxmlformats.org/officeDocument/2006/math" xmlns:v="urn:schemas-microsoft-com:vml" xmlns:wp14="http://schemas.microsoft.com/office/word/2010/wordprocessingDrawing" xmlns:wp="http://schemas.openxmlformats.org/drawingml/2006/wordprocessingDrawing" xmlns:w10="urn:schemas-microsoft-com:office:word" xmlns:w="http://schemas.openxmlformats.org/wordprocessingml/2006/main" xmlns:w14="http://schemas.microsoft.com/office/word/2010/wordml" xmlns:w15="http://schemas.microsoft.com/office/word/2012/wordml" xmlns:w16cex="http://schemas.microsoft.com/office/word/2018/wordml/cex" xmlns:w16cid="http://schemas.microsoft.com/office/word/2016/wordml/cid" xmlns:w16="http://schemas.microsoft.com/office/word/2018/wordml" xmlns:w16du="http://schemas.microsoft.com/office/word/2023/wordml/word16du" xmlns:w16sdtdh="http://schemas.microsoft.com/office/word/2020/wordml/sdtdatahash" xmlns:w16sdtfl="http://schemas.microsoft.com/office/word/2024/wordml/sdtformatlock" xmlns:w16se="http://schemas.microsoft.com/office/word/2015/wordml/symex" xmlns:wpg="http://schemas.microsoft.com/office/word/2010/wordprocessingGroup" xmlns:wpi="http://schemas.microsoft.com/office/word/2010/wordprocessingInk" xmlns:wne="http://schemas.microsoft.com/office/word/2006/wordml" xmlns:wps="http://schemas.microsoft.com/office/word/2010/wordprocessingShape" mc:Ignorable="w14 w15 w16se w16cid w16 w16cex w16sdtdh w16sdtfl w16du wp14">
+<w:numbering xmlns:wpc="http://schemas.microsoft.com/office/word/2010/wordprocessingCanvas" xmlns:cx="http://schemas.microsoft.com/office/drawing/2014/chartex" xmlns:cx1="http://schemas.microsoft.com/office/drawing/2015/9/8/chartex" xmlns:cx2="http://schemas.microsoft.com/office/drawing/2015/10/21/chartex" xmlns:cx3="http://schemas.microsoft.com/office/drawing/2016/5/9/chartex" xmlns:cx4="http://schemas.microsoft.com/office/drawing/2016/5/10/chartex" xmlns:cx5="http://schemas.microsoft.com/office/drawing/2016/5/11/chartex" xmlns:cx6="http://schemas.microsoft.com/office/drawing/2016/5/12/chartex" xmlns:cx7="http://schemas.microsoft.com/office/drawing/2016/5/13/chartex" xmlns:cx8="http://schemas.microsoft.com/office/drawing/2016/5/14/chartex" xmlns:mc="http://schemas.openxmlformats.org/markup-compatibility/2006" xmlns:aink="http://schemas.microsoft.com/office/drawing/2016/ink" xmlns:am3d="http://schemas.microsoft.com/office/drawing/2017/model3d" xmlns:o="urn:schemas-microsoft-com:office:office" xmlns:oel="http://schemas.microsoft.com/office/2019/extlst" xmlns:r="http://schemas.openxmlformats.org/officeDocument/2006/relationships" xmlns:m="http://schemas.openxmlformats.org/officeDocument/2006/math" xmlns:v="urn:schemas-microsoft-com:vml" xmlns:wp14="http://schemas.microsoft.com/office/word/2010/wordprocessingDrawing" xmlns:wp="http://schemas.openxmlformats.org/drawingml/2006/wordprocessingDrawing" xmlns:w10="urn:schemas-microsoft-com:office:word" xmlns:w="http://schemas.openxmlformats.org/wordprocessingml/2006/main" xmlns:w14="http://schemas.microsoft.com/office/word/2010/wordml" xmlns:w15="http://schemas.microsoft.com/office/word/2012/wordml" xmlns:w16cei="http://schemas.microsoft.com/office/word/2026/wordml/cei" xmlns:w16cex="http://schemas.microsoft.com/office/word/2018/wordml/cex" xmlns:w16cid="http://schemas.microsoft.com/office/word/2016/wordml/cid" xmlns:w16="http://schemas.microsoft.com/office/word/2018/wordml" xmlns:w16du="http://schemas.microsoft.com/office/word/2023/wordml/word16du" xmlns:w16sdtdh="http://schemas.microsoft.com/office/word/2020/wordml/sdtdatahash" xmlns:w16sdtfl="http://schemas.microsoft.com/office/word/2024/wordml/sdtformatlock" xmlns:w16se="http://schemas.microsoft.com/office/word/2015/wordml/symex" xmlns:wpg="http://schemas.microsoft.com/office/word/2010/wordprocessingGroup" xmlns:wpi="http://schemas.microsoft.com/office/word/2010/wordprocessingInk" xmlns:wne="http://schemas.microsoft.com/office/word/2006/wordml" xmlns:wps="http://schemas.microsoft.com/office/word/2010/wordprocessingShape" mc:Ignorable="w14 w15 w16se w16cid w16 w16cex w16sdtdh w16sdtfl w16du wp14">
   <w:abstractNum w:abstractNumId="0" w15:restartNumberingAfterBreak="0">
     <w:nsid w:val="27F0573B"/>
     <w:multiLevelType w:val="singleLevel"/>

</xml_diff>

<commit_message>
fix: Robust signer name replacement in all templates
</commit_message>
<xml_diff>
--- a/webapp/templates/TOTRINH/01_Mau_Bao_cao.docx
+++ b/webapp/templates/TOTRINH/01_Mau_Bao_cao.docx
@@ -1364,47 +1364,8 @@
                 <w:rFonts w:ascii="Times New Roman" w:hAnsi="Times New Roman"/>
               </w:rPr>
             </w:pPr>
-            <w:proofErr w:type="spellStart"/>
-            <w:r>
-              <w:rPr>
-                <w:rFonts w:ascii="Times New Roman" w:hAnsi="Times New Roman"/>
-              </w:rPr>
-              <w:t>Họ</w:t>
-            </w:r>
-            <w:proofErr w:type="spellEnd"/>
-            <w:r>
-              <w:rPr>
-                <w:rFonts w:ascii="Times New Roman" w:hAnsi="Times New Roman"/>
-              </w:rPr>
-              <w:t xml:space="preserve"> </w:t>
-            </w:r>
-            <w:proofErr w:type="spellStart"/>
-            <w:r>
-              <w:rPr>
-                <w:rFonts w:ascii="Times New Roman" w:hAnsi="Times New Roman"/>
-              </w:rPr>
-              <w:t>và</w:t>
-            </w:r>
-            <w:proofErr w:type="spellEnd"/>
-            <w:r>
-              <w:rPr>
-                <w:rFonts w:ascii="Times New Roman" w:hAnsi="Times New Roman"/>
-              </w:rPr>
-              <w:t xml:space="preserve"> </w:t>
-            </w:r>
-            <w:proofErr w:type="spellStart"/>
-            <w:r>
-              <w:rPr>
-                <w:rFonts w:ascii="Times New Roman" w:hAnsi="Times New Roman"/>
-              </w:rPr>
-              <w:t>tên</w:t>
-            </w:r>
-            <w:proofErr w:type="spellEnd"/>
-            <w:r>
-              <w:rPr>
-                <w:rFonts w:ascii="Times New Roman" w:hAnsi="Times New Roman"/>
-              </w:rPr>
-              <w:t xml:space="preserve"> </w:t>
+            <w:r>
+              <w:t>(SIGNER)</w:t>
             </w:r>
           </w:p>
         </w:tc>

</xml_diff>

<commit_message>
fix: Replace title with TITLE tag in all templates to avoid MS Word XML splitting issues
</commit_message>
<xml_diff>
--- a/webapp/templates/TOTRINH/01_Mau_Bao_cao.docx
+++ b/webapp/templates/TOTRINH/01_Mau_Bao_cao.docx
@@ -616,66 +616,8 @@
           <w:rFonts w:ascii="Times New Roman" w:hAnsi="Times New Roman"/>
         </w:rPr>
       </w:pPr>
-      <w:proofErr w:type="spellStart"/>
       <w:r>
-        <w:rPr>
-          <w:rFonts w:ascii="Times New Roman" w:hAnsi="Times New Roman"/>
-        </w:rPr>
-        <w:t>V</w:t>
-      </w:r>
-      <w:r>
-        <w:rPr>
-          <w:rFonts w:ascii="Times New Roman" w:hAnsi="Times New Roman"/>
-        </w:rPr>
-        <w:t>ề</w:t>
-      </w:r>
-      <w:proofErr w:type="spellEnd"/>
-      <w:r>
-        <w:rPr>
-          <w:rFonts w:ascii="Times New Roman" w:hAnsi="Times New Roman"/>
-        </w:rPr>
-        <w:t xml:space="preserve"> </w:t>
-      </w:r>
-      <w:proofErr w:type="spellStart"/>
-      <w:r>
-        <w:rPr>
-          <w:rFonts w:ascii="Times New Roman" w:hAnsi="Times New Roman"/>
-        </w:rPr>
-        <w:t>việc</w:t>
-      </w:r>
-      <w:proofErr w:type="spellEnd"/>
-      <w:r>
-        <w:rPr>
-          <w:rFonts w:ascii="Times New Roman" w:hAnsi="Times New Roman"/>
-        </w:rPr>
-        <w:t xml:space="preserve">............................... </w:t>
-      </w:r>
-      <w:r>
-        <w:rPr>
-          <w:rFonts w:ascii="Times New Roman" w:hAnsi="Times New Roman"/>
-          <w:sz w:val="24"/>
-        </w:rPr>
-        <w:t>(</w:t>
-      </w:r>
-      <w:r>
-        <w:rPr>
-          <w:rFonts w:ascii="Times New Roman" w:hAnsi="Times New Roman"/>
-          <w:sz w:val="24"/>
-        </w:rPr>
-        <w:t>3</w:t>
-      </w:r>
-      <w:r>
-        <w:rPr>
-          <w:rFonts w:ascii="Times New Roman" w:hAnsi="Times New Roman"/>
-          <w:sz w:val="24"/>
-        </w:rPr>
-        <w:t xml:space="preserve">) </w:t>
-      </w:r>
-      <w:r>
-        <w:rPr>
-          <w:rFonts w:ascii="Times New Roman" w:hAnsi="Times New Roman"/>
-        </w:rPr>
-        <w:t>.............................</w:t>
+        <w:t>Về việc (TITLE)</w:t>
       </w:r>
     </w:p>
     <w:p>
@@ -3144,198 +3086,7 @@
               </w:rPr>
             </w:pPr>
             <w:r>
-              <w:rPr>
-                <w:sz w:val="22"/>
-                <w:szCs w:val="22"/>
-              </w:rPr>
-              <w:t>(</w:t>
-            </w:r>
-            <w:r>
-              <w:rPr>
-                <w:sz w:val="22"/>
-                <w:szCs w:val="22"/>
-              </w:rPr>
-              <w:t>3</w:t>
-            </w:r>
-            <w:r>
-              <w:rPr>
-                <w:sz w:val="22"/>
-                <w:szCs w:val="22"/>
-              </w:rPr>
-              <w:t xml:space="preserve">) </w:t>
-            </w:r>
-            <w:proofErr w:type="spellStart"/>
-            <w:r>
-              <w:rPr>
-                <w:sz w:val="22"/>
-                <w:szCs w:val="22"/>
-              </w:rPr>
-              <w:t>Trích</w:t>
-            </w:r>
-            <w:proofErr w:type="spellEnd"/>
-            <w:r>
-              <w:rPr>
-                <w:sz w:val="22"/>
-                <w:szCs w:val="22"/>
-              </w:rPr>
-              <w:t xml:space="preserve"> </w:t>
-            </w:r>
-            <w:proofErr w:type="spellStart"/>
-            <w:r>
-              <w:rPr>
-                <w:sz w:val="22"/>
-                <w:szCs w:val="22"/>
-              </w:rPr>
-              <w:t>yếu</w:t>
-            </w:r>
-            <w:proofErr w:type="spellEnd"/>
-            <w:r>
-              <w:rPr>
-                <w:sz w:val="22"/>
-                <w:szCs w:val="22"/>
-              </w:rPr>
-              <w:t xml:space="preserve"> </w:t>
-            </w:r>
-            <w:proofErr w:type="spellStart"/>
-            <w:r>
-              <w:rPr>
-                <w:sz w:val="22"/>
-                <w:szCs w:val="22"/>
-              </w:rPr>
-              <w:t>nội</w:t>
-            </w:r>
-            <w:proofErr w:type="spellEnd"/>
-            <w:r>
-              <w:rPr>
-                <w:sz w:val="22"/>
-                <w:szCs w:val="22"/>
-              </w:rPr>
-              <w:t xml:space="preserve"> dung </w:t>
-            </w:r>
-            <w:proofErr w:type="spellStart"/>
-            <w:r>
-              <w:rPr>
-                <w:sz w:val="22"/>
-                <w:szCs w:val="22"/>
-              </w:rPr>
-              <w:t>v</w:t>
-            </w:r>
-            <w:r>
-              <w:rPr>
-                <w:rFonts w:hint="eastAsia"/>
-                <w:sz w:val="22"/>
-                <w:szCs w:val="22"/>
-              </w:rPr>
-              <w:t>ă</w:t>
-            </w:r>
-            <w:r>
-              <w:rPr>
-                <w:sz w:val="22"/>
-                <w:szCs w:val="22"/>
-              </w:rPr>
-              <w:t>n</w:t>
-            </w:r>
-            <w:proofErr w:type="spellEnd"/>
-            <w:r>
-              <w:rPr>
-                <w:sz w:val="22"/>
-                <w:szCs w:val="22"/>
-              </w:rPr>
-              <w:t xml:space="preserve"> </w:t>
-            </w:r>
-            <w:proofErr w:type="spellStart"/>
-            <w:r>
-              <w:rPr>
-                <w:sz w:val="22"/>
-                <w:szCs w:val="22"/>
-              </w:rPr>
-              <w:t>bản</w:t>
-            </w:r>
-            <w:proofErr w:type="spellEnd"/>
-            <w:r>
-              <w:rPr>
-                <w:sz w:val="22"/>
-                <w:szCs w:val="22"/>
-              </w:rPr>
-              <w:t xml:space="preserve"> (</w:t>
-            </w:r>
-            <w:proofErr w:type="spellStart"/>
-            <w:r>
-              <w:rPr>
-                <w:sz w:val="22"/>
-                <w:szCs w:val="22"/>
-              </w:rPr>
-              <w:t>chữ</w:t>
-            </w:r>
-            <w:proofErr w:type="spellEnd"/>
-            <w:r>
-              <w:rPr>
-                <w:sz w:val="22"/>
-                <w:szCs w:val="22"/>
-              </w:rPr>
-              <w:t xml:space="preserve"> </w:t>
-            </w:r>
-            <w:proofErr w:type="spellStart"/>
-            <w:r>
-              <w:rPr>
-                <w:sz w:val="22"/>
-                <w:szCs w:val="22"/>
-              </w:rPr>
-              <w:t>thường</w:t>
-            </w:r>
-            <w:proofErr w:type="spellEnd"/>
-            <w:r>
-              <w:rPr>
-                <w:sz w:val="22"/>
-                <w:szCs w:val="22"/>
-              </w:rPr>
-              <w:t xml:space="preserve">, </w:t>
-            </w:r>
-            <w:proofErr w:type="spellStart"/>
-            <w:r>
-              <w:rPr>
-                <w:sz w:val="22"/>
-                <w:szCs w:val="22"/>
-              </w:rPr>
-              <w:t>đứng</w:t>
-            </w:r>
-            <w:proofErr w:type="spellEnd"/>
-            <w:r>
-              <w:rPr>
-                <w:sz w:val="22"/>
-                <w:szCs w:val="22"/>
-              </w:rPr>
-              <w:t>,</w:t>
-            </w:r>
-            <w:r>
-              <w:rPr>
-                <w:sz w:val="22"/>
-                <w:szCs w:val="22"/>
-              </w:rPr>
-              <w:t xml:space="preserve"> </w:t>
-            </w:r>
-            <w:proofErr w:type="spellStart"/>
-            <w:r>
-              <w:rPr>
-                <w:sz w:val="22"/>
-                <w:szCs w:val="22"/>
-              </w:rPr>
-              <w:t>đậm</w:t>
-            </w:r>
-            <w:proofErr w:type="spellEnd"/>
-            <w:r>
-              <w:rPr>
-                <w:sz w:val="22"/>
-                <w:szCs w:val="22"/>
-              </w:rPr>
-              <w:t>)</w:t>
-            </w:r>
-            <w:r>
-              <w:rPr>
-                <w:sz w:val="22"/>
-                <w:szCs w:val="22"/>
-              </w:rPr>
-              <w:t>.</w:t>
+              <w:t>(TITLE)</w:t>
             </w:r>
           </w:p>
           <w:p>

</xml_diff>